<commit_message>
fix(spt): update point 5 nomor sk 1445, remove point 6, and correct pemberi perintah title to Sumber Daya Air Kota Administrasi Jakarta Utara
</commit_message>
<xml_diff>
--- a/public/assets/Surat_Perintah_Tugas_walikota.docx
+++ b/public/assets/Surat_Perintah_Tugas_walikota.docx
@@ -174,15 +174,7 @@
         <w:ind w:left="360" w:hanging="360"/>
       </w:pPr>
       <w:r>
-        <w:t>5. Keputusan Kepala Dinas Sumber Daya Air Provinsi DKI Jakarta Nomor [NOMOR] Tahun [TAHUN] tentang Pelimpahan Sebagian Kewenangan Pengguna Anggaran kepada Kuasa Pengguna Anggaran pada Dinas Sumber Daya Air Provinsi DKI Jakarta Tahun Anggaran 2026.</w:t>
-      </w:r>
-    </w:p>
-    <w:p>
-      <w:pPr>
-        <w:ind w:left="360" w:hanging="360"/>
-      </w:pPr>
-      <w:r>
-        <w:t>6. Keputusan Kepala Suku Dinas Sumber Daya Air Kota Administrasi Jakarta Utara Nomor [NOMOR SK SWAKELOLA] Tahun 2026 tentang Penetapan Penyelenggara Swakelola Tipe I [NAMA PEKERJAAN/KEGIATAN].</w:t>
+        <w:t>5. Keputusan Kepala Dinas Sumber Daya Air Provinsi DKI Jakarta Nomor 1445 Tahun 2026 tentang Pelimpahan Sebagian Kewenangan Pengguna Anggaran kepada Kuasa Pengguna Anggaran pada Dinas Sumber Daya Air Provinsi DKI Jakarta Tahun Anggaran 2026.</w:t>
       </w:r>
     </w:p>
     <w:p>
@@ -2402,7 +2394,7 @@
             </w:r>
             <w:proofErr w:type="spellEnd"/>
             <w:r>
-              <w:t xml:space="preserve"> Suku Dinas SDA Kota</w:t>
+              <w:t xml:space="preserve"> Suku Dinas Sumber Daya Air</w:t>
             </w:r>
             <w:r>
               <w:br/>
@@ -2412,7 +2404,7 @@
             </w:r>
             <w:proofErr w:type="spellStart"/>
             <w:r>
-              <w:t>Administrasi</w:t>
+              <w:t>Kota Administrasi</w:t>
             </w:r>
             <w:proofErr w:type="spellEnd"/>
             <w:r>

</xml_diff>

<commit_message>
fix(spt): rebuild signature table with native center alignment, fixed cell widths, and zero-border table to fix word-wrapping
</commit_message>
<xml_diff>
--- a/public/assets/Surat_Perintah_Tugas_walikota.docx
+++ b/public/assets/Surat_Perintah_Tugas_walikota.docx
@@ -1,2491 +1,6 @@
 
-<file path=word/document.xml><?xml version="1.0" encoding="utf-8"?>
-<w:document xmlns:wpc="http://schemas.microsoft.com/office/word/2010/wordprocessingCanvas" xmlns:cx="http://schemas.microsoft.com/office/drawing/2014/chartex" xmlns:cx1="http://schemas.microsoft.com/office/drawing/2015/9/8/chartex" xmlns:cx2="http://schemas.microsoft.com/office/drawing/2015/10/21/chartex" xmlns:cx3="http://schemas.microsoft.com/office/drawing/2016/5/9/chartex" xmlns:cx4="http://schemas.microsoft.com/office/drawing/2016/5/10/chartex" xmlns:cx5="http://schemas.microsoft.com/office/drawing/2016/5/11/chartex" xmlns:cx6="http://schemas.microsoft.com/office/drawing/2016/5/12/chartex" xmlns:cx7="http://schemas.microsoft.com/office/drawing/2016/5/13/chartex" xmlns:cx8="http://schemas.microsoft.com/office/drawing/2016/5/14/chartex" xmlns:mc="http://schemas.openxmlformats.org/markup-compatibility/2006" xmlns:aink="http://schemas.microsoft.com/office/drawing/2016/ink" xmlns:am3d="http://schemas.microsoft.com/office/drawing/2017/model3d" xmlns:o="urn:schemas-microsoft-com:office:office" xmlns:oel="http://schemas.microsoft.com/office/2019/extlst" xmlns:r="http://schemas.openxmlformats.org/officeDocument/2006/relationships" xmlns:m="http://schemas.openxmlformats.org/officeDocument/2006/math" xmlns:v="urn:schemas-microsoft-com:vml" xmlns:wp14="http://schemas.microsoft.com/office/word/2010/wordprocessingDrawing" xmlns:wp="http://schemas.openxmlformats.org/drawingml/2006/wordprocessingDrawing" xmlns:w10="urn:schemas-microsoft-com:office:word" xmlns:w="http://schemas.openxmlformats.org/wordprocessingml/2006/main" xmlns:w14="http://schemas.microsoft.com/office/word/2010/wordml" xmlns:w15="http://schemas.microsoft.com/office/word/2012/wordml" xmlns:w16cex="http://schemas.microsoft.com/office/word/2018/wordml/cex" xmlns:w16cid="http://schemas.microsoft.com/office/word/2016/wordml/cid" xmlns:w16="http://schemas.microsoft.com/office/word/2018/wordml" xmlns:w16du="http://schemas.microsoft.com/office/word/2023/wordml/word16du" xmlns:w16sdtdh="http://schemas.microsoft.com/office/word/2020/wordml/sdtdatahash" xmlns:w16sdtfl="http://schemas.microsoft.com/office/word/2024/wordml/sdtformatlock" xmlns:w16se="http://schemas.microsoft.com/office/word/2015/wordml/symex" xmlns:wpg="http://schemas.microsoft.com/office/word/2010/wordprocessingGroup" xmlns:wpi="http://schemas.microsoft.com/office/word/2010/wordprocessingInk" xmlns:wne="http://schemas.microsoft.com/office/word/2006/wordml" xmlns:wps="http://schemas.microsoft.com/office/word/2010/wordprocessingShape" mc:Ignorable="w14 w15 w16se w16cid w16 w16cex w16sdtdh w16sdtfl w16du wp14">
-  <w:body>
-    <w:p>
-      <w:pPr>
-        <w:jc w:val="center"/>
-        <w:rPr>
-          <w:b/>
-          <w:sz w:val="24"/>
-        </w:rPr>
-      </w:pPr>
-      <w:r>
-        <w:rPr>
-          <w:b/>
-          <w:noProof/>
-          <w:sz w:val="24"/>
-        </w:rPr>
-        <w:drawing>
-          <wp:anchor distT="0" distB="0" distL="114300" distR="114300" simplePos="0" relativeHeight="251658240" behindDoc="1" locked="0" layoutInCell="1" allowOverlap="1" wp14:anchorId="72F445D8" wp14:editId="15BE4D3D">
-            <wp:simplePos x="0" y="0"/>
-            <wp:positionH relativeFrom="margin">
-              <wp:posOffset>2146301</wp:posOffset>
-            </wp:positionH>
-            <wp:positionV relativeFrom="paragraph">
-              <wp:posOffset>-558800</wp:posOffset>
-            </wp:positionV>
-            <wp:extent cx="965200" cy="1276350"/>
-            <wp:effectExtent l="0" t="0" r="6350" b="0"/>
-            <wp:wrapNone/>
-            <wp:docPr id="837020129" name="Picture 1"/>
-            <wp:cNvGraphicFramePr>
-              <a:graphicFrameLocks xmlns:a="http://schemas.openxmlformats.org/drawingml/2006/main" noChangeAspect="1"/>
-            </wp:cNvGraphicFramePr>
-            <a:graphic xmlns:a="http://schemas.openxmlformats.org/drawingml/2006/main">
-              <a:graphicData uri="http://schemas.openxmlformats.org/drawingml/2006/picture">
-                <pic:pic xmlns:pic="http://schemas.openxmlformats.org/drawingml/2006/picture">
-                  <pic:nvPicPr>
-                    <pic:cNvPr id="837020129" name="Picture 837020129"/>
-                    <pic:cNvPicPr/>
-                  </pic:nvPicPr>
-                  <pic:blipFill>
-                    <a:blip r:embed="rId6"/>
-                    <a:stretch>
-                      <a:fillRect/>
-                    </a:stretch>
-                  </pic:blipFill>
-                  <pic:spPr>
-                    <a:xfrm>
-                      <a:off x="0" y="0"/>
-                      <a:ext cx="965200" cy="1276350"/>
-                    </a:xfrm>
-                    <a:prstGeom prst="rect">
-                      <a:avLst/>
-                    </a:prstGeom>
-                  </pic:spPr>
-                </pic:pic>
-              </a:graphicData>
-            </a:graphic>
-            <wp14:sizeRelH relativeFrom="margin">
-              <wp14:pctWidth>0</wp14:pctWidth>
-            </wp14:sizeRelH>
-          </wp:anchor>
-        </w:drawing>
-      </w:r>
-    </w:p>
-    <w:p>
-      <w:pPr>
-        <w:jc w:val="center"/>
-        <w:rPr>
-          <w:b/>
-          <w:sz w:val="24"/>
-        </w:rPr>
-      </w:pPr>
-    </w:p>
-    <w:p>
-      <w:pPr>
-        <w:jc w:val="center"/>
-      </w:pPr>
-      <w:r>
-        <w:rPr>
-          <w:b/>
-          <w:sz w:val="24"/>
-        </w:rPr>
-        <w:t>SUKU DINAS SUMBER DAYA AIR</w:t>
-      </w:r>
-      <w:r>
-        <w:rPr>
-          <w:b/>
-          <w:sz w:val="24"/>
-        </w:rPr>
-        <w:br/>
-        <w:t>PEMERINTAH KOTA ADMINISTRASI JAKARTA UTARA</w:t>
-      </w:r>
-      <w:r>
-        <w:rPr>
-          <w:b/>
-          <w:sz w:val="24"/>
-        </w:rPr>
-        <w:br/>
-      </w:r>
-    </w:p>
-    <w:p>
-      <w:pPr>
-        <w:jc w:val="center"/>
-      </w:pPr>
-      <w:r>
-        <w:rPr>
-          <w:b/>
-        </w:rPr>
-        <w:t>SURAT PERINTAH TUGAS</w:t>
-      </w:r>
-      <w:r>
-        <w:rPr>
-          <w:b/>
-        </w:rPr>
-        <w:br/>
-        <w:t>NOMOR: [NOMOR SPT]</w:t>
-      </w:r>
-      <w:r>
-        <w:rPr>
-          <w:b/>
-        </w:rPr>
-        <w:br/>
-        <w:t>TENTANG</w:t>
-      </w:r>
-      <w:r>
-        <w:rPr>
-          <w:b/>
-        </w:rPr>
-        <w:br/>
-        <w:t>PELAKSANAAN SWAKELOLA TIPE I [NAMA PEKERJAAN] TAHUN ANGGARAN 2026</w:t>
-      </w:r>
-    </w:p>
-    <w:p>
-      <w:r>
-        <w:t>Berdasarkan:</w:t>
-      </w:r>
-    </w:p>
-    <w:p>
-      <w:pPr>
-        <w:ind w:left="360" w:hanging="360"/>
-      </w:pPr>
-      <w:r>
-        <w:t>1. Peraturan Presiden Nomor 16 Tahun 2018 tentang Pengadaan Barang/Jasa Pemerintah sebagaimana telah beberapa kali diubah, terakhir dengan Peraturan Presiden Nomor 46 Tahun 2025 tentang Perubahan Kedua atas Peraturan Presiden Nomor 16 Tahun 2018 tentang Pengadaan Barang/Jasa Pemerintah;</w:t>
-      </w:r>
-    </w:p>
-    <w:p>
-      <w:pPr>
-        <w:ind w:left="360" w:hanging="360"/>
-      </w:pPr>
-      <w:r>
-        <w:t>2. Peraturan Lembaga Kebijakan Pengadaan Barang/Jasa Pemerintah Nomor 3 Tahun 2021 tentang Pedoman Swakelola;</w:t>
-      </w:r>
-    </w:p>
-    <w:p>
-      <w:pPr>
-        <w:ind w:left="360" w:hanging="360"/>
-      </w:pPr>
-      <w:r>
-        <w:t>3. Peraturan Daerah Provinsi DKI Jakarta Nomor 4 Tahun 2025 tentang Anggaran Pendapatan dan Belanja Daerah Tahun Anggaran 2026;</w:t>
-      </w:r>
-    </w:p>
-    <w:p>
-      <w:pPr>
-        <w:ind w:left="360" w:hanging="360"/>
-      </w:pPr>
-      <w:r>
-        <w:t>4. Dokumen Pelaksanaan Anggaran Satuan Kerja Perangkat Daerah (DPA-SKPD) Suku Dinas Sumber Daya Air Kota Administrasi Jakarta Utara Tahun Anggaran 2026 Nomor [NOMOR DPA] tanggal [TANGGAL DPA];</w:t>
-      </w:r>
-    </w:p>
-    <w:p>
-      <w:pPr>
-        <w:ind w:left="360" w:hanging="360"/>
-      </w:pPr>
-      <w:r>
-        <w:t>5. Keputusan Kepala Dinas Sumber Daya Air Provinsi DKI Jakarta Nomor 1445 Tahun 2026 tentang Pelimpahan Sebagian Kewenangan Pengguna Anggaran kepada Kuasa Pengguna Anggaran pada Dinas Sumber Daya Air Provinsi DKI Jakarta Tahun Anggaran 2026.</w:t>
-      </w:r>
-    </w:p>
-    <w:p>
-      <w:r>
-        <w:t>maka Kepala Suku Dinas Sumber Daya Air Kota Administrasi Jakarta Utara selaku Kuasa Pengguna Anggaran dengan ini:</w:t>
-      </w:r>
-    </w:p>
-    <w:p>
-      <w:pPr>
-        <w:jc w:val="center"/>
-      </w:pPr>
-      <w:r>
-        <w:rPr>
-          <w:b/>
-        </w:rPr>
-        <w:t>MEMERINTAHKAN:</w:t>
-      </w:r>
-    </w:p>
-    <w:p>
-      <w:pPr>
-        <w:tabs>
-          <w:tab w:val="left" w:pos="2160"/>
-        </w:tabs>
-      </w:pPr>
-      <w:r>
-        <w:t>Kepada</w:t>
-      </w:r>
-      <w:r>
-        <w:tab/>
-        <w:t>:</w:t>
-      </w:r>
-      <w:r>
-        <w:br/>
-        <w:t>Nama</w:t>
-      </w:r>
-      <w:r>
-        <w:tab/>
-        <w:t>: [NAMA PENERIMA PERINTAH]</w:t>
-      </w:r>
-      <w:r>
-        <w:br/>
-        <w:t>NIP/NRK</w:t>
-      </w:r>
-      <w:r>
-        <w:tab/>
-        <w:t>: [NIP/NRK]</w:t>
-      </w:r>
-    </w:p>
-    <w:p>
-      <w:pPr>
-        <w:tabs>
-          <w:tab w:val="left" w:pos="2520"/>
-        </w:tabs>
-        <w:spacing w:after="0" w:line="240" w:lineRule="auto"/>
-      </w:pPr>
-      <w:proofErr w:type="spellStart"/>
-      <w:r>
-        <w:lastRenderedPageBreak/>
-        <w:t>Jabatan</w:t>
-      </w:r>
-      <w:proofErr w:type="spellEnd"/>
-      <w:r>
-        <w:tab/>
-        <w:t xml:space="preserve">: [KEPALA SATUAN PELAKSANA KECAMATAN ... / KEPALA </w:t>
-      </w:r>
-    </w:p>
-    <w:p>
-      <w:pPr>
-        <w:tabs>
-          <w:tab w:val="left" w:pos="2520"/>
-        </w:tabs>
-        <w:spacing w:after="0" w:line="240" w:lineRule="auto"/>
-      </w:pPr>
-      <w:r>
-        <w:tab/>
-        <w:t xml:space="preserve">   </w:t>
-      </w:r>
-      <w:r>
-        <w:t>SEKSI PEMELIHARAAN DRAINASE]</w:t>
-      </w:r>
-      <w:r>
-        <w:br/>
-      </w:r>
-      <w:proofErr w:type="spellStart"/>
-      <w:r>
-        <w:t>Kedudukan</w:t>
-      </w:r>
-      <w:proofErr w:type="spellEnd"/>
-      <w:r>
-        <w:tab/>
-        <w:t xml:space="preserve">: </w:t>
-      </w:r>
-      <w:proofErr w:type="spellStart"/>
-      <w:r>
-        <w:t>Ketua</w:t>
-      </w:r>
-      <w:proofErr w:type="spellEnd"/>
-      <w:r>
-        <w:t>/</w:t>
-      </w:r>
-      <w:proofErr w:type="spellStart"/>
-      <w:r>
-        <w:t>Koordinator</w:t>
-      </w:r>
-      <w:proofErr w:type="spellEnd"/>
-      <w:r>
-        <w:t xml:space="preserve"> Tim Pelaksana Swakelola </w:t>
-      </w:r>
-      <w:proofErr w:type="spellStart"/>
-      <w:r>
-        <w:t>Tipe</w:t>
-      </w:r>
-      <w:proofErr w:type="spellEnd"/>
-      <w:r>
-        <w:t xml:space="preserve"> I</w:t>
-      </w:r>
-      <w:r>
-        <w:br/>
-      </w:r>
-    </w:p>
-    <w:p>
-      <w:proofErr w:type="spellStart"/>
-      <w:r>
-        <w:t>Untuk</w:t>
-      </w:r>
-      <w:proofErr w:type="spellEnd"/>
-      <w:r>
-        <w:t xml:space="preserve"> </w:t>
-      </w:r>
-      <w:proofErr w:type="spellStart"/>
-      <w:r>
-        <w:t>melaksanakan</w:t>
-      </w:r>
-      <w:proofErr w:type="spellEnd"/>
-      <w:r>
-        <w:t xml:space="preserve"> </w:t>
-      </w:r>
-      <w:proofErr w:type="spellStart"/>
-      <w:r>
-        <w:t>pekerjaan</w:t>
-      </w:r>
-      <w:proofErr w:type="spellEnd"/>
-      <w:r>
-        <w:t xml:space="preserve"> </w:t>
-      </w:r>
-      <w:proofErr w:type="spellStart"/>
-      <w:r>
-        <w:t>Swakelola</w:t>
-      </w:r>
-      <w:proofErr w:type="spellEnd"/>
-      <w:r>
-        <w:t xml:space="preserve"> </w:t>
-      </w:r>
-      <w:proofErr w:type="spellStart"/>
-      <w:r>
-        <w:t>Tipe</w:t>
-      </w:r>
-      <w:proofErr w:type="spellEnd"/>
-      <w:r>
-        <w:t xml:space="preserve"> I </w:t>
-      </w:r>
-      <w:proofErr w:type="spellStart"/>
-      <w:r>
-        <w:t>dengan</w:t>
-      </w:r>
-      <w:proofErr w:type="spellEnd"/>
-      <w:r>
-        <w:t xml:space="preserve"> data </w:t>
-      </w:r>
-      <w:proofErr w:type="spellStart"/>
-      <w:r>
-        <w:t>sebagai</w:t>
-      </w:r>
-      <w:proofErr w:type="spellEnd"/>
-      <w:r>
-        <w:t xml:space="preserve"> </w:t>
-      </w:r>
-      <w:proofErr w:type="spellStart"/>
-      <w:r>
-        <w:t>berikut</w:t>
-      </w:r>
-      <w:proofErr w:type="spellEnd"/>
-      <w:r>
-        <w:t>:</w:t>
-      </w:r>
-    </w:p>
-    <w:p>
-      <w:pPr>
-        <w:tabs>
-          <w:tab w:val="left" w:pos="2520"/>
-        </w:tabs>
-      </w:pPr>
-      <w:r>
-        <w:t>Nama Program</w:t>
-      </w:r>
-      <w:r>
-        <w:tab/>
-        <w:t>: [SESUAI DPA]</w:t>
-      </w:r>
-      <w:r>
-        <w:br/>
-        <w:t xml:space="preserve">Nama </w:t>
-      </w:r>
-      <w:proofErr w:type="spellStart"/>
-      <w:r>
-        <w:t>Kegiatan</w:t>
-      </w:r>
-      <w:proofErr w:type="spellEnd"/>
-      <w:r>
-        <w:tab/>
-        <w:t>: [SESUAI DPA]</w:t>
-      </w:r>
-      <w:r>
-        <w:br/>
-        <w:t xml:space="preserve">Nama </w:t>
-      </w:r>
-      <w:proofErr w:type="spellStart"/>
-      <w:r>
-        <w:t>Subkegiatan</w:t>
-      </w:r>
-      <w:proofErr w:type="spellEnd"/>
-      <w:r>
-        <w:tab/>
-        <w:t>: [SESUAI DPA]</w:t>
-      </w:r>
-      <w:r>
-        <w:br/>
-      </w:r>
-      <w:proofErr w:type="spellStart"/>
-      <w:r>
-        <w:t>Nomor</w:t>
-      </w:r>
-      <w:proofErr w:type="spellEnd"/>
-      <w:r>
-        <w:t xml:space="preserve">/Kode </w:t>
-      </w:r>
-      <w:proofErr w:type="spellStart"/>
-      <w:r>
-        <w:t>Kegiatan</w:t>
-      </w:r>
-      <w:proofErr w:type="spellEnd"/>
-      <w:r>
-        <w:tab/>
-        <w:t>: [SESUAI DPA]</w:t>
-      </w:r>
-      <w:r>
-        <w:br/>
-        <w:t xml:space="preserve">Kode </w:t>
-      </w:r>
-      <w:proofErr w:type="spellStart"/>
-      <w:r>
-        <w:t>Rekening</w:t>
-      </w:r>
-      <w:proofErr w:type="spellEnd"/>
-      <w:r>
-        <w:tab/>
-        <w:t>: [SESUAI DPA]</w:t>
-      </w:r>
-      <w:r>
-        <w:br/>
-        <w:t xml:space="preserve">Jenis </w:t>
-      </w:r>
-      <w:proofErr w:type="spellStart"/>
-      <w:r>
-        <w:t>Pekerjaan</w:t>
-      </w:r>
-      <w:proofErr w:type="spellEnd"/>
-      <w:r>
-        <w:tab/>
-        <w:t xml:space="preserve">: </w:t>
-      </w:r>
-      <w:proofErr w:type="spellStart"/>
-      <w:r>
-        <w:t>Perbaikan</w:t>
-      </w:r>
-      <w:proofErr w:type="spellEnd"/>
-      <w:r>
-        <w:t xml:space="preserve"> dan </w:t>
-      </w:r>
-      <w:proofErr w:type="spellStart"/>
-      <w:r>
-        <w:t>Pengurasan</w:t>
-      </w:r>
-      <w:proofErr w:type="spellEnd"/>
-      <w:r>
-        <w:t xml:space="preserve"> </w:t>
-      </w:r>
-      <w:proofErr w:type="spellStart"/>
-      <w:r>
-        <w:t>Saluran</w:t>
-      </w:r>
-      <w:proofErr w:type="spellEnd"/>
-      <w:r>
-        <w:t xml:space="preserve"> / [SESUAI PAKET]</w:t>
-      </w:r>
-      <w:r>
-        <w:br/>
-        <w:t>Lokasi</w:t>
-      </w:r>
-      <w:r>
-        <w:tab/>
-        <w:t>: [LOKASI]</w:t>
-      </w:r>
-      <w:r>
-        <w:br/>
-      </w:r>
-      <w:proofErr w:type="spellStart"/>
-      <w:r>
-        <w:t>Tahun</w:t>
-      </w:r>
-      <w:proofErr w:type="spellEnd"/>
-      <w:r>
-        <w:t xml:space="preserve"> </w:t>
-      </w:r>
-      <w:proofErr w:type="spellStart"/>
-      <w:r>
-        <w:t>Anggaran</w:t>
-      </w:r>
-      <w:proofErr w:type="spellEnd"/>
-      <w:r>
-        <w:tab/>
-        <w:t>: 2026</w:t>
-      </w:r>
-    </w:p>
-    <w:p>
-      <w:r>
-        <w:rPr>
-          <w:b/>
-        </w:rPr>
-        <w:t xml:space="preserve">I. </w:t>
-      </w:r>
-      <w:proofErr w:type="spellStart"/>
-      <w:r>
-        <w:rPr>
-          <w:b/>
-        </w:rPr>
-        <w:t>Dokumen</w:t>
-      </w:r>
-      <w:proofErr w:type="spellEnd"/>
-      <w:r>
-        <w:rPr>
-          <w:b/>
-        </w:rPr>
-        <w:t xml:space="preserve"> Teknis dan </w:t>
-      </w:r>
-      <w:proofErr w:type="spellStart"/>
-      <w:r>
-        <w:rPr>
-          <w:b/>
-        </w:rPr>
-        <w:t>Administratif</w:t>
-      </w:r>
-      <w:proofErr w:type="spellEnd"/>
-    </w:p>
-    <w:p>
-      <w:pPr>
-        <w:ind w:left="360" w:hanging="360"/>
-      </w:pPr>
-      <w:r>
-        <w:t xml:space="preserve">1. Gambar </w:t>
-      </w:r>
-      <w:proofErr w:type="spellStart"/>
-      <w:r>
-        <w:t>kerja</w:t>
-      </w:r>
-      <w:proofErr w:type="spellEnd"/>
-      <w:r>
-        <w:t xml:space="preserve"> yang </w:t>
-      </w:r>
-      <w:proofErr w:type="spellStart"/>
-      <w:r>
-        <w:t>telah</w:t>
-      </w:r>
-      <w:proofErr w:type="spellEnd"/>
-      <w:r>
-        <w:t xml:space="preserve"> </w:t>
-      </w:r>
-      <w:proofErr w:type="spellStart"/>
-      <w:r>
-        <w:t>ditetapkan</w:t>
-      </w:r>
-      <w:proofErr w:type="spellEnd"/>
-      <w:r>
-        <w:t>;</w:t>
-      </w:r>
-    </w:p>
-    <w:p>
-      <w:pPr>
-        <w:ind w:left="360" w:hanging="360"/>
-      </w:pPr>
-      <w:r>
-        <w:t>2. Berita acara/</w:t>
-      </w:r>
-      <w:proofErr w:type="spellStart"/>
-      <w:r>
-        <w:t>perhitungan</w:t>
-      </w:r>
-      <w:proofErr w:type="spellEnd"/>
-      <w:r>
-        <w:t xml:space="preserve"> volume </w:t>
-      </w:r>
-      <w:proofErr w:type="spellStart"/>
-      <w:r>
-        <w:t>pekerjaan</w:t>
-      </w:r>
-      <w:proofErr w:type="spellEnd"/>
-      <w:r>
-        <w:t>;</w:t>
-      </w:r>
-    </w:p>
-    <w:p>
-      <w:pPr>
-        <w:ind w:left="360" w:hanging="360"/>
-      </w:pPr>
-      <w:r>
-        <w:t xml:space="preserve">3. </w:t>
-      </w:r>
-      <w:proofErr w:type="spellStart"/>
-      <w:r>
-        <w:t>Rencana</w:t>
-      </w:r>
-      <w:proofErr w:type="spellEnd"/>
-      <w:r>
-        <w:t xml:space="preserve"> </w:t>
-      </w:r>
-      <w:proofErr w:type="spellStart"/>
-      <w:r>
-        <w:t>kebutuhan</w:t>
-      </w:r>
-      <w:proofErr w:type="spellEnd"/>
-      <w:r>
-        <w:t xml:space="preserve"> </w:t>
-      </w:r>
-      <w:proofErr w:type="spellStart"/>
-      <w:r>
-        <w:t>bahan</w:t>
-      </w:r>
-      <w:proofErr w:type="spellEnd"/>
-      <w:r>
-        <w:t xml:space="preserve">/material dan </w:t>
-      </w:r>
-      <w:proofErr w:type="spellStart"/>
-      <w:r>
-        <w:t>peralatan</w:t>
-      </w:r>
-      <w:proofErr w:type="spellEnd"/>
-      <w:r>
-        <w:t>;</w:t>
-      </w:r>
-    </w:p>
-    <w:p>
-      <w:pPr>
-        <w:ind w:left="360" w:hanging="360"/>
-      </w:pPr>
-      <w:r>
-        <w:t xml:space="preserve">4. RAB dan </w:t>
-      </w:r>
-      <w:proofErr w:type="spellStart"/>
-      <w:r>
-        <w:t>jadwal</w:t>
-      </w:r>
-      <w:proofErr w:type="spellEnd"/>
-      <w:r>
-        <w:t xml:space="preserve"> </w:t>
-      </w:r>
-      <w:proofErr w:type="spellStart"/>
-      <w:r>
-        <w:t>pelaksanaan</w:t>
-      </w:r>
-      <w:proofErr w:type="spellEnd"/>
-      <w:r>
-        <w:t xml:space="preserve"> yang </w:t>
-      </w:r>
-      <w:proofErr w:type="spellStart"/>
-      <w:r>
-        <w:t>telah</w:t>
-      </w:r>
-      <w:proofErr w:type="spellEnd"/>
-      <w:r>
-        <w:t xml:space="preserve"> </w:t>
-      </w:r>
-      <w:proofErr w:type="spellStart"/>
-      <w:r>
-        <w:t>ditetapkan</w:t>
-      </w:r>
-      <w:proofErr w:type="spellEnd"/>
-      <w:r>
-        <w:t xml:space="preserve"> oleh PPK;</w:t>
-      </w:r>
-    </w:p>
-    <w:p>
-      <w:r>
-        <w:rPr>
-          <w:b/>
-        </w:rPr>
-        <w:t xml:space="preserve">II. </w:t>
-      </w:r>
-      <w:proofErr w:type="spellStart"/>
-      <w:r>
-        <w:rPr>
-          <w:b/>
-        </w:rPr>
-        <w:t>Ketentuan</w:t>
-      </w:r>
-      <w:proofErr w:type="spellEnd"/>
-      <w:r>
-        <w:rPr>
-          <w:b/>
-        </w:rPr>
-        <w:t xml:space="preserve"> </w:t>
-      </w:r>
-      <w:proofErr w:type="spellStart"/>
-      <w:r>
-        <w:rPr>
-          <w:b/>
-        </w:rPr>
-        <w:t>Pelaksanaan</w:t>
-      </w:r>
-      <w:proofErr w:type="spellEnd"/>
-    </w:p>
-    <w:p>
-      <w:pPr>
-        <w:ind w:left="360" w:hanging="360"/>
-      </w:pPr>
-      <w:r>
-        <w:t xml:space="preserve">1. </w:t>
-      </w:r>
-      <w:proofErr w:type="spellStart"/>
-      <w:r>
-        <w:t>Pekerjaan</w:t>
-      </w:r>
-      <w:proofErr w:type="spellEnd"/>
-      <w:r>
-        <w:t xml:space="preserve"> </w:t>
-      </w:r>
-      <w:proofErr w:type="spellStart"/>
-      <w:r>
-        <w:t>dilaksanakan</w:t>
-      </w:r>
-      <w:proofErr w:type="spellEnd"/>
-      <w:r>
-        <w:t xml:space="preserve"> oleh Tim </w:t>
-      </w:r>
-      <w:proofErr w:type="spellStart"/>
-      <w:r>
-        <w:t>Pelaksana</w:t>
-      </w:r>
-      <w:proofErr w:type="spellEnd"/>
-      <w:r>
-        <w:t xml:space="preserve"> Swakelola </w:t>
-      </w:r>
-      <w:proofErr w:type="spellStart"/>
-      <w:r>
-        <w:t>Tipe</w:t>
-      </w:r>
-      <w:proofErr w:type="spellEnd"/>
-      <w:r>
-        <w:t xml:space="preserve"> I </w:t>
-      </w:r>
-      <w:proofErr w:type="spellStart"/>
-      <w:r>
-        <w:t>sesuai</w:t>
-      </w:r>
-      <w:proofErr w:type="spellEnd"/>
-      <w:r>
-        <w:t xml:space="preserve"> Keputusan KPA dan </w:t>
-      </w:r>
-      <w:proofErr w:type="spellStart"/>
-      <w:r>
-        <w:t>dokumen</w:t>
-      </w:r>
-      <w:proofErr w:type="spellEnd"/>
-      <w:r>
-        <w:t xml:space="preserve"> </w:t>
-      </w:r>
-      <w:proofErr w:type="spellStart"/>
-      <w:r>
-        <w:t>persiapan</w:t>
-      </w:r>
-      <w:proofErr w:type="spellEnd"/>
-      <w:r>
-        <w:t xml:space="preserve"> </w:t>
-      </w:r>
-      <w:proofErr w:type="spellStart"/>
-      <w:r>
-        <w:t>Swakelola</w:t>
-      </w:r>
-      <w:proofErr w:type="spellEnd"/>
-      <w:r>
-        <w:t>.</w:t>
-      </w:r>
-    </w:p>
-    <w:p>
-      <w:pPr>
-        <w:ind w:left="360" w:hanging="360"/>
-      </w:pPr>
-      <w:r>
-        <w:t xml:space="preserve">2. </w:t>
-      </w:r>
-      <w:proofErr w:type="spellStart"/>
-      <w:r>
-        <w:t>Pelaksanaan</w:t>
-      </w:r>
-      <w:proofErr w:type="spellEnd"/>
-      <w:r>
-        <w:t xml:space="preserve"> </w:t>
-      </w:r>
-      <w:proofErr w:type="spellStart"/>
-      <w:r>
-        <w:t>dapat</w:t>
-      </w:r>
-      <w:proofErr w:type="spellEnd"/>
-      <w:r>
-        <w:t xml:space="preserve"> </w:t>
-      </w:r>
-      <w:proofErr w:type="spellStart"/>
-      <w:r>
-        <w:t>memanfaatkan</w:t>
-      </w:r>
-      <w:proofErr w:type="spellEnd"/>
-      <w:r>
-        <w:t xml:space="preserve"> </w:t>
-      </w:r>
-      <w:proofErr w:type="spellStart"/>
-      <w:r>
-        <w:t>tenaga</w:t>
-      </w:r>
-      <w:proofErr w:type="spellEnd"/>
-      <w:r>
-        <w:t xml:space="preserve"> </w:t>
-      </w:r>
-      <w:proofErr w:type="spellStart"/>
-      <w:r>
-        <w:t>pendukung</w:t>
-      </w:r>
-      <w:proofErr w:type="spellEnd"/>
-      <w:r>
-        <w:t xml:space="preserve">/PJLP, </w:t>
-      </w:r>
-      <w:proofErr w:type="spellStart"/>
-      <w:r>
-        <w:t>peralatan</w:t>
-      </w:r>
-      <w:proofErr w:type="spellEnd"/>
-      <w:r>
-        <w:t xml:space="preserve">, </w:t>
-      </w:r>
-      <w:proofErr w:type="spellStart"/>
-      <w:r>
-        <w:t>kendaraan</w:t>
-      </w:r>
-      <w:proofErr w:type="spellEnd"/>
-      <w:r>
-        <w:t xml:space="preserve"> </w:t>
-      </w:r>
-      <w:proofErr w:type="spellStart"/>
-      <w:r>
-        <w:t>dinas</w:t>
-      </w:r>
-      <w:proofErr w:type="spellEnd"/>
-      <w:r>
-        <w:t xml:space="preserve">, </w:t>
-      </w:r>
-      <w:proofErr w:type="spellStart"/>
-      <w:r>
-        <w:t>persediaan</w:t>
-      </w:r>
-      <w:proofErr w:type="spellEnd"/>
-      <w:r>
-        <w:t xml:space="preserve">, </w:t>
-      </w:r>
-      <w:proofErr w:type="spellStart"/>
-      <w:r>
-        <w:t>serta</w:t>
-      </w:r>
-      <w:proofErr w:type="spellEnd"/>
-      <w:r>
-        <w:t xml:space="preserve"> </w:t>
-      </w:r>
-      <w:proofErr w:type="spellStart"/>
-      <w:r>
-        <w:t>sumber</w:t>
-      </w:r>
-      <w:proofErr w:type="spellEnd"/>
-      <w:r>
-        <w:t xml:space="preserve"> </w:t>
-      </w:r>
-      <w:proofErr w:type="spellStart"/>
-      <w:r>
-        <w:t>daya</w:t>
-      </w:r>
-      <w:proofErr w:type="spellEnd"/>
-      <w:r>
-        <w:t xml:space="preserve"> lain yang </w:t>
-      </w:r>
-      <w:proofErr w:type="spellStart"/>
-      <w:r>
-        <w:t>tersedia</w:t>
-      </w:r>
-      <w:proofErr w:type="spellEnd"/>
-      <w:r>
-        <w:t xml:space="preserve"> </w:t>
-      </w:r>
-      <w:proofErr w:type="spellStart"/>
-      <w:r>
-        <w:t>sesuai</w:t>
-      </w:r>
-      <w:proofErr w:type="spellEnd"/>
-      <w:r>
-        <w:t xml:space="preserve"> </w:t>
-      </w:r>
-      <w:proofErr w:type="spellStart"/>
-      <w:r>
-        <w:t>penugasan</w:t>
-      </w:r>
-      <w:proofErr w:type="spellEnd"/>
-      <w:r>
-        <w:t xml:space="preserve">, </w:t>
-      </w:r>
-      <w:proofErr w:type="spellStart"/>
-      <w:r>
-        <w:t>kontrak</w:t>
-      </w:r>
-      <w:proofErr w:type="spellEnd"/>
-      <w:r>
-        <w:t xml:space="preserve">, dan </w:t>
-      </w:r>
-      <w:proofErr w:type="spellStart"/>
-      <w:r>
-        <w:t>ketentuan</w:t>
-      </w:r>
-      <w:proofErr w:type="spellEnd"/>
-      <w:r>
-        <w:t xml:space="preserve"> yang </w:t>
-      </w:r>
-      <w:proofErr w:type="spellStart"/>
-      <w:r>
-        <w:t>berlaku</w:t>
-      </w:r>
-      <w:proofErr w:type="spellEnd"/>
-      <w:r>
-        <w:t>.</w:t>
-      </w:r>
-    </w:p>
-    <w:p>
-      <w:pPr>
-        <w:ind w:left="360" w:hanging="360"/>
-      </w:pPr>
-      <w:r>
-        <w:t xml:space="preserve">3. </w:t>
-      </w:r>
-      <w:proofErr w:type="spellStart"/>
-      <w:r>
-        <w:t>Apabila</w:t>
-      </w:r>
-      <w:proofErr w:type="spellEnd"/>
-      <w:r>
-        <w:t xml:space="preserve"> </w:t>
-      </w:r>
-      <w:proofErr w:type="spellStart"/>
-      <w:r>
-        <w:t>diperlukan</w:t>
-      </w:r>
-      <w:proofErr w:type="spellEnd"/>
-      <w:r>
-        <w:t xml:space="preserve"> </w:t>
-      </w:r>
-      <w:proofErr w:type="spellStart"/>
-      <w:r>
-        <w:t>pengadaan</w:t>
-      </w:r>
-      <w:proofErr w:type="spellEnd"/>
-      <w:r>
-        <w:t xml:space="preserve"> </w:t>
-      </w:r>
-      <w:proofErr w:type="spellStart"/>
-      <w:r>
-        <w:t>barang</w:t>
-      </w:r>
-      <w:proofErr w:type="spellEnd"/>
-      <w:r>
-        <w:t>/</w:t>
-      </w:r>
-      <w:proofErr w:type="spellStart"/>
-      <w:r>
-        <w:t>jasa</w:t>
-      </w:r>
-      <w:proofErr w:type="spellEnd"/>
-      <w:r>
-        <w:t xml:space="preserve"> </w:t>
-      </w:r>
-      <w:proofErr w:type="spellStart"/>
-      <w:r>
-        <w:t>melalui</w:t>
-      </w:r>
-      <w:proofErr w:type="spellEnd"/>
-      <w:r>
-        <w:t xml:space="preserve"> </w:t>
-      </w:r>
-      <w:proofErr w:type="spellStart"/>
-      <w:r>
-        <w:t>Penyedia</w:t>
-      </w:r>
-      <w:proofErr w:type="spellEnd"/>
-      <w:r>
-        <w:t xml:space="preserve"> </w:t>
-      </w:r>
-      <w:proofErr w:type="spellStart"/>
-      <w:r>
-        <w:t>sebagai</w:t>
-      </w:r>
-      <w:proofErr w:type="spellEnd"/>
-      <w:r>
-        <w:t xml:space="preserve"> </w:t>
-      </w:r>
-      <w:proofErr w:type="spellStart"/>
-      <w:r>
-        <w:t>bagian</w:t>
-      </w:r>
-      <w:proofErr w:type="spellEnd"/>
-      <w:r>
-        <w:t xml:space="preserve"> </w:t>
-      </w:r>
-      <w:proofErr w:type="spellStart"/>
-      <w:r>
-        <w:t>pendukung</w:t>
-      </w:r>
-      <w:proofErr w:type="spellEnd"/>
-      <w:r>
-        <w:t xml:space="preserve"> </w:t>
-      </w:r>
-      <w:proofErr w:type="spellStart"/>
-      <w:r>
-        <w:t>Swakelola</w:t>
-      </w:r>
-      <w:proofErr w:type="spellEnd"/>
-      <w:r>
-        <w:t xml:space="preserve">, proses </w:t>
-      </w:r>
-      <w:proofErr w:type="spellStart"/>
-      <w:r>
-        <w:t>pengadaannya</w:t>
-      </w:r>
-      <w:proofErr w:type="spellEnd"/>
-      <w:r>
-        <w:t xml:space="preserve"> </w:t>
-      </w:r>
-      <w:proofErr w:type="spellStart"/>
-      <w:r>
-        <w:t>dilaksanakan</w:t>
-      </w:r>
-      <w:proofErr w:type="spellEnd"/>
-      <w:r>
-        <w:t xml:space="preserve"> </w:t>
-      </w:r>
-      <w:proofErr w:type="spellStart"/>
-      <w:r>
-        <w:t>secara</w:t>
-      </w:r>
-      <w:proofErr w:type="spellEnd"/>
-      <w:r>
-        <w:t xml:space="preserve"> </w:t>
-      </w:r>
-      <w:proofErr w:type="spellStart"/>
-      <w:r>
-        <w:t>terpisah</w:t>
-      </w:r>
-      <w:proofErr w:type="spellEnd"/>
-      <w:r>
-        <w:t xml:space="preserve"> </w:t>
-      </w:r>
-      <w:proofErr w:type="spellStart"/>
-      <w:r>
-        <w:t>sesuai</w:t>
-      </w:r>
-      <w:proofErr w:type="spellEnd"/>
-      <w:r>
-        <w:t xml:space="preserve"> </w:t>
-      </w:r>
-      <w:proofErr w:type="spellStart"/>
-      <w:r>
-        <w:t>ketentuan</w:t>
-      </w:r>
-      <w:proofErr w:type="spellEnd"/>
-      <w:r>
-        <w:t xml:space="preserve"> </w:t>
-      </w:r>
-      <w:proofErr w:type="spellStart"/>
-      <w:r>
-        <w:t>Pengadaan</w:t>
-      </w:r>
-      <w:proofErr w:type="spellEnd"/>
-      <w:r>
-        <w:t xml:space="preserve"> Barang/Jasa </w:t>
-      </w:r>
-      <w:proofErr w:type="spellStart"/>
-      <w:r>
-        <w:t>Pemerintah</w:t>
-      </w:r>
-      <w:proofErr w:type="spellEnd"/>
-      <w:r>
-        <w:t>.</w:t>
-      </w:r>
-    </w:p>
-    <w:p>
-      <w:pPr>
-        <w:ind w:left="360" w:hanging="360"/>
-      </w:pPr>
-      <w:r>
-        <w:t xml:space="preserve">4. Bahan/material </w:t>
-      </w:r>
-      <w:proofErr w:type="spellStart"/>
-      <w:r>
-        <w:t>wajib</w:t>
-      </w:r>
-      <w:proofErr w:type="spellEnd"/>
-      <w:r>
-        <w:t xml:space="preserve"> </w:t>
-      </w:r>
-      <w:proofErr w:type="spellStart"/>
-      <w:r>
-        <w:t>dicatat</w:t>
-      </w:r>
-      <w:proofErr w:type="spellEnd"/>
-      <w:r>
-        <w:t xml:space="preserve"> </w:t>
-      </w:r>
-      <w:proofErr w:type="spellStart"/>
-      <w:r>
-        <w:t>penerimaan</w:t>
-      </w:r>
-      <w:proofErr w:type="spellEnd"/>
-      <w:r>
-        <w:t xml:space="preserve">, </w:t>
-      </w:r>
-      <w:proofErr w:type="spellStart"/>
-      <w:r>
-        <w:t>penggunaan</w:t>
-      </w:r>
-      <w:proofErr w:type="spellEnd"/>
-      <w:r>
-        <w:t xml:space="preserve">, </w:t>
-      </w:r>
-      <w:proofErr w:type="spellStart"/>
-      <w:r>
-        <w:t>sisa</w:t>
-      </w:r>
-      <w:proofErr w:type="spellEnd"/>
-      <w:r>
-        <w:t xml:space="preserve">, dan </w:t>
-      </w:r>
-      <w:proofErr w:type="spellStart"/>
-      <w:r>
-        <w:t>lokasinya</w:t>
-      </w:r>
-      <w:proofErr w:type="spellEnd"/>
-      <w:r>
-        <w:t xml:space="preserve"> </w:t>
-      </w:r>
-      <w:proofErr w:type="spellStart"/>
-      <w:r>
-        <w:t>serta</w:t>
-      </w:r>
-      <w:proofErr w:type="spellEnd"/>
-      <w:r>
-        <w:t xml:space="preserve"> </w:t>
-      </w:r>
-      <w:proofErr w:type="spellStart"/>
-      <w:r>
-        <w:t>didukung</w:t>
-      </w:r>
-      <w:proofErr w:type="spellEnd"/>
-      <w:r>
-        <w:t xml:space="preserve"> </w:t>
-      </w:r>
-      <w:proofErr w:type="spellStart"/>
-      <w:r>
-        <w:t>dokumen</w:t>
-      </w:r>
-      <w:proofErr w:type="spellEnd"/>
-      <w:r>
-        <w:t xml:space="preserve"> </w:t>
-      </w:r>
-      <w:proofErr w:type="spellStart"/>
-      <w:r>
-        <w:t>persediaan</w:t>
-      </w:r>
-      <w:proofErr w:type="spellEnd"/>
-      <w:r>
-        <w:t xml:space="preserve"> yang </w:t>
-      </w:r>
-      <w:proofErr w:type="spellStart"/>
-      <w:r>
-        <w:t>dapat</w:t>
-      </w:r>
-      <w:proofErr w:type="spellEnd"/>
-      <w:r>
-        <w:t xml:space="preserve"> </w:t>
-      </w:r>
-      <w:proofErr w:type="spellStart"/>
-      <w:r>
-        <w:t>ditelusuri</w:t>
-      </w:r>
-      <w:proofErr w:type="spellEnd"/>
-      <w:r>
-        <w:t>.</w:t>
-      </w:r>
-    </w:p>
-    <w:p>
-      <w:pPr>
-        <w:ind w:left="360" w:hanging="360"/>
-      </w:pPr>
-      <w:r>
-        <w:t xml:space="preserve">5. </w:t>
-      </w:r>
-      <w:proofErr w:type="spellStart"/>
-      <w:r>
-        <w:t>Pelaksanaan</w:t>
-      </w:r>
-      <w:proofErr w:type="spellEnd"/>
-      <w:r>
-        <w:t xml:space="preserve"> </w:t>
-      </w:r>
-      <w:proofErr w:type="spellStart"/>
-      <w:r>
-        <w:t>pekerjaan</w:t>
-      </w:r>
-      <w:proofErr w:type="spellEnd"/>
-      <w:r>
-        <w:t xml:space="preserve"> </w:t>
-      </w:r>
-      <w:proofErr w:type="spellStart"/>
-      <w:r>
-        <w:t>wajib</w:t>
-      </w:r>
-      <w:proofErr w:type="spellEnd"/>
-      <w:r>
-        <w:t xml:space="preserve"> </w:t>
-      </w:r>
-      <w:proofErr w:type="spellStart"/>
-      <w:r>
-        <w:t>memperhatikan</w:t>
-      </w:r>
-      <w:proofErr w:type="spellEnd"/>
-      <w:r>
-        <w:t xml:space="preserve"> </w:t>
-      </w:r>
-      <w:proofErr w:type="spellStart"/>
-      <w:r>
-        <w:t>keselamatan</w:t>
-      </w:r>
-      <w:proofErr w:type="spellEnd"/>
-      <w:r>
-        <w:t xml:space="preserve"> </w:t>
-      </w:r>
-      <w:proofErr w:type="spellStart"/>
-      <w:r>
-        <w:t>kerja</w:t>
-      </w:r>
-      <w:proofErr w:type="spellEnd"/>
-      <w:r>
-        <w:t xml:space="preserve">, </w:t>
-      </w:r>
-      <w:proofErr w:type="spellStart"/>
-      <w:r>
-        <w:t>pengamanan</w:t>
-      </w:r>
-      <w:proofErr w:type="spellEnd"/>
-      <w:r>
-        <w:t xml:space="preserve"> </w:t>
-      </w:r>
-      <w:proofErr w:type="spellStart"/>
-      <w:r>
-        <w:t>aset</w:t>
-      </w:r>
-      <w:proofErr w:type="spellEnd"/>
-      <w:r>
-        <w:t>/</w:t>
-      </w:r>
-      <w:proofErr w:type="spellStart"/>
-      <w:r>
-        <w:t>peralatan</w:t>
-      </w:r>
-      <w:proofErr w:type="spellEnd"/>
-      <w:r>
-        <w:t xml:space="preserve">, </w:t>
-      </w:r>
-      <w:proofErr w:type="spellStart"/>
-      <w:r>
-        <w:t>kebersihan</w:t>
-      </w:r>
-      <w:proofErr w:type="spellEnd"/>
-      <w:r>
-        <w:t xml:space="preserve"> </w:t>
-      </w:r>
-      <w:proofErr w:type="spellStart"/>
-      <w:r>
-        <w:t>lokasi</w:t>
-      </w:r>
-      <w:proofErr w:type="spellEnd"/>
-      <w:r>
-        <w:t xml:space="preserve">, dan </w:t>
-      </w:r>
-      <w:proofErr w:type="spellStart"/>
-      <w:r>
-        <w:t>pengendalian</w:t>
-      </w:r>
-      <w:proofErr w:type="spellEnd"/>
-      <w:r>
-        <w:t xml:space="preserve"> </w:t>
-      </w:r>
-      <w:proofErr w:type="spellStart"/>
-      <w:r>
-        <w:t>dampak</w:t>
-      </w:r>
-      <w:proofErr w:type="spellEnd"/>
-      <w:r>
-        <w:t xml:space="preserve"> </w:t>
-      </w:r>
-      <w:proofErr w:type="spellStart"/>
-      <w:r>
-        <w:t>terhadap</w:t>
-      </w:r>
-      <w:proofErr w:type="spellEnd"/>
-      <w:r>
-        <w:t xml:space="preserve"> </w:t>
-      </w:r>
-      <w:proofErr w:type="spellStart"/>
-      <w:r>
-        <w:t>masyarakat</w:t>
-      </w:r>
-      <w:proofErr w:type="spellEnd"/>
-      <w:r>
-        <w:t>/</w:t>
-      </w:r>
-      <w:proofErr w:type="spellStart"/>
-      <w:r>
-        <w:t>lingkungan</w:t>
-      </w:r>
-      <w:proofErr w:type="spellEnd"/>
-      <w:r>
-        <w:t xml:space="preserve"> </w:t>
-      </w:r>
-      <w:proofErr w:type="spellStart"/>
-      <w:r>
-        <w:t>sekitar</w:t>
-      </w:r>
-      <w:proofErr w:type="spellEnd"/>
-      <w:r>
-        <w:t>.</w:t>
-      </w:r>
-    </w:p>
-    <w:p>
-      <w:pPr>
-        <w:ind w:left="360" w:hanging="360"/>
-      </w:pPr>
-      <w:r>
-        <w:t xml:space="preserve">6. </w:t>
-      </w:r>
-      <w:proofErr w:type="spellStart"/>
-      <w:r>
-        <w:t>Setiap</w:t>
-      </w:r>
-      <w:proofErr w:type="spellEnd"/>
-      <w:r>
-        <w:t xml:space="preserve"> </w:t>
-      </w:r>
-      <w:proofErr w:type="spellStart"/>
-      <w:r>
-        <w:t>perubahan</w:t>
-      </w:r>
-      <w:proofErr w:type="spellEnd"/>
-      <w:r>
-        <w:t xml:space="preserve"> volume, </w:t>
-      </w:r>
-      <w:proofErr w:type="spellStart"/>
-      <w:r>
-        <w:t>lokasi</w:t>
-      </w:r>
-      <w:proofErr w:type="spellEnd"/>
-      <w:r>
-        <w:t xml:space="preserve">, </w:t>
-      </w:r>
-      <w:proofErr w:type="spellStart"/>
-      <w:r>
-        <w:t>metode</w:t>
-      </w:r>
-      <w:proofErr w:type="spellEnd"/>
-      <w:r>
-        <w:t xml:space="preserve">, </w:t>
-      </w:r>
-      <w:proofErr w:type="spellStart"/>
-      <w:r>
-        <w:t>atau</w:t>
-      </w:r>
-      <w:proofErr w:type="spellEnd"/>
-      <w:r>
-        <w:t xml:space="preserve"> </w:t>
-      </w:r>
-      <w:proofErr w:type="spellStart"/>
-      <w:r>
-        <w:t>kebutuhan</w:t>
-      </w:r>
-      <w:proofErr w:type="spellEnd"/>
-      <w:r>
-        <w:t xml:space="preserve"> </w:t>
-      </w:r>
-      <w:proofErr w:type="spellStart"/>
-      <w:r>
-        <w:t>sumber</w:t>
-      </w:r>
-      <w:proofErr w:type="spellEnd"/>
-      <w:r>
-        <w:t xml:space="preserve"> </w:t>
-      </w:r>
-      <w:proofErr w:type="spellStart"/>
-      <w:r>
-        <w:t>daya</w:t>
-      </w:r>
-      <w:proofErr w:type="spellEnd"/>
-      <w:r>
-        <w:t xml:space="preserve"> yang </w:t>
-      </w:r>
-      <w:proofErr w:type="spellStart"/>
-      <w:r>
-        <w:t>bersifat</w:t>
-      </w:r>
-      <w:proofErr w:type="spellEnd"/>
-      <w:r>
-        <w:t xml:space="preserve"> material </w:t>
-      </w:r>
-      <w:proofErr w:type="spellStart"/>
-      <w:r>
-        <w:t>harus</w:t>
-      </w:r>
-      <w:proofErr w:type="spellEnd"/>
-      <w:r>
-        <w:t xml:space="preserve"> </w:t>
-      </w:r>
-      <w:proofErr w:type="spellStart"/>
-      <w:r>
-        <w:t>dikoordinasikan</w:t>
-      </w:r>
-      <w:proofErr w:type="spellEnd"/>
-      <w:r>
-        <w:t xml:space="preserve"> dan </w:t>
-      </w:r>
-      <w:proofErr w:type="spellStart"/>
-      <w:r>
-        <w:t>memperoleh</w:t>
-      </w:r>
-      <w:proofErr w:type="spellEnd"/>
-      <w:r>
-        <w:t xml:space="preserve"> </w:t>
-      </w:r>
-      <w:proofErr w:type="spellStart"/>
-      <w:r>
-        <w:t>persetujuan</w:t>
-      </w:r>
-      <w:proofErr w:type="spellEnd"/>
-      <w:r>
-        <w:t xml:space="preserve"> </w:t>
-      </w:r>
-      <w:proofErr w:type="spellStart"/>
-      <w:r>
-        <w:t>pejabat</w:t>
-      </w:r>
-      <w:proofErr w:type="spellEnd"/>
-      <w:r>
-        <w:t xml:space="preserve"> yang </w:t>
-      </w:r>
-      <w:proofErr w:type="spellStart"/>
-      <w:r>
-        <w:t>berwenang</w:t>
-      </w:r>
-      <w:proofErr w:type="spellEnd"/>
-      <w:r>
-        <w:t xml:space="preserve"> </w:t>
-      </w:r>
-      <w:proofErr w:type="spellStart"/>
-      <w:r>
-        <w:t>sebelum</w:t>
-      </w:r>
-      <w:proofErr w:type="spellEnd"/>
-      <w:r>
-        <w:t xml:space="preserve"> </w:t>
-      </w:r>
-      <w:proofErr w:type="spellStart"/>
-      <w:r>
-        <w:t>dilaksanakan</w:t>
-      </w:r>
-      <w:proofErr w:type="spellEnd"/>
-      <w:r>
-        <w:t>.</w:t>
-      </w:r>
-    </w:p>
-    <w:p>
-      <w:pPr>
-        <w:tabs>
-          <w:tab w:val="left" w:pos="2160"/>
-        </w:tabs>
-      </w:pPr>
-      <w:r>
-        <w:rPr>
-          <w:b/>
-        </w:rPr>
-        <w:lastRenderedPageBreak/>
-        <w:t xml:space="preserve">III. </w:t>
-      </w:r>
-      <w:proofErr w:type="spellStart"/>
-      <w:r>
-        <w:rPr>
-          <w:b/>
-        </w:rPr>
-        <w:t>Pelaporan</w:t>
-      </w:r>
-      <w:proofErr w:type="spellEnd"/>
-      <w:r>
-        <w:rPr>
-          <w:b/>
-        </w:rPr>
-        <w:t xml:space="preserve"> dan </w:t>
-      </w:r>
-      <w:proofErr w:type="spellStart"/>
-      <w:r>
-        <w:rPr>
-          <w:b/>
-        </w:rPr>
-        <w:t>Pengawasan</w:t>
-      </w:r>
-      <w:proofErr w:type="spellEnd"/>
-    </w:p>
-    <w:p>
-      <w:pPr>
-        <w:tabs>
-          <w:tab w:val="left" w:pos="2160"/>
-        </w:tabs>
-      </w:pPr>
-      <w:r>
-        <w:t xml:space="preserve">1. Tim Pelaksana </w:t>
-      </w:r>
-      <w:proofErr w:type="spellStart"/>
-      <w:r>
-        <w:t>mencatat</w:t>
-      </w:r>
-      <w:proofErr w:type="spellEnd"/>
-      <w:r>
-        <w:t xml:space="preserve"> dan </w:t>
-      </w:r>
-      <w:proofErr w:type="spellStart"/>
-      <w:r>
-        <w:t>melaporkan</w:t>
-      </w:r>
-      <w:proofErr w:type="spellEnd"/>
-      <w:r>
-        <w:t xml:space="preserve"> </w:t>
-      </w:r>
-      <w:proofErr w:type="spellStart"/>
-      <w:r>
-        <w:t>kemajuan</w:t>
-      </w:r>
-      <w:proofErr w:type="spellEnd"/>
-      <w:r>
-        <w:t xml:space="preserve"> </w:t>
-      </w:r>
-      <w:proofErr w:type="spellStart"/>
-      <w:r>
-        <w:t>fisik</w:t>
-      </w:r>
-      <w:proofErr w:type="spellEnd"/>
-      <w:r>
-        <w:t xml:space="preserve">, </w:t>
-      </w:r>
-      <w:proofErr w:type="spellStart"/>
-      <w:r>
-        <w:t>penggunaan</w:t>
-      </w:r>
-      <w:proofErr w:type="spellEnd"/>
-      <w:r>
-        <w:t xml:space="preserve"> </w:t>
-      </w:r>
-      <w:proofErr w:type="spellStart"/>
-      <w:r>
-        <w:t>tenaga</w:t>
-      </w:r>
-      <w:proofErr w:type="spellEnd"/>
-      <w:r>
-        <w:t xml:space="preserve"> </w:t>
-      </w:r>
-      <w:proofErr w:type="spellStart"/>
-      <w:r>
-        <w:t>kerja</w:t>
-      </w:r>
-      <w:proofErr w:type="spellEnd"/>
-      <w:r>
-        <w:t xml:space="preserve">, </w:t>
-      </w:r>
-      <w:proofErr w:type="spellStart"/>
-      <w:r>
-        <w:t>bahan</w:t>
-      </w:r>
-      <w:proofErr w:type="spellEnd"/>
-      <w:r>
-        <w:t xml:space="preserve">/material, </w:t>
-      </w:r>
-      <w:proofErr w:type="spellStart"/>
-      <w:r>
-        <w:t>peralatan</w:t>
-      </w:r>
-      <w:proofErr w:type="spellEnd"/>
-      <w:r>
-        <w:t xml:space="preserve">, </w:t>
-      </w:r>
-      <w:proofErr w:type="spellStart"/>
-      <w:r>
-        <w:t>kendala</w:t>
-      </w:r>
-      <w:proofErr w:type="spellEnd"/>
-      <w:r>
-        <w:t xml:space="preserve">, </w:t>
-      </w:r>
-      <w:proofErr w:type="spellStart"/>
-      <w:r>
-        <w:t>tindakan</w:t>
-      </w:r>
-      <w:proofErr w:type="spellEnd"/>
-      <w:r>
-        <w:t xml:space="preserve"> </w:t>
-      </w:r>
-      <w:proofErr w:type="spellStart"/>
-      <w:r>
-        <w:t>korektif</w:t>
-      </w:r>
-      <w:proofErr w:type="spellEnd"/>
-      <w:r>
-        <w:t>.</w:t>
-      </w:r>
-    </w:p>
-    <w:p>
-      <w:pPr>
-        <w:tabs>
-          <w:tab w:val="left" w:pos="2160"/>
-        </w:tabs>
-      </w:pPr>
-      <w:r>
-        <w:t xml:space="preserve">2. </w:t>
-      </w:r>
-      <w:proofErr w:type="spellStart"/>
-      <w:r>
-        <w:t>Laporan</w:t>
-      </w:r>
-      <w:proofErr w:type="spellEnd"/>
-      <w:r>
-        <w:t xml:space="preserve"> </w:t>
-      </w:r>
-      <w:proofErr w:type="spellStart"/>
-      <w:r>
-        <w:t>pelaksanaan</w:t>
-      </w:r>
-      <w:proofErr w:type="spellEnd"/>
-      <w:r>
-        <w:t xml:space="preserve"> </w:t>
-      </w:r>
-      <w:proofErr w:type="spellStart"/>
-      <w:r>
-        <w:t>dilengkapi</w:t>
-      </w:r>
-      <w:proofErr w:type="spellEnd"/>
-      <w:r>
-        <w:t xml:space="preserve"> </w:t>
-      </w:r>
-      <w:proofErr w:type="spellStart"/>
-      <w:r>
-        <w:t>dokumentasi</w:t>
-      </w:r>
-      <w:proofErr w:type="spellEnd"/>
-      <w:r>
-        <w:t xml:space="preserve"> </w:t>
-      </w:r>
-      <w:proofErr w:type="spellStart"/>
-      <w:r>
-        <w:t>foto</w:t>
-      </w:r>
-      <w:proofErr w:type="spellEnd"/>
-      <w:r>
-        <w:t xml:space="preserve"> </w:t>
-      </w:r>
-      <w:proofErr w:type="spellStart"/>
-      <w:r>
-        <w:t>sebelum</w:t>
-      </w:r>
-      <w:proofErr w:type="spellEnd"/>
-      <w:r>
-        <w:t xml:space="preserve">, </w:t>
-      </w:r>
-      <w:proofErr w:type="spellStart"/>
-      <w:r>
-        <w:t>selama</w:t>
-      </w:r>
-      <w:proofErr w:type="spellEnd"/>
-      <w:r>
-        <w:t xml:space="preserve">, dan </w:t>
-      </w:r>
-      <w:proofErr w:type="spellStart"/>
-      <w:r>
-        <w:t>sesudah</w:t>
-      </w:r>
-      <w:proofErr w:type="spellEnd"/>
-      <w:r>
-        <w:t xml:space="preserve"> </w:t>
-      </w:r>
-      <w:proofErr w:type="spellStart"/>
-      <w:r>
-        <w:t>pekerjaan</w:t>
-      </w:r>
-      <w:proofErr w:type="spellEnd"/>
-      <w:r>
-        <w:t xml:space="preserve">, </w:t>
-      </w:r>
-      <w:proofErr w:type="spellStart"/>
-      <w:r>
-        <w:t>rekap</w:t>
-      </w:r>
-      <w:proofErr w:type="spellEnd"/>
-      <w:r>
-        <w:t xml:space="preserve"> </w:t>
-      </w:r>
-      <w:proofErr w:type="spellStart"/>
-      <w:r>
-        <w:t>penggunaan</w:t>
-      </w:r>
-      <w:proofErr w:type="spellEnd"/>
-      <w:r>
-        <w:t xml:space="preserve"> </w:t>
-      </w:r>
-      <w:proofErr w:type="spellStart"/>
-      <w:r>
-        <w:t>bahan</w:t>
-      </w:r>
-      <w:proofErr w:type="spellEnd"/>
-      <w:r>
-        <w:t xml:space="preserve">/material, </w:t>
-      </w:r>
-      <w:proofErr w:type="spellStart"/>
-      <w:r>
-        <w:t>serta</w:t>
-      </w:r>
-      <w:proofErr w:type="spellEnd"/>
-      <w:r>
-        <w:t xml:space="preserve"> </w:t>
-      </w:r>
-      <w:proofErr w:type="spellStart"/>
-      <w:r>
-        <w:t>dokumen</w:t>
-      </w:r>
-      <w:proofErr w:type="spellEnd"/>
-      <w:r>
-        <w:t xml:space="preserve"> </w:t>
-      </w:r>
-      <w:proofErr w:type="spellStart"/>
-      <w:r>
-        <w:t>pendukung</w:t>
-      </w:r>
-      <w:proofErr w:type="spellEnd"/>
-      <w:r>
-        <w:t xml:space="preserve"> </w:t>
-      </w:r>
-      <w:proofErr w:type="spellStart"/>
-      <w:r>
-        <w:t>lainnya</w:t>
-      </w:r>
-      <w:proofErr w:type="spellEnd"/>
-      <w:r>
-        <w:t>.</w:t>
-      </w:r>
-    </w:p>
-    <w:p>
-      <w:pPr>
-        <w:tabs>
-          <w:tab w:val="left" w:pos="2160"/>
-        </w:tabs>
-      </w:pPr>
-      <w:r>
-        <w:t xml:space="preserve">3. Tim </w:t>
-      </w:r>
-      <w:proofErr w:type="spellStart"/>
-      <w:r>
-        <w:t>Pengawas</w:t>
-      </w:r>
-      <w:proofErr w:type="spellEnd"/>
-      <w:r>
-        <w:t xml:space="preserve"> </w:t>
-      </w:r>
-      <w:proofErr w:type="spellStart"/>
-      <w:r>
-        <w:t>melakukan</w:t>
-      </w:r>
-      <w:proofErr w:type="spellEnd"/>
-      <w:r>
-        <w:t xml:space="preserve"> </w:t>
-      </w:r>
-      <w:proofErr w:type="spellStart"/>
-      <w:r>
-        <w:t>pengawasan</w:t>
-      </w:r>
-      <w:proofErr w:type="spellEnd"/>
-      <w:r>
-        <w:t xml:space="preserve"> </w:t>
-      </w:r>
-      <w:proofErr w:type="spellStart"/>
-      <w:r>
-        <w:t>administrasi</w:t>
-      </w:r>
-      <w:proofErr w:type="spellEnd"/>
-      <w:r>
-        <w:t xml:space="preserve">, </w:t>
-      </w:r>
-      <w:proofErr w:type="spellStart"/>
-      <w:r>
-        <w:t>teknis</w:t>
-      </w:r>
-      <w:proofErr w:type="spellEnd"/>
-      <w:r>
-        <w:t xml:space="preserve">, </w:t>
-      </w:r>
-      <w:proofErr w:type="spellStart"/>
-      <w:r>
-        <w:t>serta</w:t>
-      </w:r>
-      <w:proofErr w:type="spellEnd"/>
-      <w:r>
-        <w:t xml:space="preserve"> </w:t>
-      </w:r>
-      <w:proofErr w:type="spellStart"/>
-      <w:r>
-        <w:t>menyusun</w:t>
-      </w:r>
-      <w:proofErr w:type="spellEnd"/>
-      <w:r>
-        <w:t xml:space="preserve"> Berita Acara Hasil </w:t>
-      </w:r>
-      <w:proofErr w:type="spellStart"/>
-      <w:r>
-        <w:t>Pemeriksaan</w:t>
-      </w:r>
-      <w:proofErr w:type="spellEnd"/>
-      <w:r>
-        <w:t>.</w:t>
-      </w:r>
-    </w:p>
-    <w:p>
-      <w:pPr>
-        <w:tabs>
-          <w:tab w:val="left" w:pos="2160"/>
-        </w:tabs>
-      </w:pPr>
-      <w:r>
-        <w:t xml:space="preserve">4. </w:t>
-      </w:r>
-      <w:proofErr w:type="spellStart"/>
-      <w:r>
-        <w:t>Setelah</w:t>
-      </w:r>
-      <w:proofErr w:type="spellEnd"/>
-      <w:r>
-        <w:t xml:space="preserve"> </w:t>
-      </w:r>
-      <w:proofErr w:type="spellStart"/>
-      <w:r>
-        <w:t>hasil</w:t>
-      </w:r>
-      <w:proofErr w:type="spellEnd"/>
-      <w:r>
-        <w:t xml:space="preserve"> </w:t>
-      </w:r>
-      <w:proofErr w:type="spellStart"/>
-      <w:r>
-        <w:t>pekerjaan</w:t>
-      </w:r>
-      <w:proofErr w:type="spellEnd"/>
-      <w:r>
-        <w:t xml:space="preserve"> </w:t>
-      </w:r>
-      <w:proofErr w:type="spellStart"/>
-      <w:r>
-        <w:t>dinyatakan</w:t>
-      </w:r>
-      <w:proofErr w:type="spellEnd"/>
-      <w:r>
-        <w:t xml:space="preserve"> </w:t>
-      </w:r>
-      <w:proofErr w:type="spellStart"/>
-      <w:r>
-        <w:t>sesuai</w:t>
-      </w:r>
-      <w:proofErr w:type="spellEnd"/>
-      <w:r>
-        <w:t xml:space="preserve"> </w:t>
-      </w:r>
-      <w:proofErr w:type="spellStart"/>
-      <w:r>
-        <w:t>berdasarkan</w:t>
-      </w:r>
-      <w:proofErr w:type="spellEnd"/>
-      <w:r>
-        <w:t xml:space="preserve"> </w:t>
-      </w:r>
-      <w:proofErr w:type="spellStart"/>
-      <w:r>
-        <w:t>pemeriksaan</w:t>
-      </w:r>
-      <w:proofErr w:type="spellEnd"/>
-      <w:r>
-        <w:t xml:space="preserve"> Tim Pengawas, Tim Pelaksana </w:t>
-      </w:r>
-      <w:proofErr w:type="spellStart"/>
-      <w:r>
-        <w:t>menyerahkan</w:t>
-      </w:r>
-      <w:proofErr w:type="spellEnd"/>
-      <w:r>
-        <w:t xml:space="preserve"> </w:t>
-      </w:r>
-      <w:proofErr w:type="spellStart"/>
-      <w:r>
-        <w:t>hasil</w:t>
-      </w:r>
-      <w:proofErr w:type="spellEnd"/>
-      <w:r>
-        <w:t xml:space="preserve"> </w:t>
-      </w:r>
-      <w:proofErr w:type="spellStart"/>
-      <w:r>
-        <w:t>pekerjaan</w:t>
-      </w:r>
-      <w:proofErr w:type="spellEnd"/>
-      <w:r>
-        <w:t xml:space="preserve"> dan </w:t>
-      </w:r>
-      <w:proofErr w:type="spellStart"/>
-      <w:r>
-        <w:t>laporan</w:t>
-      </w:r>
-      <w:proofErr w:type="spellEnd"/>
-      <w:r>
-        <w:t xml:space="preserve"> </w:t>
-      </w:r>
-      <w:proofErr w:type="spellStart"/>
-      <w:r>
-        <w:t>pelaksanaan</w:t>
-      </w:r>
-      <w:proofErr w:type="spellEnd"/>
-      <w:r>
-        <w:t xml:space="preserve"> </w:t>
-      </w:r>
-      <w:proofErr w:type="spellStart"/>
-      <w:r>
-        <w:t>kepada</w:t>
-      </w:r>
-      <w:proofErr w:type="spellEnd"/>
-      <w:r>
-        <w:t xml:space="preserve"> PPK </w:t>
-      </w:r>
-      <w:proofErr w:type="spellStart"/>
-      <w:r>
-        <w:t>melalui</w:t>
-      </w:r>
-      <w:proofErr w:type="spellEnd"/>
-      <w:r>
-        <w:t xml:space="preserve"> Berita Acara Serah </w:t>
-      </w:r>
-      <w:proofErr w:type="spellStart"/>
-      <w:r>
-        <w:t>Terima</w:t>
-      </w:r>
-      <w:proofErr w:type="spellEnd"/>
-      <w:r>
-        <w:t xml:space="preserve"> Hasil </w:t>
-      </w:r>
-      <w:proofErr w:type="spellStart"/>
-      <w:r>
-        <w:t>Pekerjaan</w:t>
-      </w:r>
-      <w:proofErr w:type="spellEnd"/>
-      <w:r>
-        <w:t>.</w:t>
-      </w:r>
-    </w:p>
-    <w:p>
-      <w:pPr>
-        <w:tabs>
-          <w:tab w:val="left" w:pos="2160"/>
-        </w:tabs>
-      </w:pPr>
-      <w:r>
-        <w:rPr>
-          <w:b/>
-        </w:rPr>
-        <w:t xml:space="preserve">IV. </w:t>
-      </w:r>
-      <w:proofErr w:type="spellStart"/>
-      <w:r>
-        <w:rPr>
-          <w:b/>
-        </w:rPr>
-        <w:t>Jangka</w:t>
-      </w:r>
-      <w:proofErr w:type="spellEnd"/>
-      <w:r>
-        <w:rPr>
-          <w:b/>
-        </w:rPr>
-        <w:t xml:space="preserve"> Waktu</w:t>
-      </w:r>
-    </w:p>
-    <w:p>
-      <w:pPr>
-        <w:tabs>
-          <w:tab w:val="left" w:pos="2160"/>
-        </w:tabs>
-      </w:pPr>
-      <w:proofErr w:type="spellStart"/>
-      <w:r>
-        <w:t>Pekerjaan</w:t>
-      </w:r>
-      <w:proofErr w:type="spellEnd"/>
-      <w:r>
-        <w:t xml:space="preserve"> </w:t>
-      </w:r>
-      <w:proofErr w:type="spellStart"/>
-      <w:r>
-        <w:t>dilaksanakan</w:t>
-      </w:r>
-      <w:proofErr w:type="spellEnd"/>
-      <w:r>
-        <w:t xml:space="preserve"> </w:t>
-      </w:r>
-      <w:proofErr w:type="spellStart"/>
-      <w:r>
-        <w:t>sejak</w:t>
-      </w:r>
-      <w:proofErr w:type="spellEnd"/>
-      <w:r>
-        <w:t xml:space="preserve"> </w:t>
-      </w:r>
-      <w:proofErr w:type="spellStart"/>
-      <w:r>
-        <w:t>tanggal</w:t>
-      </w:r>
-      <w:proofErr w:type="spellEnd"/>
-      <w:r>
-        <w:t xml:space="preserve"> [TANGGAL MULAI] </w:t>
-      </w:r>
-      <w:proofErr w:type="spellStart"/>
-      <w:r>
-        <w:t>sampai</w:t>
-      </w:r>
-      <w:proofErr w:type="spellEnd"/>
-      <w:r>
-        <w:t xml:space="preserve"> </w:t>
-      </w:r>
-      <w:proofErr w:type="spellStart"/>
-      <w:r>
-        <w:t>dengan</w:t>
-      </w:r>
-      <w:proofErr w:type="spellEnd"/>
-      <w:r>
-        <w:t xml:space="preserve"> [TANGGAL SELESAI] dan </w:t>
-      </w:r>
-      <w:proofErr w:type="spellStart"/>
-      <w:r>
-        <w:t>tidak</w:t>
-      </w:r>
-      <w:proofErr w:type="spellEnd"/>
-      <w:r>
-        <w:t xml:space="preserve"> </w:t>
-      </w:r>
-      <w:proofErr w:type="spellStart"/>
-      <w:r>
-        <w:t>melampaui</w:t>
-      </w:r>
-      <w:proofErr w:type="spellEnd"/>
-      <w:r>
-        <w:t xml:space="preserve"> </w:t>
-      </w:r>
-      <w:proofErr w:type="spellStart"/>
-      <w:r>
-        <w:t>Tahun</w:t>
-      </w:r>
-      <w:proofErr w:type="spellEnd"/>
-      <w:r>
-        <w:t xml:space="preserve"> </w:t>
-      </w:r>
-      <w:proofErr w:type="spellStart"/>
-      <w:r>
-        <w:t>Anggaran</w:t>
-      </w:r>
-      <w:proofErr w:type="spellEnd"/>
-      <w:r>
-        <w:t xml:space="preserve"> 2026, </w:t>
-      </w:r>
-      <w:proofErr w:type="spellStart"/>
-      <w:r>
-        <w:t>sesuai</w:t>
-      </w:r>
-      <w:proofErr w:type="spellEnd"/>
-      <w:r>
-        <w:t xml:space="preserve"> </w:t>
-      </w:r>
-      <w:proofErr w:type="spellStart"/>
-      <w:r>
-        <w:t>jadwal</w:t>
-      </w:r>
-      <w:proofErr w:type="spellEnd"/>
-      <w:r>
-        <w:t xml:space="preserve"> </w:t>
-      </w:r>
-      <w:proofErr w:type="spellStart"/>
-      <w:r>
-        <w:t>pelaksanaan</w:t>
-      </w:r>
-      <w:proofErr w:type="spellEnd"/>
-      <w:r>
-        <w:t xml:space="preserve"> yang </w:t>
-      </w:r>
-      <w:proofErr w:type="spellStart"/>
-      <w:r>
-        <w:t>ditetapkan</w:t>
-      </w:r>
-      <w:proofErr w:type="spellEnd"/>
-      <w:r>
-        <w:t>.</w:t>
-      </w:r>
-    </w:p>
-    <w:p>
-      <w:pPr>
-        <w:tabs>
-          <w:tab w:val="left" w:pos="2160"/>
-        </w:tabs>
-      </w:pPr>
-      <w:r>
-        <w:t xml:space="preserve">Surat </w:t>
-      </w:r>
-      <w:proofErr w:type="spellStart"/>
-      <w:r>
-        <w:t>Perintah</w:t>
-      </w:r>
-      <w:proofErr w:type="spellEnd"/>
-      <w:r>
-        <w:t xml:space="preserve"> </w:t>
-      </w:r>
-      <w:proofErr w:type="spellStart"/>
-      <w:r>
-        <w:t>Tugas</w:t>
-      </w:r>
-      <w:proofErr w:type="spellEnd"/>
-      <w:r>
-        <w:t xml:space="preserve"> </w:t>
-      </w:r>
-      <w:proofErr w:type="spellStart"/>
-      <w:r>
-        <w:t>ini</w:t>
-      </w:r>
-      <w:proofErr w:type="spellEnd"/>
-      <w:r>
-        <w:t xml:space="preserve"> agar </w:t>
-      </w:r>
-      <w:proofErr w:type="spellStart"/>
-      <w:r>
-        <w:t>dilaksanakan</w:t>
-      </w:r>
-      <w:proofErr w:type="spellEnd"/>
-      <w:r>
-        <w:t xml:space="preserve"> </w:t>
-      </w:r>
-      <w:proofErr w:type="spellStart"/>
-      <w:r>
-        <w:t>dengan</w:t>
-      </w:r>
-      <w:proofErr w:type="spellEnd"/>
-      <w:r>
-        <w:t xml:space="preserve"> </w:t>
-      </w:r>
-      <w:proofErr w:type="spellStart"/>
-      <w:r>
-        <w:t>sebaik-baiknya</w:t>
-      </w:r>
-      <w:proofErr w:type="spellEnd"/>
-      <w:r>
-        <w:t xml:space="preserve">, </w:t>
-      </w:r>
-      <w:proofErr w:type="spellStart"/>
-      <w:r>
-        <w:t>penuh</w:t>
-      </w:r>
-      <w:proofErr w:type="spellEnd"/>
-      <w:r>
-        <w:t xml:space="preserve"> </w:t>
-      </w:r>
-      <w:proofErr w:type="spellStart"/>
-      <w:r>
-        <w:t>tanggung</w:t>
-      </w:r>
-      <w:proofErr w:type="spellEnd"/>
-      <w:r>
-        <w:t xml:space="preserve"> </w:t>
-      </w:r>
-      <w:proofErr w:type="spellStart"/>
-      <w:r>
-        <w:t>jawab</w:t>
-      </w:r>
-      <w:proofErr w:type="spellEnd"/>
-      <w:r>
-        <w:t xml:space="preserve">, </w:t>
-      </w:r>
-      <w:proofErr w:type="spellStart"/>
-      <w:r>
-        <w:t>tertib</w:t>
-      </w:r>
-      <w:proofErr w:type="spellEnd"/>
-      <w:r>
-        <w:t xml:space="preserve"> </w:t>
-      </w:r>
-      <w:proofErr w:type="spellStart"/>
-      <w:r>
-        <w:t>administrasi</w:t>
-      </w:r>
-      <w:proofErr w:type="spellEnd"/>
-      <w:r>
-        <w:t xml:space="preserve">, dan </w:t>
-      </w:r>
-      <w:proofErr w:type="spellStart"/>
-      <w:r>
-        <w:t>sesuai</w:t>
-      </w:r>
-      <w:proofErr w:type="spellEnd"/>
-      <w:r>
-        <w:t xml:space="preserve"> </w:t>
-      </w:r>
-      <w:proofErr w:type="spellStart"/>
-      <w:r>
-        <w:t>ketentuan</w:t>
-      </w:r>
-      <w:proofErr w:type="spellEnd"/>
-      <w:r>
-        <w:t xml:space="preserve"> </w:t>
-      </w:r>
-      <w:proofErr w:type="spellStart"/>
-      <w:r>
-        <w:t>peraturan</w:t>
-      </w:r>
-      <w:proofErr w:type="spellEnd"/>
-      <w:r>
-        <w:t xml:space="preserve"> </w:t>
-      </w:r>
-      <w:proofErr w:type="spellStart"/>
-      <w:r>
-        <w:t>perundang-undangan</w:t>
-      </w:r>
-      <w:proofErr w:type="spellEnd"/>
-      <w:r>
-        <w:t>.</w:t>
-      </w:r>
-    </w:p>
-    <w:tbl>
-      <w:tblPr>
-        <w:tblW w:w="0" w:type="auto"/>
-        <w:tblLayout w:type="fixed"/>
-        <w:tblLook w:val="04A0" w:firstRow="1" w:lastRow="0" w:firstColumn="1" w:lastColumn="0" w:noHBand="0" w:noVBand="1"/>
-      </w:tblPr>
-      <w:tblGrid>
-        <w:gridCol w:w="4320"/>
-        <w:gridCol w:w="4320"/>
-      </w:tblGrid>
-      <w:tr>
-        <w:tc>
-          <w:tcPr>
-            <w:tcW w:w="4320" w:type="dxa"/>
-            <w:hideMark/>
-          </w:tcPr>
-          <w:p>
-            <w:pPr>
-              <w:tabs>
-                <w:tab w:val="left" w:pos="2160"/>
-              </w:tabs>
-            </w:pPr>
-          </w:p>
-          <w:p>
-            <w:pPr>
-              <w:tabs>
-                <w:tab w:val="left" w:pos="2160"/>
-              </w:tabs>
-            </w:pPr>
-            <w:r>
-              <w:br/>
-            </w:r>
-            <w:r>
-              <w:t>PENERIMA PERINTAH</w:t>
-            </w:r>
-            <w:r>
-              <w:br/>
-            </w:r>
-            <w:proofErr w:type="spellStart"/>
-            <w:r>
-              <w:t>Ketua</w:t>
-            </w:r>
-            <w:proofErr w:type="spellEnd"/>
-            <w:r>
-              <w:t>/</w:t>
-            </w:r>
-            <w:proofErr w:type="spellStart"/>
-            <w:r>
-              <w:t>Koordinator</w:t>
-            </w:r>
-            <w:proofErr w:type="spellEnd"/>
-            <w:r>
-              <w:t xml:space="preserve"> Tim Pelaksana</w:t>
-            </w:r>
-            <w:r>
-              <w:br/>
-            </w:r>
-            <w:r>
-              <w:br/>
-            </w:r>
-            <w:r>
-              <w:br/>
-            </w:r>
-          </w:p>
-          <w:p>
-            <w:pPr>
-              <w:tabs>
-                <w:tab w:val="left" w:pos="2160"/>
-              </w:tabs>
-            </w:pPr>
-          </w:p>
-          <w:p>
-            <w:pPr>
-              <w:jc w:val="center"/>
-            </w:pPr>
-            <w:r>
-              <w:br/>
-            </w:r>
-            <w:r>
-              <w:rPr>
-                <w:b/>
-              </w:rPr>
-              <w:t>[NAMA]</w:t>
-            </w:r>
-            <w:r>
-              <w:rPr>
-                <w:b/>
-              </w:rPr>
-              <w:br/>
-            </w:r>
-            <w:r>
-              <w:t>NIP [NIP]</w:t>
-            </w:r>
-          </w:p>
-        </w:tc>
-        <w:tc>
-          <w:tcPr>
-            <w:tcW w:w="4320" w:type="dxa"/>
-            <w:hideMark/>
-          </w:tcPr>
-          <w:p>
-            <w:pPr>
-              <w:tabs>
-                <w:tab w:val="left" w:pos="2160"/>
-              </w:tabs>
-            </w:pPr>
-            <w:r>
-              <w:t xml:space="preserve">                   </w:t>
-            </w:r>
-            <w:proofErr w:type="spellStart"/>
-            <w:r>
-              <w:t>Dikeluarkan</w:t>
-            </w:r>
-            <w:proofErr w:type="spellEnd"/>
-            <w:r>
-              <w:t xml:space="preserve"> di Jakarta</w:t>
-            </w:r>
-            <w:r>
-              <w:br/>
-            </w:r>
-            <w:r>
-              <w:t xml:space="preserve">                </w:t>
-            </w:r>
-            <w:r>
-              <w:t xml:space="preserve">pada </w:t>
-            </w:r>
-            <w:proofErr w:type="spellStart"/>
-            <w:r>
-              <w:t>tanggal</w:t>
-            </w:r>
-            <w:proofErr w:type="spellEnd"/>
-            <w:r>
-              <w:t xml:space="preserve"> [TANGGAL]</w:t>
-            </w:r>
-            <w:r>
-              <w:br/>
-            </w:r>
-            <w:r>
-              <w:t xml:space="preserve">                    </w:t>
-            </w:r>
-            <w:r>
-              <w:t>PEMBERI PERINTAH</w:t>
-            </w:r>
-            <w:r>
-              <w:br/>
-            </w:r>
-            <w:r>
-              <w:t xml:space="preserve">             </w:t>
-            </w:r>
-            <w:proofErr w:type="spellStart"/>
-            <w:r>
-              <w:t>Kepala</w:t>
-            </w:r>
-            <w:proofErr w:type="spellEnd"/>
-            <w:r>
-              <w:t xml:space="preserve"> Suku Dinas Sumber Daya Air</w:t>
-            </w:r>
-            <w:r>
-              <w:br/>
-            </w:r>
-            <w:r>
-              <w:t xml:space="preserve">                 </w:t>
-            </w:r>
-            <w:proofErr w:type="spellStart"/>
-            <w:r>
-              <w:t>Kota Administrasi</w:t>
-            </w:r>
-            <w:proofErr w:type="spellEnd"/>
-            <w:r>
-              <w:t xml:space="preserve"> Jakarta Utara</w:t>
-            </w:r>
-            <w:r>
-              <w:br/>
-            </w:r>
-            <w:r>
-              <w:t xml:space="preserve">                            </w:t>
-            </w:r>
-            <w:proofErr w:type="spellStart"/>
-            <w:r>
-              <w:t>selaku</w:t>
-            </w:r>
-            <w:proofErr w:type="spellEnd"/>
-            <w:r>
-              <w:t xml:space="preserve"> KPA</w:t>
-            </w:r>
-            <w:r>
-              <w:br/>
-            </w:r>
-            <w:r>
-              <w:br/>
-            </w:r>
-          </w:p>
-          <w:p>
-            <w:pPr>
-              <w:tabs>
-                <w:tab w:val="left" w:pos="2160"/>
-              </w:tabs>
-            </w:pPr>
-          </w:p>
-          <w:p>
-            <w:pPr>
-              <w:jc w:val="center"/>
-            </w:pPr>
-            <w:r>
-              <w:br/>
-            </w:r>
-            <w:r>
-              <w:rPr>
-                <w:b/>
-              </w:rPr>
-              <w:t>Heria Suwandi</w:t>
-            </w:r>
-            <w:r>
-              <w:rPr>
-                <w:b/>
-              </w:rPr>
-              <w:br/>
-            </w:r>
-            <w:r>
-              <w:t>NIP 197101272006041009</w:t>
-            </w:r>
-          </w:p>
-        </w:tc>
-      </w:tr>
-    </w:tbl>
-    <w:p>
-      <w:pPr>
-        <w:tabs>
-          <w:tab w:val="left" w:pos="2160"/>
-        </w:tabs>
-      </w:pPr>
-    </w:p>
-    <w:p>
-      <w:pPr>
-        <w:tabs>
-          <w:tab w:val="left" w:pos="2160"/>
-        </w:tabs>
-      </w:pPr>
-    </w:p>
-    <w:sectPr>
-      <w:pgSz w:w="12240" w:h="15840"/>
-      <w:pgMar w:top="1440" w:right="1800" w:bottom="1440" w:left="1800" w:header="720" w:footer="720" w:gutter="0"/>
-      <w:cols w:space="720"/>
-      <w:docGrid w:linePitch="360"/>
-    </w:sectPr>
-  </w:body>
-</w:document>
+<file path=word/document.xml><?xml version="1.0" encoding="UTF-8" standalone="yes"?>
+<w:document xmlns:wpc="http://schemas.microsoft.com/office/word/2010/wordprocessingCanvas" xmlns:cx="http://schemas.microsoft.com/office/drawing/2014/chartex" xmlns:cx1="http://schemas.microsoft.com/office/drawing/2015/9/8/chartex" xmlns:cx2="http://schemas.microsoft.com/office/drawing/2015/10/21/chartex" xmlns:cx3="http://schemas.microsoft.com/office/drawing/2016/5/9/chartex" xmlns:cx4="http://schemas.microsoft.com/office/drawing/2016/5/10/chartex" xmlns:cx5="http://schemas.microsoft.com/office/drawing/2016/5/11/chartex" xmlns:cx6="http://schemas.microsoft.com/office/drawing/2016/5/12/chartex" xmlns:cx7="http://schemas.microsoft.com/office/drawing/2016/5/13/chartex" xmlns:cx8="http://schemas.microsoft.com/office/drawing/2016/5/14/chartex" xmlns:mc="http://schemas.openxmlformats.org/markup-compatibility/2006" xmlns:aink="http://schemas.microsoft.com/office/drawing/2016/ink" xmlns:am3d="http://schemas.microsoft.com/office/drawing/2017/model3d" xmlns:o="urn:schemas-microsoft-com:office:office" xmlns:oel="http://schemas.microsoft.com/office/2019/extlst" xmlns:r="http://schemas.openxmlformats.org/officeDocument/2006/relationships" xmlns:m="http://schemas.openxmlformats.org/officeDocument/2006/math" xmlns:v="urn:schemas-microsoft-com:vml" xmlns:wp14="http://schemas.microsoft.com/office/word/2010/wordprocessingDrawing" xmlns:wp="http://schemas.openxmlformats.org/drawingml/2006/wordprocessingDrawing" xmlns:w10="urn:schemas-microsoft-com:office:word" xmlns:w="http://schemas.openxmlformats.org/wordprocessingml/2006/main" xmlns:w14="http://schemas.microsoft.com/office/word/2010/wordml" xmlns:w15="http://schemas.microsoft.com/office/word/2012/wordml" xmlns:w16cex="http://schemas.microsoft.com/office/word/2018/wordml/cex" xmlns:w16cid="http://schemas.microsoft.com/office/word/2016/wordml/cid" xmlns:w16="http://schemas.microsoft.com/office/word/2018/wordml" xmlns:w16du="http://schemas.microsoft.com/office/word/2023/wordml/word16du" xmlns:w16sdtdh="http://schemas.microsoft.com/office/word/2020/wordml/sdtdatahash" xmlns:w16sdtfl="http://schemas.microsoft.com/office/word/2024/wordml/sdtformatlock" xmlns:w16se="http://schemas.microsoft.com/office/word/2015/wordml/symex" xmlns:wpg="http://schemas.microsoft.com/office/word/2010/wordprocessingGroup" xmlns:wpi="http://schemas.microsoft.com/office/word/2010/wordprocessingInk" xmlns:wne="http://schemas.microsoft.com/office/word/2006/wordml" xmlns:wps="http://schemas.microsoft.com/office/word/2010/wordprocessingShape" mc:Ignorable="w14 w15 w16se w16cid w16 w16cex w16sdtdh w16sdtfl w16du wp14"><w:body><w:p><w:pPr><w:jc w:val="center"/><w:rPr><w:b/><w:sz w:val="24"/></w:rPr></w:pPr><w:r><w:rPr><w:b/><w:noProof/><w:sz w:val="24"/></w:rPr><w:drawing><wp:anchor distT="0" distB="0" distL="114300" distR="114300" simplePos="0" relativeHeight="251658240" behindDoc="1" locked="0" layoutInCell="1" allowOverlap="1" wp14:anchorId="72F445D8" wp14:editId="15BE4D3D"><wp:simplePos x="0" y="0"/><wp:positionH relativeFrom="margin"><wp:posOffset>2146301</wp:posOffset></wp:positionH><wp:positionV relativeFrom="paragraph"><wp:posOffset>-558800</wp:posOffset></wp:positionV><wp:extent cx="965200" cy="1276350"/><wp:effectExtent l="0" t="0" r="6350" b="0"/><wp:wrapNone/><wp:docPr id="837020129" name="Picture 1"/><wp:cNvGraphicFramePr><a:graphicFrameLocks xmlns:a="http://schemas.openxmlformats.org/drawingml/2006/main" noChangeAspect="1"/></wp:cNvGraphicFramePr><a:graphic xmlns:a="http://schemas.openxmlformats.org/drawingml/2006/main"><a:graphicData uri="http://schemas.openxmlformats.org/drawingml/2006/picture"><pic:pic xmlns:pic="http://schemas.openxmlformats.org/drawingml/2006/picture"><pic:nvPicPr><pic:cNvPr id="837020129" name="Picture 837020129"/><pic:cNvPicPr/></pic:nvPicPr><pic:blipFill><a:blip r:embed="rId6"/><a:stretch><a:fillRect/></a:stretch></pic:blipFill><pic:spPr><a:xfrm><a:off x="0" y="0"/><a:ext cx="965200" cy="1276350"/></a:xfrm><a:prstGeom prst="rect"><a:avLst/></a:prstGeom></pic:spPr></pic:pic></a:graphicData></a:graphic><wp14:sizeRelH relativeFrom="margin"><wp14:pctWidth>0</wp14:pctWidth></wp14:sizeRelH></wp:anchor></w:drawing></w:r></w:p><w:p><w:pPr><w:jc w:val="center"/><w:rPr><w:b/><w:sz w:val="24"/></w:rPr></w:pPr></w:p><w:p><w:pPr><w:jc w:val="center"/></w:pPr><w:r><w:rPr><w:b/><w:sz w:val="24"/></w:rPr><w:t>SUKU DINAS SUMBER DAYA AIR</w:t></w:r><w:r><w:rPr><w:b/><w:sz w:val="24"/></w:rPr><w:br/><w:t>PEMERINTAH KOTA ADMINISTRASI JAKARTA UTARA</w:t></w:r><w:r><w:rPr><w:b/><w:sz w:val="24"/></w:rPr><w:br/></w:r></w:p><w:p><w:pPr><w:jc w:val="center"/></w:pPr><w:r><w:rPr><w:b/></w:rPr><w:t>SURAT PERINTAH TUGAS</w:t></w:r><w:r><w:rPr><w:b/></w:rPr><w:br/><w:t>NOMOR: [NOMOR SPT]</w:t></w:r><w:r><w:rPr><w:b/></w:rPr><w:br/><w:t>TENTANG</w:t></w:r><w:r><w:rPr><w:b/></w:rPr><w:br/><w:t>PELAKSANAAN SWAKELOLA TIPE I [NAMA PEKERJAAN] TAHUN ANGGARAN 2026</w:t></w:r></w:p><w:p><w:r><w:t>Berdasarkan:</w:t></w:r></w:p><w:p><w:pPr><w:ind w:left="360" w:hanging="360"/></w:pPr><w:r><w:t>1. Peraturan Presiden Nomor 16 Tahun 2018 tentang Pengadaan Barang/Jasa Pemerintah sebagaimana telah beberapa kali diubah, terakhir dengan Peraturan Presiden Nomor 46 Tahun 2025 tentang Perubahan Kedua atas Peraturan Presiden Nomor 16 Tahun 2018 tentang Pengadaan Barang/Jasa Pemerintah;</w:t></w:r></w:p><w:p><w:pPr><w:ind w:left="360" w:hanging="360"/></w:pPr><w:r><w:t>2. Peraturan Lembaga Kebijakan Pengadaan Barang/Jasa Pemerintah Nomor 3 Tahun 2021 tentang Pedoman Swakelola;</w:t></w:r></w:p><w:p><w:pPr><w:ind w:left="360" w:hanging="360"/></w:pPr><w:r><w:t>3. Peraturan Daerah Provinsi DKI Jakarta Nomor 4 Tahun 2025 tentang Anggaran Pendapatan dan Belanja Daerah Tahun Anggaran 2026;</w:t></w:r></w:p><w:p><w:pPr><w:ind w:left="360" w:hanging="360"/></w:pPr><w:r><w:t>4. Dokumen Pelaksanaan Anggaran Satuan Kerja Perangkat Daerah (DPA-SKPD) Suku Dinas Sumber Daya Air Kota Administrasi Jakarta Utara Tahun Anggaran 2026 Nomor [NOMOR DPA] tanggal [TANGGAL DPA];</w:t></w:r></w:p><w:p><w:pPr><w:ind w:left="360" w:hanging="360"/></w:pPr><w:r><w:t>5. Keputusan Kepala Dinas Sumber Daya Air Provinsi DKI Jakarta Nomor 1445 Tahun 2026 tentang Pelimpahan Sebagian Kewenangan Pengguna Anggaran kepada Kuasa Pengguna Anggaran pada Dinas Sumber Daya Air Provinsi DKI Jakarta Tahun Anggaran 2026.</w:t></w:r></w:p><w:p><w:r><w:t>maka Kepala Suku Dinas Sumber Daya Air Kota Administrasi Jakarta Utara selaku Kuasa Pengguna Anggaran dengan ini:</w:t></w:r></w:p><w:p><w:pPr><w:jc w:val="center"/></w:pPr><w:r><w:rPr><w:b/></w:rPr><w:t>MEMERINTAHKAN:</w:t></w:r></w:p><w:p><w:pPr><w:tabs><w:tab w:val="left" w:pos="2160"/></w:tabs></w:pPr><w:r><w:t>Kepada</w:t></w:r><w:r><w:tab/><w:t>:</w:t></w:r><w:r><w:br/><w:t>Nama</w:t></w:r><w:r><w:tab/><w:t>: [NAMA PENERIMA PERINTAH]</w:t></w:r><w:r><w:br/><w:t>NIP/NRK</w:t></w:r><w:r><w:tab/><w:t>: [NIP/NRK]</w:t></w:r></w:p><w:p><w:pPr><w:tabs><w:tab w:val="left" w:pos="2520"/></w:tabs><w:spacing w:after="0" w:line="240" w:lineRule="auto"/></w:pPr><w:proofErr w:type="spellStart"/><w:r><w:lastRenderedPageBreak/><w:t>Jabatan</w:t></w:r><w:proofErr w:type="spellEnd"/><w:r><w:tab/><w:t xml:space="preserve">: [KEPALA SATUAN PELAKSANA KECAMATAN ... / KEPALA </w:t></w:r></w:p><w:p><w:pPr><w:tabs><w:tab w:val="left" w:pos="2520"/></w:tabs><w:spacing w:after="0" w:line="240" w:lineRule="auto"/></w:pPr><w:r><w:tab/><w:t xml:space="preserve">   </w:t></w:r><w:r><w:t>SEKSI PEMELIHARAAN DRAINASE]</w:t></w:r><w:r><w:br/></w:r><w:proofErr w:type="spellStart"/><w:r><w:t>Kedudukan</w:t></w:r><w:proofErr w:type="spellEnd"/><w:r><w:tab/><w:t xml:space="preserve">: </w:t></w:r><w:proofErr w:type="spellStart"/><w:r><w:t>Ketua</w:t></w:r><w:proofErr w:type="spellEnd"/><w:r><w:t>/</w:t></w:r><w:proofErr w:type="spellStart"/><w:r><w:t>Koordinator</w:t></w:r><w:proofErr w:type="spellEnd"/><w:r><w:t xml:space="preserve"> Tim Pelaksana Swakelola </w:t></w:r><w:proofErr w:type="spellStart"/><w:r><w:t>Tipe</w:t></w:r><w:proofErr w:type="spellEnd"/><w:r><w:t xml:space="preserve"> I</w:t></w:r><w:r><w:br/></w:r></w:p><w:p><w:proofErr w:type="spellStart"/><w:r><w:t>Untuk</w:t></w:r><w:proofErr w:type="spellEnd"/><w:r><w:t xml:space="preserve"> </w:t></w:r><w:proofErr w:type="spellStart"/><w:r><w:t>melaksanakan</w:t></w:r><w:proofErr w:type="spellEnd"/><w:r><w:t xml:space="preserve"> </w:t></w:r><w:proofErr w:type="spellStart"/><w:r><w:t>pekerjaan</w:t></w:r><w:proofErr w:type="spellEnd"/><w:r><w:t xml:space="preserve"> </w:t></w:r><w:proofErr w:type="spellStart"/><w:r><w:t>Swakelola</w:t></w:r><w:proofErr w:type="spellEnd"/><w:r><w:t xml:space="preserve"> </w:t></w:r><w:proofErr w:type="spellStart"/><w:r><w:t>Tipe</w:t></w:r><w:proofErr w:type="spellEnd"/><w:r><w:t xml:space="preserve"> I </w:t></w:r><w:proofErr w:type="spellStart"/><w:r><w:t>dengan</w:t></w:r><w:proofErr w:type="spellEnd"/><w:r><w:t xml:space="preserve"> data </w:t></w:r><w:proofErr w:type="spellStart"/><w:r><w:t>sebagai</w:t></w:r><w:proofErr w:type="spellEnd"/><w:r><w:t xml:space="preserve"> </w:t></w:r><w:proofErr w:type="spellStart"/><w:r><w:t>berikut</w:t></w:r><w:proofErr w:type="spellEnd"/><w:r><w:t>:</w:t></w:r></w:p><w:p><w:pPr><w:tabs><w:tab w:val="left" w:pos="2520"/></w:tabs></w:pPr><w:r><w:t>Nama Program</w:t></w:r><w:r><w:tab/><w:t>: [SESUAI DPA]</w:t></w:r><w:r><w:br/><w:t xml:space="preserve">Nama </w:t></w:r><w:proofErr w:type="spellStart"/><w:r><w:t>Kegiatan</w:t></w:r><w:proofErr w:type="spellEnd"/><w:r><w:tab/><w:t>: [SESUAI DPA]</w:t></w:r><w:r><w:br/><w:t xml:space="preserve">Nama </w:t></w:r><w:proofErr w:type="spellStart"/><w:r><w:t>Subkegiatan</w:t></w:r><w:proofErr w:type="spellEnd"/><w:r><w:tab/><w:t>: [SESUAI DPA]</w:t></w:r><w:r><w:br/></w:r><w:proofErr w:type="spellStart"/><w:r><w:t>Nomor</w:t></w:r><w:proofErr w:type="spellEnd"/><w:r><w:t xml:space="preserve">/Kode </w:t></w:r><w:proofErr w:type="spellStart"/><w:r><w:t>Kegiatan</w:t></w:r><w:proofErr w:type="spellEnd"/><w:r><w:tab/><w:t>: [SESUAI DPA]</w:t></w:r><w:r><w:br/><w:t xml:space="preserve">Kode </w:t></w:r><w:proofErr w:type="spellStart"/><w:r><w:t>Rekening</w:t></w:r><w:proofErr w:type="spellEnd"/><w:r><w:tab/><w:t>: [SESUAI DPA]</w:t></w:r><w:r><w:br/><w:t xml:space="preserve">Jenis </w:t></w:r><w:proofErr w:type="spellStart"/><w:r><w:t>Pekerjaan</w:t></w:r><w:proofErr w:type="spellEnd"/><w:r><w:tab/><w:t xml:space="preserve">: </w:t></w:r><w:proofErr w:type="spellStart"/><w:r><w:t>Perbaikan</w:t></w:r><w:proofErr w:type="spellEnd"/><w:r><w:t xml:space="preserve"> dan </w:t></w:r><w:proofErr w:type="spellStart"/><w:r><w:t>Pengurasan</w:t></w:r><w:proofErr w:type="spellEnd"/><w:r><w:t xml:space="preserve"> </w:t></w:r><w:proofErr w:type="spellStart"/><w:r><w:t>Saluran</w:t></w:r><w:proofErr w:type="spellEnd"/><w:r><w:t xml:space="preserve"> / [SESUAI PAKET]</w:t></w:r><w:r><w:br/><w:t>Lokasi</w:t></w:r><w:r><w:tab/><w:t>: [LOKASI]</w:t></w:r><w:r><w:br/></w:r><w:proofErr w:type="spellStart"/><w:r><w:t>Tahun</w:t></w:r><w:proofErr w:type="spellEnd"/><w:r><w:t xml:space="preserve"> </w:t></w:r><w:proofErr w:type="spellStart"/><w:r><w:t>Anggaran</w:t></w:r><w:proofErr w:type="spellEnd"/><w:r><w:tab/><w:t>: 2026</w:t></w:r></w:p><w:p><w:r><w:rPr><w:b/></w:rPr><w:t xml:space="preserve">I. </w:t></w:r><w:proofErr w:type="spellStart"/><w:r><w:rPr><w:b/></w:rPr><w:t>Dokumen</w:t></w:r><w:proofErr w:type="spellEnd"/><w:r><w:rPr><w:b/></w:rPr><w:t xml:space="preserve"> Teknis dan </w:t></w:r><w:proofErr w:type="spellStart"/><w:r><w:rPr><w:b/></w:rPr><w:t>Administratif</w:t></w:r><w:proofErr w:type="spellEnd"/></w:p><w:p><w:pPr><w:ind w:left="360" w:hanging="360"/></w:pPr><w:r><w:t xml:space="preserve">1. Gambar </w:t></w:r><w:proofErr w:type="spellStart"/><w:r><w:t>kerja</w:t></w:r><w:proofErr w:type="spellEnd"/><w:r><w:t xml:space="preserve"> yang </w:t></w:r><w:proofErr w:type="spellStart"/><w:r><w:t>telah</w:t></w:r><w:proofErr w:type="spellEnd"/><w:r><w:t xml:space="preserve"> </w:t></w:r><w:proofErr w:type="spellStart"/><w:r><w:t>ditetapkan</w:t></w:r><w:proofErr w:type="spellEnd"/><w:r><w:t>;</w:t></w:r></w:p><w:p><w:pPr><w:ind w:left="360" w:hanging="360"/></w:pPr><w:r><w:t>2. Berita acara/</w:t></w:r><w:proofErr w:type="spellStart"/><w:r><w:t>perhitungan</w:t></w:r><w:proofErr w:type="spellEnd"/><w:r><w:t xml:space="preserve"> volume </w:t></w:r><w:proofErr w:type="spellStart"/><w:r><w:t>pekerjaan</w:t></w:r><w:proofErr w:type="spellEnd"/><w:r><w:t>;</w:t></w:r></w:p><w:p><w:pPr><w:ind w:left="360" w:hanging="360"/></w:pPr><w:r><w:t xml:space="preserve">3. </w:t></w:r><w:proofErr w:type="spellStart"/><w:r><w:t>Rencana</w:t></w:r><w:proofErr w:type="spellEnd"/><w:r><w:t xml:space="preserve"> </w:t></w:r><w:proofErr w:type="spellStart"/><w:r><w:t>kebutuhan</w:t></w:r><w:proofErr w:type="spellEnd"/><w:r><w:t xml:space="preserve"> </w:t></w:r><w:proofErr w:type="spellStart"/><w:r><w:t>bahan</w:t></w:r><w:proofErr w:type="spellEnd"/><w:r><w:t xml:space="preserve">/material dan </w:t></w:r><w:proofErr w:type="spellStart"/><w:r><w:t>peralatan</w:t></w:r><w:proofErr w:type="spellEnd"/><w:r><w:t>;</w:t></w:r></w:p><w:p><w:pPr><w:ind w:left="360" w:hanging="360"/></w:pPr><w:r><w:t xml:space="preserve">4. RAB dan </w:t></w:r><w:proofErr w:type="spellStart"/><w:r><w:t>jadwal</w:t></w:r><w:proofErr w:type="spellEnd"/><w:r><w:t xml:space="preserve"> </w:t></w:r><w:proofErr w:type="spellStart"/><w:r><w:t>pelaksanaan</w:t></w:r><w:proofErr w:type="spellEnd"/><w:r><w:t xml:space="preserve"> yang </w:t></w:r><w:proofErr w:type="spellStart"/><w:r><w:t>telah</w:t></w:r><w:proofErr w:type="spellEnd"/><w:r><w:t xml:space="preserve"> </w:t></w:r><w:proofErr w:type="spellStart"/><w:r><w:t>ditetapkan</w:t></w:r><w:proofErr w:type="spellEnd"/><w:r><w:t xml:space="preserve"> oleh PPK;</w:t></w:r></w:p><w:p><w:r><w:rPr><w:b/></w:rPr><w:t xml:space="preserve">II. </w:t></w:r><w:proofErr w:type="spellStart"/><w:r><w:rPr><w:b/></w:rPr><w:t>Ketentuan</w:t></w:r><w:proofErr w:type="spellEnd"/><w:r><w:rPr><w:b/></w:rPr><w:t xml:space="preserve"> </w:t></w:r><w:proofErr w:type="spellStart"/><w:r><w:rPr><w:b/></w:rPr><w:t>Pelaksanaan</w:t></w:r><w:proofErr w:type="spellEnd"/></w:p><w:p><w:pPr><w:ind w:left="360" w:hanging="360"/></w:pPr><w:r><w:t xml:space="preserve">1. </w:t></w:r><w:proofErr w:type="spellStart"/><w:r><w:t>Pekerjaan</w:t></w:r><w:proofErr w:type="spellEnd"/><w:r><w:t xml:space="preserve"> </w:t></w:r><w:proofErr w:type="spellStart"/><w:r><w:t>dilaksanakan</w:t></w:r><w:proofErr w:type="spellEnd"/><w:r><w:t xml:space="preserve"> oleh Tim </w:t></w:r><w:proofErr w:type="spellStart"/><w:r><w:t>Pelaksana</w:t></w:r><w:proofErr w:type="spellEnd"/><w:r><w:t xml:space="preserve"> Swakelola </w:t></w:r><w:proofErr w:type="spellStart"/><w:r><w:t>Tipe</w:t></w:r><w:proofErr w:type="spellEnd"/><w:r><w:t xml:space="preserve"> I </w:t></w:r><w:proofErr w:type="spellStart"/><w:r><w:t>sesuai</w:t></w:r><w:proofErr w:type="spellEnd"/><w:r><w:t xml:space="preserve"> Keputusan KPA dan </w:t></w:r><w:proofErr w:type="spellStart"/><w:r><w:t>dokumen</w:t></w:r><w:proofErr w:type="spellEnd"/><w:r><w:t xml:space="preserve"> </w:t></w:r><w:proofErr w:type="spellStart"/><w:r><w:t>persiapan</w:t></w:r><w:proofErr w:type="spellEnd"/><w:r><w:t xml:space="preserve"> </w:t></w:r><w:proofErr w:type="spellStart"/><w:r><w:t>Swakelola</w:t></w:r><w:proofErr w:type="spellEnd"/><w:r><w:t>.</w:t></w:r></w:p><w:p><w:pPr><w:ind w:left="360" w:hanging="360"/></w:pPr><w:r><w:t xml:space="preserve">2. </w:t></w:r><w:proofErr w:type="spellStart"/><w:r><w:t>Pelaksanaan</w:t></w:r><w:proofErr w:type="spellEnd"/><w:r><w:t xml:space="preserve"> </w:t></w:r><w:proofErr w:type="spellStart"/><w:r><w:t>dapat</w:t></w:r><w:proofErr w:type="spellEnd"/><w:r><w:t xml:space="preserve"> </w:t></w:r><w:proofErr w:type="spellStart"/><w:r><w:t>memanfaatkan</w:t></w:r><w:proofErr w:type="spellEnd"/><w:r><w:t xml:space="preserve"> </w:t></w:r><w:proofErr w:type="spellStart"/><w:r><w:t>tenaga</w:t></w:r><w:proofErr w:type="spellEnd"/><w:r><w:t xml:space="preserve"> </w:t></w:r><w:proofErr w:type="spellStart"/><w:r><w:t>pendukung</w:t></w:r><w:proofErr w:type="spellEnd"/><w:r><w:t xml:space="preserve">/PJLP, </w:t></w:r><w:proofErr w:type="spellStart"/><w:r><w:t>peralatan</w:t></w:r><w:proofErr w:type="spellEnd"/><w:r><w:t xml:space="preserve">, </w:t></w:r><w:proofErr w:type="spellStart"/><w:r><w:t>kendaraan</w:t></w:r><w:proofErr w:type="spellEnd"/><w:r><w:t xml:space="preserve"> </w:t></w:r><w:proofErr w:type="spellStart"/><w:r><w:t>dinas</w:t></w:r><w:proofErr w:type="spellEnd"/><w:r><w:t xml:space="preserve">, </w:t></w:r><w:proofErr w:type="spellStart"/><w:r><w:t>persediaan</w:t></w:r><w:proofErr w:type="spellEnd"/><w:r><w:t xml:space="preserve">, </w:t></w:r><w:proofErr w:type="spellStart"/><w:r><w:t>serta</w:t></w:r><w:proofErr w:type="spellEnd"/><w:r><w:t xml:space="preserve"> </w:t></w:r><w:proofErr w:type="spellStart"/><w:r><w:t>sumber</w:t></w:r><w:proofErr w:type="spellEnd"/><w:r><w:t xml:space="preserve"> </w:t></w:r><w:proofErr w:type="spellStart"/><w:r><w:t>daya</w:t></w:r><w:proofErr w:type="spellEnd"/><w:r><w:t xml:space="preserve"> lain yang </w:t></w:r><w:proofErr w:type="spellStart"/><w:r><w:t>tersedia</w:t></w:r><w:proofErr w:type="spellEnd"/><w:r><w:t xml:space="preserve"> </w:t></w:r><w:proofErr w:type="spellStart"/><w:r><w:t>sesuai</w:t></w:r><w:proofErr w:type="spellEnd"/><w:r><w:t xml:space="preserve"> </w:t></w:r><w:proofErr w:type="spellStart"/><w:r><w:t>penugasan</w:t></w:r><w:proofErr w:type="spellEnd"/><w:r><w:t xml:space="preserve">, </w:t></w:r><w:proofErr w:type="spellStart"/><w:r><w:t>kontrak</w:t></w:r><w:proofErr w:type="spellEnd"/><w:r><w:t xml:space="preserve">, dan </w:t></w:r><w:proofErr w:type="spellStart"/><w:r><w:t>ketentuan</w:t></w:r><w:proofErr w:type="spellEnd"/><w:r><w:t xml:space="preserve"> yang </w:t></w:r><w:proofErr w:type="spellStart"/><w:r><w:t>berlaku</w:t></w:r><w:proofErr w:type="spellEnd"/><w:r><w:t>.</w:t></w:r></w:p><w:p><w:pPr><w:ind w:left="360" w:hanging="360"/></w:pPr><w:r><w:t xml:space="preserve">3. </w:t></w:r><w:proofErr w:type="spellStart"/><w:r><w:t>Apabila</w:t></w:r><w:proofErr w:type="spellEnd"/><w:r><w:t xml:space="preserve"> </w:t></w:r><w:proofErr w:type="spellStart"/><w:r><w:t>diperlukan</w:t></w:r><w:proofErr w:type="spellEnd"/><w:r><w:t xml:space="preserve"> </w:t></w:r><w:proofErr w:type="spellStart"/><w:r><w:t>pengadaan</w:t></w:r><w:proofErr w:type="spellEnd"/><w:r><w:t xml:space="preserve"> </w:t></w:r><w:proofErr w:type="spellStart"/><w:r><w:t>barang</w:t></w:r><w:proofErr w:type="spellEnd"/><w:r><w:t>/</w:t></w:r><w:proofErr w:type="spellStart"/><w:r><w:t>jasa</w:t></w:r><w:proofErr w:type="spellEnd"/><w:r><w:t xml:space="preserve"> </w:t></w:r><w:proofErr w:type="spellStart"/><w:r><w:t>melalui</w:t></w:r><w:proofErr w:type="spellEnd"/><w:r><w:t xml:space="preserve"> </w:t></w:r><w:proofErr w:type="spellStart"/><w:r><w:t>Penyedia</w:t></w:r><w:proofErr w:type="spellEnd"/><w:r><w:t xml:space="preserve"> </w:t></w:r><w:proofErr w:type="spellStart"/><w:r><w:t>sebagai</w:t></w:r><w:proofErr w:type="spellEnd"/><w:r><w:t xml:space="preserve"> </w:t></w:r><w:proofErr w:type="spellStart"/><w:r><w:t>bagian</w:t></w:r><w:proofErr w:type="spellEnd"/><w:r><w:t xml:space="preserve"> </w:t></w:r><w:proofErr w:type="spellStart"/><w:r><w:t>pendukung</w:t></w:r><w:proofErr w:type="spellEnd"/><w:r><w:t xml:space="preserve"> </w:t></w:r><w:proofErr w:type="spellStart"/><w:r><w:t>Swakelola</w:t></w:r><w:proofErr w:type="spellEnd"/><w:r><w:t xml:space="preserve">, proses </w:t></w:r><w:proofErr w:type="spellStart"/><w:r><w:t>pengadaannya</w:t></w:r><w:proofErr w:type="spellEnd"/><w:r><w:t xml:space="preserve"> </w:t></w:r><w:proofErr w:type="spellStart"/><w:r><w:t>dilaksanakan</w:t></w:r><w:proofErr w:type="spellEnd"/><w:r><w:t xml:space="preserve"> </w:t></w:r><w:proofErr w:type="spellStart"/><w:r><w:t>secara</w:t></w:r><w:proofErr w:type="spellEnd"/><w:r><w:t xml:space="preserve"> </w:t></w:r><w:proofErr w:type="spellStart"/><w:r><w:t>terpisah</w:t></w:r><w:proofErr w:type="spellEnd"/><w:r><w:t xml:space="preserve"> </w:t></w:r><w:proofErr w:type="spellStart"/><w:r><w:t>sesuai</w:t></w:r><w:proofErr w:type="spellEnd"/><w:r><w:t xml:space="preserve"> </w:t></w:r><w:proofErr w:type="spellStart"/><w:r><w:t>ketentuan</w:t></w:r><w:proofErr w:type="spellEnd"/><w:r><w:t xml:space="preserve"> </w:t></w:r><w:proofErr w:type="spellStart"/><w:r><w:t>Pengadaan</w:t></w:r><w:proofErr w:type="spellEnd"/><w:r><w:t xml:space="preserve"> Barang/Jasa </w:t></w:r><w:proofErr w:type="spellStart"/><w:r><w:t>Pemerintah</w:t></w:r><w:proofErr w:type="spellEnd"/><w:r><w:t>.</w:t></w:r></w:p><w:p><w:pPr><w:ind w:left="360" w:hanging="360"/></w:pPr><w:r><w:t xml:space="preserve">4. Bahan/material </w:t></w:r><w:proofErr w:type="spellStart"/><w:r><w:t>wajib</w:t></w:r><w:proofErr w:type="spellEnd"/><w:r><w:t xml:space="preserve"> </w:t></w:r><w:proofErr w:type="spellStart"/><w:r><w:t>dicatat</w:t></w:r><w:proofErr w:type="spellEnd"/><w:r><w:t xml:space="preserve"> </w:t></w:r><w:proofErr w:type="spellStart"/><w:r><w:t>penerimaan</w:t></w:r><w:proofErr w:type="spellEnd"/><w:r><w:t xml:space="preserve">, </w:t></w:r><w:proofErr w:type="spellStart"/><w:r><w:t>penggunaan</w:t></w:r><w:proofErr w:type="spellEnd"/><w:r><w:t xml:space="preserve">, </w:t></w:r><w:proofErr w:type="spellStart"/><w:r><w:t>sisa</w:t></w:r><w:proofErr w:type="spellEnd"/><w:r><w:t xml:space="preserve">, dan </w:t></w:r><w:proofErr w:type="spellStart"/><w:r><w:t>lokasinya</w:t></w:r><w:proofErr w:type="spellEnd"/><w:r><w:t xml:space="preserve"> </w:t></w:r><w:proofErr w:type="spellStart"/><w:r><w:t>serta</w:t></w:r><w:proofErr w:type="spellEnd"/><w:r><w:t xml:space="preserve"> </w:t></w:r><w:proofErr w:type="spellStart"/><w:r><w:t>didukung</w:t></w:r><w:proofErr w:type="spellEnd"/><w:r><w:t xml:space="preserve"> </w:t></w:r><w:proofErr w:type="spellStart"/><w:r><w:t>dokumen</w:t></w:r><w:proofErr w:type="spellEnd"/><w:r><w:t xml:space="preserve"> </w:t></w:r><w:proofErr w:type="spellStart"/><w:r><w:t>persediaan</w:t></w:r><w:proofErr w:type="spellEnd"/><w:r><w:t xml:space="preserve"> yang </w:t></w:r><w:proofErr w:type="spellStart"/><w:r><w:t>dapat</w:t></w:r><w:proofErr w:type="spellEnd"/><w:r><w:t xml:space="preserve"> </w:t></w:r><w:proofErr w:type="spellStart"/><w:r><w:t>ditelusuri</w:t></w:r><w:proofErr w:type="spellEnd"/><w:r><w:t>.</w:t></w:r></w:p><w:p><w:pPr><w:ind w:left="360" w:hanging="360"/></w:pPr><w:r><w:t xml:space="preserve">5. </w:t></w:r><w:proofErr w:type="spellStart"/><w:r><w:t>Pelaksanaan</w:t></w:r><w:proofErr w:type="spellEnd"/><w:r><w:t xml:space="preserve"> </w:t></w:r><w:proofErr w:type="spellStart"/><w:r><w:t>pekerjaan</w:t></w:r><w:proofErr w:type="spellEnd"/><w:r><w:t xml:space="preserve"> </w:t></w:r><w:proofErr w:type="spellStart"/><w:r><w:t>wajib</w:t></w:r><w:proofErr w:type="spellEnd"/><w:r><w:t xml:space="preserve"> </w:t></w:r><w:proofErr w:type="spellStart"/><w:r><w:t>memperhatikan</w:t></w:r><w:proofErr w:type="spellEnd"/><w:r><w:t xml:space="preserve"> </w:t></w:r><w:proofErr w:type="spellStart"/><w:r><w:t>keselamatan</w:t></w:r><w:proofErr w:type="spellEnd"/><w:r><w:t xml:space="preserve"> </w:t></w:r><w:proofErr w:type="spellStart"/><w:r><w:t>kerja</w:t></w:r><w:proofErr w:type="spellEnd"/><w:r><w:t xml:space="preserve">, </w:t></w:r><w:proofErr w:type="spellStart"/><w:r><w:t>pengamanan</w:t></w:r><w:proofErr w:type="spellEnd"/><w:r><w:t xml:space="preserve"> </w:t></w:r><w:proofErr w:type="spellStart"/><w:r><w:t>aset</w:t></w:r><w:proofErr w:type="spellEnd"/><w:r><w:t>/</w:t></w:r><w:proofErr w:type="spellStart"/><w:r><w:t>peralatan</w:t></w:r><w:proofErr w:type="spellEnd"/><w:r><w:t xml:space="preserve">, </w:t></w:r><w:proofErr w:type="spellStart"/><w:r><w:t>kebersihan</w:t></w:r><w:proofErr w:type="spellEnd"/><w:r><w:t xml:space="preserve"> </w:t></w:r><w:proofErr w:type="spellStart"/><w:r><w:t>lokasi</w:t></w:r><w:proofErr w:type="spellEnd"/><w:r><w:t xml:space="preserve">, dan </w:t></w:r><w:proofErr w:type="spellStart"/><w:r><w:t>pengendalian</w:t></w:r><w:proofErr w:type="spellEnd"/><w:r><w:t xml:space="preserve"> </w:t></w:r><w:proofErr w:type="spellStart"/><w:r><w:t>dampak</w:t></w:r><w:proofErr w:type="spellEnd"/><w:r><w:t xml:space="preserve"> </w:t></w:r><w:proofErr w:type="spellStart"/><w:r><w:t>terhadap</w:t></w:r><w:proofErr w:type="spellEnd"/><w:r><w:t xml:space="preserve"> </w:t></w:r><w:proofErr w:type="spellStart"/><w:r><w:t>masyarakat</w:t></w:r><w:proofErr w:type="spellEnd"/><w:r><w:t>/</w:t></w:r><w:proofErr w:type="spellStart"/><w:r><w:t>lingkungan</w:t></w:r><w:proofErr w:type="spellEnd"/><w:r><w:t xml:space="preserve"> </w:t></w:r><w:proofErr w:type="spellStart"/><w:r><w:t>sekitar</w:t></w:r><w:proofErr w:type="spellEnd"/><w:r><w:t>.</w:t></w:r></w:p><w:p><w:pPr><w:ind w:left="360" w:hanging="360"/></w:pPr><w:r><w:t xml:space="preserve">6. </w:t></w:r><w:proofErr w:type="spellStart"/><w:r><w:t>Setiap</w:t></w:r><w:proofErr w:type="spellEnd"/><w:r><w:t xml:space="preserve"> </w:t></w:r><w:proofErr w:type="spellStart"/><w:r><w:t>perubahan</w:t></w:r><w:proofErr w:type="spellEnd"/><w:r><w:t xml:space="preserve"> volume, </w:t></w:r><w:proofErr w:type="spellStart"/><w:r><w:t>lokasi</w:t></w:r><w:proofErr w:type="spellEnd"/><w:r><w:t xml:space="preserve">, </w:t></w:r><w:proofErr w:type="spellStart"/><w:r><w:t>metode</w:t></w:r><w:proofErr w:type="spellEnd"/><w:r><w:t xml:space="preserve">, </w:t></w:r><w:proofErr w:type="spellStart"/><w:r><w:t>atau</w:t></w:r><w:proofErr w:type="spellEnd"/><w:r><w:t xml:space="preserve"> </w:t></w:r><w:proofErr w:type="spellStart"/><w:r><w:t>kebutuhan</w:t></w:r><w:proofErr w:type="spellEnd"/><w:r><w:t xml:space="preserve"> </w:t></w:r><w:proofErr w:type="spellStart"/><w:r><w:t>sumber</w:t></w:r><w:proofErr w:type="spellEnd"/><w:r><w:t xml:space="preserve"> </w:t></w:r><w:proofErr w:type="spellStart"/><w:r><w:t>daya</w:t></w:r><w:proofErr w:type="spellEnd"/><w:r><w:t xml:space="preserve"> yang </w:t></w:r><w:proofErr w:type="spellStart"/><w:r><w:t>bersifat</w:t></w:r><w:proofErr w:type="spellEnd"/><w:r><w:t xml:space="preserve"> material </w:t></w:r><w:proofErr w:type="spellStart"/><w:r><w:t>harus</w:t></w:r><w:proofErr w:type="spellEnd"/><w:r><w:t xml:space="preserve"> </w:t></w:r><w:proofErr w:type="spellStart"/><w:r><w:t>dikoordinasikan</w:t></w:r><w:proofErr w:type="spellEnd"/><w:r><w:t xml:space="preserve"> dan </w:t></w:r><w:proofErr w:type="spellStart"/><w:r><w:t>memperoleh</w:t></w:r><w:proofErr w:type="spellEnd"/><w:r><w:t xml:space="preserve"> </w:t></w:r><w:proofErr w:type="spellStart"/><w:r><w:t>persetujuan</w:t></w:r><w:proofErr w:type="spellEnd"/><w:r><w:t xml:space="preserve"> </w:t></w:r><w:proofErr w:type="spellStart"/><w:r><w:t>pejabat</w:t></w:r><w:proofErr w:type="spellEnd"/><w:r><w:t xml:space="preserve"> yang </w:t></w:r><w:proofErr w:type="spellStart"/><w:r><w:t>berwenang</w:t></w:r><w:proofErr w:type="spellEnd"/><w:r><w:t xml:space="preserve"> </w:t></w:r><w:proofErr w:type="spellStart"/><w:r><w:t>sebelum</w:t></w:r><w:proofErr w:type="spellEnd"/><w:r><w:t xml:space="preserve"> </w:t></w:r><w:proofErr w:type="spellStart"/><w:r><w:t>dilaksanakan</w:t></w:r><w:proofErr w:type="spellEnd"/><w:r><w:t>.</w:t></w:r></w:p><w:p><w:pPr><w:tabs><w:tab w:val="left" w:pos="2160"/></w:tabs></w:pPr><w:r><w:rPr><w:b/></w:rPr><w:lastRenderedPageBreak/><w:t xml:space="preserve">III. </w:t></w:r><w:proofErr w:type="spellStart"/><w:r><w:rPr><w:b/></w:rPr><w:t>Pelaporan</w:t></w:r><w:proofErr w:type="spellEnd"/><w:r><w:rPr><w:b/></w:rPr><w:t xml:space="preserve"> dan </w:t></w:r><w:proofErr w:type="spellStart"/><w:r><w:rPr><w:b/></w:rPr><w:t>Pengawasan</w:t></w:r><w:proofErr w:type="spellEnd"/></w:p><w:p><w:pPr><w:tabs><w:tab w:val="left" w:pos="2160"/></w:tabs></w:pPr><w:r><w:t xml:space="preserve">1. Tim Pelaksana </w:t></w:r><w:proofErr w:type="spellStart"/><w:r><w:t>mencatat</w:t></w:r><w:proofErr w:type="spellEnd"/><w:r><w:t xml:space="preserve"> dan </w:t></w:r><w:proofErr w:type="spellStart"/><w:r><w:t>melaporkan</w:t></w:r><w:proofErr w:type="spellEnd"/><w:r><w:t xml:space="preserve"> </w:t></w:r><w:proofErr w:type="spellStart"/><w:r><w:t>kemajuan</w:t></w:r><w:proofErr w:type="spellEnd"/><w:r><w:t xml:space="preserve"> </w:t></w:r><w:proofErr w:type="spellStart"/><w:r><w:t>fisik</w:t></w:r><w:proofErr w:type="spellEnd"/><w:r><w:t xml:space="preserve">, </w:t></w:r><w:proofErr w:type="spellStart"/><w:r><w:t>penggunaan</w:t></w:r><w:proofErr w:type="spellEnd"/><w:r><w:t xml:space="preserve"> </w:t></w:r><w:proofErr w:type="spellStart"/><w:r><w:t>tenaga</w:t></w:r><w:proofErr w:type="spellEnd"/><w:r><w:t xml:space="preserve"> </w:t></w:r><w:proofErr w:type="spellStart"/><w:r><w:t>kerja</w:t></w:r><w:proofErr w:type="spellEnd"/><w:r><w:t xml:space="preserve">, </w:t></w:r><w:proofErr w:type="spellStart"/><w:r><w:t>bahan</w:t></w:r><w:proofErr w:type="spellEnd"/><w:r><w:t xml:space="preserve">/material, </w:t></w:r><w:proofErr w:type="spellStart"/><w:r><w:t>peralatan</w:t></w:r><w:proofErr w:type="spellEnd"/><w:r><w:t xml:space="preserve">, </w:t></w:r><w:proofErr w:type="spellStart"/><w:r><w:t>kendala</w:t></w:r><w:proofErr w:type="spellEnd"/><w:r><w:t xml:space="preserve">, </w:t></w:r><w:proofErr w:type="spellStart"/><w:r><w:t>tindakan</w:t></w:r><w:proofErr w:type="spellEnd"/><w:r><w:t xml:space="preserve"> </w:t></w:r><w:proofErr w:type="spellStart"/><w:r><w:t>korektif</w:t></w:r><w:proofErr w:type="spellEnd"/><w:r><w:t>.</w:t></w:r></w:p><w:p><w:pPr><w:tabs><w:tab w:val="left" w:pos="2160"/></w:tabs></w:pPr><w:r><w:t xml:space="preserve">2. </w:t></w:r><w:proofErr w:type="spellStart"/><w:r><w:t>Laporan</w:t></w:r><w:proofErr w:type="spellEnd"/><w:r><w:t xml:space="preserve"> </w:t></w:r><w:proofErr w:type="spellStart"/><w:r><w:t>pelaksanaan</w:t></w:r><w:proofErr w:type="spellEnd"/><w:r><w:t xml:space="preserve"> </w:t></w:r><w:proofErr w:type="spellStart"/><w:r><w:t>dilengkapi</w:t></w:r><w:proofErr w:type="spellEnd"/><w:r><w:t xml:space="preserve"> </w:t></w:r><w:proofErr w:type="spellStart"/><w:r><w:t>dokumentasi</w:t></w:r><w:proofErr w:type="spellEnd"/><w:r><w:t xml:space="preserve"> </w:t></w:r><w:proofErr w:type="spellStart"/><w:r><w:t>foto</w:t></w:r><w:proofErr w:type="spellEnd"/><w:r><w:t xml:space="preserve"> </w:t></w:r><w:proofErr w:type="spellStart"/><w:r><w:t>sebelum</w:t></w:r><w:proofErr w:type="spellEnd"/><w:r><w:t xml:space="preserve">, </w:t></w:r><w:proofErr w:type="spellStart"/><w:r><w:t>selama</w:t></w:r><w:proofErr w:type="spellEnd"/><w:r><w:t xml:space="preserve">, dan </w:t></w:r><w:proofErr w:type="spellStart"/><w:r><w:t>sesudah</w:t></w:r><w:proofErr w:type="spellEnd"/><w:r><w:t xml:space="preserve"> </w:t></w:r><w:proofErr w:type="spellStart"/><w:r><w:t>pekerjaan</w:t></w:r><w:proofErr w:type="spellEnd"/><w:r><w:t xml:space="preserve">, </w:t></w:r><w:proofErr w:type="spellStart"/><w:r><w:t>rekap</w:t></w:r><w:proofErr w:type="spellEnd"/><w:r><w:t xml:space="preserve"> </w:t></w:r><w:proofErr w:type="spellStart"/><w:r><w:t>penggunaan</w:t></w:r><w:proofErr w:type="spellEnd"/><w:r><w:t xml:space="preserve"> </w:t></w:r><w:proofErr w:type="spellStart"/><w:r><w:t>bahan</w:t></w:r><w:proofErr w:type="spellEnd"/><w:r><w:t xml:space="preserve">/material, </w:t></w:r><w:proofErr w:type="spellStart"/><w:r><w:t>serta</w:t></w:r><w:proofErr w:type="spellEnd"/><w:r><w:t xml:space="preserve"> </w:t></w:r><w:proofErr w:type="spellStart"/><w:r><w:t>dokumen</w:t></w:r><w:proofErr w:type="spellEnd"/><w:r><w:t xml:space="preserve"> </w:t></w:r><w:proofErr w:type="spellStart"/><w:r><w:t>pendukung</w:t></w:r><w:proofErr w:type="spellEnd"/><w:r><w:t xml:space="preserve"> </w:t></w:r><w:proofErr w:type="spellStart"/><w:r><w:t>lainnya</w:t></w:r><w:proofErr w:type="spellEnd"/><w:r><w:t>.</w:t></w:r></w:p><w:p><w:pPr><w:tabs><w:tab w:val="left" w:pos="2160"/></w:tabs></w:pPr><w:r><w:t xml:space="preserve">3. Tim </w:t></w:r><w:proofErr w:type="spellStart"/><w:r><w:t>Pengawas</w:t></w:r><w:proofErr w:type="spellEnd"/><w:r><w:t xml:space="preserve"> </w:t></w:r><w:proofErr w:type="spellStart"/><w:r><w:t>melakukan</w:t></w:r><w:proofErr w:type="spellEnd"/><w:r><w:t xml:space="preserve"> </w:t></w:r><w:proofErr w:type="spellStart"/><w:r><w:t>pengawasan</w:t></w:r><w:proofErr w:type="spellEnd"/><w:r><w:t xml:space="preserve"> </w:t></w:r><w:proofErr w:type="spellStart"/><w:r><w:t>administrasi</w:t></w:r><w:proofErr w:type="spellEnd"/><w:r><w:t xml:space="preserve">, </w:t></w:r><w:proofErr w:type="spellStart"/><w:r><w:t>teknis</w:t></w:r><w:proofErr w:type="spellEnd"/><w:r><w:t xml:space="preserve">, </w:t></w:r><w:proofErr w:type="spellStart"/><w:r><w:t>serta</w:t></w:r><w:proofErr w:type="spellEnd"/><w:r><w:t xml:space="preserve"> </w:t></w:r><w:proofErr w:type="spellStart"/><w:r><w:t>menyusun</w:t></w:r><w:proofErr w:type="spellEnd"/><w:r><w:t xml:space="preserve"> Berita Acara Hasil </w:t></w:r><w:proofErr w:type="spellStart"/><w:r><w:t>Pemeriksaan</w:t></w:r><w:proofErr w:type="spellEnd"/><w:r><w:t>.</w:t></w:r></w:p><w:p><w:pPr><w:tabs><w:tab w:val="left" w:pos="2160"/></w:tabs></w:pPr><w:r><w:t xml:space="preserve">4. </w:t></w:r><w:proofErr w:type="spellStart"/><w:r><w:t>Setelah</w:t></w:r><w:proofErr w:type="spellEnd"/><w:r><w:t xml:space="preserve"> </w:t></w:r><w:proofErr w:type="spellStart"/><w:r><w:t>hasil</w:t></w:r><w:proofErr w:type="spellEnd"/><w:r><w:t xml:space="preserve"> </w:t></w:r><w:proofErr w:type="spellStart"/><w:r><w:t>pekerjaan</w:t></w:r><w:proofErr w:type="spellEnd"/><w:r><w:t xml:space="preserve"> </w:t></w:r><w:proofErr w:type="spellStart"/><w:r><w:t>dinyatakan</w:t></w:r><w:proofErr w:type="spellEnd"/><w:r><w:t xml:space="preserve"> </w:t></w:r><w:proofErr w:type="spellStart"/><w:r><w:t>sesuai</w:t></w:r><w:proofErr w:type="spellEnd"/><w:r><w:t xml:space="preserve"> </w:t></w:r><w:proofErr w:type="spellStart"/><w:r><w:t>berdasarkan</w:t></w:r><w:proofErr w:type="spellEnd"/><w:r><w:t xml:space="preserve"> </w:t></w:r><w:proofErr w:type="spellStart"/><w:r><w:t>pemeriksaan</w:t></w:r><w:proofErr w:type="spellEnd"/><w:r><w:t xml:space="preserve"> Tim Pengawas, Tim Pelaksana </w:t></w:r><w:proofErr w:type="spellStart"/><w:r><w:t>menyerahkan</w:t></w:r><w:proofErr w:type="spellEnd"/><w:r><w:t xml:space="preserve"> </w:t></w:r><w:proofErr w:type="spellStart"/><w:r><w:t>hasil</w:t></w:r><w:proofErr w:type="spellEnd"/><w:r><w:t xml:space="preserve"> </w:t></w:r><w:proofErr w:type="spellStart"/><w:r><w:t>pekerjaan</w:t></w:r><w:proofErr w:type="spellEnd"/><w:r><w:t xml:space="preserve"> dan </w:t></w:r><w:proofErr w:type="spellStart"/><w:r><w:t>laporan</w:t></w:r><w:proofErr w:type="spellEnd"/><w:r><w:t xml:space="preserve"> </w:t></w:r><w:proofErr w:type="spellStart"/><w:r><w:t>pelaksanaan</w:t></w:r><w:proofErr w:type="spellEnd"/><w:r><w:t xml:space="preserve"> </w:t></w:r><w:proofErr w:type="spellStart"/><w:r><w:t>kepada</w:t></w:r><w:proofErr w:type="spellEnd"/><w:r><w:t xml:space="preserve"> PPK </w:t></w:r><w:proofErr w:type="spellStart"/><w:r><w:t>melalui</w:t></w:r><w:proofErr w:type="spellEnd"/><w:r><w:t xml:space="preserve"> Berita Acara Serah </w:t></w:r><w:proofErr w:type="spellStart"/><w:r><w:t>Terima</w:t></w:r><w:proofErr w:type="spellEnd"/><w:r><w:t xml:space="preserve"> Hasil </w:t></w:r><w:proofErr w:type="spellStart"/><w:r><w:t>Pekerjaan</w:t></w:r><w:proofErr w:type="spellEnd"/><w:r><w:t>.</w:t></w:r></w:p><w:p><w:pPr><w:tabs><w:tab w:val="left" w:pos="2160"/></w:tabs></w:pPr><w:r><w:rPr><w:b/></w:rPr><w:t xml:space="preserve">IV. </w:t></w:r><w:proofErr w:type="spellStart"/><w:r><w:rPr><w:b/></w:rPr><w:t>Jangka</w:t></w:r><w:proofErr w:type="spellEnd"/><w:r><w:rPr><w:b/></w:rPr><w:t xml:space="preserve"> Waktu</w:t></w:r></w:p><w:p><w:pPr><w:tabs><w:tab w:val="left" w:pos="2160"/></w:tabs></w:pPr><w:proofErr w:type="spellStart"/><w:r><w:t>Pekerjaan</w:t></w:r><w:proofErr w:type="spellEnd"/><w:r><w:t xml:space="preserve"> </w:t></w:r><w:proofErr w:type="spellStart"/><w:r><w:t>dilaksanakan</w:t></w:r><w:proofErr w:type="spellEnd"/><w:r><w:t xml:space="preserve"> </w:t></w:r><w:proofErr w:type="spellStart"/><w:r><w:t>sejak</w:t></w:r><w:proofErr w:type="spellEnd"/><w:r><w:t xml:space="preserve"> </w:t></w:r><w:proofErr w:type="spellStart"/><w:r><w:t>tanggal</w:t></w:r><w:proofErr w:type="spellEnd"/><w:r><w:t xml:space="preserve"> [TANGGAL MULAI] </w:t></w:r><w:proofErr w:type="spellStart"/><w:r><w:t>sampai</w:t></w:r><w:proofErr w:type="spellEnd"/><w:r><w:t xml:space="preserve"> </w:t></w:r><w:proofErr w:type="spellStart"/><w:r><w:t>dengan</w:t></w:r><w:proofErr w:type="spellEnd"/><w:r><w:t xml:space="preserve"> [TANGGAL SELESAI] dan </w:t></w:r><w:proofErr w:type="spellStart"/><w:r><w:t>tidak</w:t></w:r><w:proofErr w:type="spellEnd"/><w:r><w:t xml:space="preserve"> </w:t></w:r><w:proofErr w:type="spellStart"/><w:r><w:t>melampaui</w:t></w:r><w:proofErr w:type="spellEnd"/><w:r><w:t xml:space="preserve"> </w:t></w:r><w:proofErr w:type="spellStart"/><w:r><w:t>Tahun</w:t></w:r><w:proofErr w:type="spellEnd"/><w:r><w:t xml:space="preserve"> </w:t></w:r><w:proofErr w:type="spellStart"/><w:r><w:t>Anggaran</w:t></w:r><w:proofErr w:type="spellEnd"/><w:r><w:t xml:space="preserve"> 2026, </w:t></w:r><w:proofErr w:type="spellStart"/><w:r><w:t>sesuai</w:t></w:r><w:proofErr w:type="spellEnd"/><w:r><w:t xml:space="preserve"> </w:t></w:r><w:proofErr w:type="spellStart"/><w:r><w:t>jadwal</w:t></w:r><w:proofErr w:type="spellEnd"/><w:r><w:t xml:space="preserve"> </w:t></w:r><w:proofErr w:type="spellStart"/><w:r><w:t>pelaksanaan</w:t></w:r><w:proofErr w:type="spellEnd"/><w:r><w:t xml:space="preserve"> yang </w:t></w:r><w:proofErr w:type="spellStart"/><w:r><w:t>ditetapkan</w:t></w:r><w:proofErr w:type="spellEnd"/><w:r><w:t>.</w:t></w:r></w:p><w:p><w:pPr><w:tabs><w:tab w:val="left" w:pos="2160"/></w:tabs></w:pPr><w:r><w:t xml:space="preserve">Surat </w:t></w:r><w:proofErr w:type="spellStart"/><w:r><w:t>Perintah</w:t></w:r><w:proofErr w:type="spellEnd"/><w:r><w:t xml:space="preserve"> </w:t></w:r><w:proofErr w:type="spellStart"/><w:r><w:t>Tugas</w:t></w:r><w:proofErr w:type="spellEnd"/><w:r><w:t xml:space="preserve"> </w:t></w:r><w:proofErr w:type="spellStart"/><w:r><w:t>ini</w:t></w:r><w:proofErr w:type="spellEnd"/><w:r><w:t xml:space="preserve"> agar </w:t></w:r><w:proofErr w:type="spellStart"/><w:r><w:t>dilaksanakan</w:t></w:r><w:proofErr w:type="spellEnd"/><w:r><w:t xml:space="preserve"> </w:t></w:r><w:proofErr w:type="spellStart"/><w:r><w:t>dengan</w:t></w:r><w:proofErr w:type="spellEnd"/><w:r><w:t xml:space="preserve"> </w:t></w:r><w:proofErr w:type="spellStart"/><w:r><w:t>sebaik-baiknya</w:t></w:r><w:proofErr w:type="spellEnd"/><w:r><w:t xml:space="preserve">, </w:t></w:r><w:proofErr w:type="spellStart"/><w:r><w:t>penuh</w:t></w:r><w:proofErr w:type="spellEnd"/><w:r><w:t xml:space="preserve"> </w:t></w:r><w:proofErr w:type="spellStart"/><w:r><w:t>tanggung</w:t></w:r><w:proofErr w:type="spellEnd"/><w:r><w:t xml:space="preserve"> </w:t></w:r><w:proofErr w:type="spellStart"/><w:r><w:t>jawab</w:t></w:r><w:proofErr w:type="spellEnd"/><w:r><w:t xml:space="preserve">, </w:t></w:r><w:proofErr w:type="spellStart"/><w:r><w:t>tertib</w:t></w:r><w:proofErr w:type="spellEnd"/><w:r><w:t xml:space="preserve"> </w:t></w:r><w:proofErr w:type="spellStart"/><w:r><w:t>administrasi</w:t></w:r><w:proofErr w:type="spellEnd"/><w:r><w:t xml:space="preserve">, dan </w:t></w:r><w:proofErr w:type="spellStart"/><w:r><w:t>sesuai</w:t></w:r><w:proofErr w:type="spellEnd"/><w:r><w:t xml:space="preserve"> </w:t></w:r><w:proofErr w:type="spellStart"/><w:r><w:t>ketentuan</w:t></w:r><w:proofErr w:type="spellEnd"/><w:r><w:t xml:space="preserve"> </w:t></w:r><w:proofErr w:type="spellStart"/><w:r><w:t>peraturan</w:t></w:r><w:proofErr w:type="spellEnd"/><w:r><w:t xml:space="preserve"> </w:t></w:r><w:proofErr w:type="spellStart"/><w:r><w:t>perundang-undangan</w:t></w:r><w:proofErr w:type="spellEnd"/><w:r><w:t>.</w:t></w:r></w:p><w:tbl><w:tblPr><w:tblW w:w="0" w:type="auto"/><w:tblLayout w:type="fixed"/><w:tblLook w:val="04A0" w:firstRow="1" w:lastRow="0" w:firstColumn="1" w:lastColumn="0" w:noHBand="0" w:noVBand="1"/></w:tblPr><w:tbl><w:tblPr><w:tblW w:w="8640" w:type="dxa"/><w:tblLayout w:type="fixed"/><w:tblBorders><w:top w:val="none" w:sz="0" w:space="0" w:color="auto"/><w:left w:val="none" w:sz="0" w:space="0" w:color="auto"/><w:bottom w:val="none" w:sz="0" w:space="0" w:color="auto"/><w:right w:val="none" w:sz="0" w:space="0" w:color="auto"/><w:insideH w:val="none" w:sz="0" w:space="0" w:color="auto"/><w:insideV w:val="none" w:sz="0" w:space="0" w:color="auto"/></w:tblBorders><w:tblLook w:val="04A0" w:firstRow="0" w:lastRow="0" w:firstColumn="0" w:lastColumn="0" w:noHBand="0" w:noVBand="0"/></w:tblPr><w:tblGrid><w:gridCol w:w="4320"/><w:gridCol w:w="4320"/></w:tblGrid><w:tr><w:tc><w:tcPr><w:tcW w:w="4320" w:type="dxa"/><w:vAlign w:val="top"/></w:tcPr><w:p><w:pPr><w:jc w:val="center"/></w:pPr><w:r><w:br/><w:br/></w:r></w:p><w:p><w:pPr><w:jc w:val="center"/></w:pPr><w:r><w:t>PENERIMA PERINTAH</w:t></w:r><w:r><w:br/></w:r><w:r><w:t>Ketua/Koordinator Tim Pelaksana</w:t></w:r></w:p><w:p><w:pPr><w:jc w:val="center"/></w:pPr><w:r><w:br/><w:br/><w:br/><w:br/></w:r><w:r><w:rPr><w:b/><w:u w:val="single"/></w:rPr><w:t>[NAMA]</w:t></w:r><w:r><w:br/></w:r><w:r><w:t>NIP [NIP]</w:t></w:r></w:p></w:tc><w:tc><w:tcPr><w:tcW w:w="4320" w:type="dxa"/><w:vAlign w:val="top"/></w:tcPr><w:p><w:pPr><w:jc w:val="center"/></w:pPr><w:r><w:t>Dikeluarkan di Jakarta</w:t></w:r><w:r><w:br/></w:r><w:r><w:t xml:space="preserve">pada tanggal </w:t></w:r><w:r><w:t>[TANGGAL]</w:t></w:r></w:p><w:p><w:pPr><w:jc w:val="center"/></w:pPr><w:r><w:t>PEMBERI PERINTAH</w:t></w:r><w:r><w:br/></w:r><w:r><w:t>Kepala Suku Dinas Sumber Daya Air</w:t></w:r><w:r><w:br/></w:r><w:r><w:t>Kota Administrasi Jakarta Utara</w:t></w:r><w:r><w:br/></w:r><w:r><w:t>selaku KPA</w:t></w:r></w:p><w:p><w:pPr><w:jc w:val="center"/></w:pPr><w:r><w:br/><w:br/><w:br/><w:br/></w:r><w:r><w:rPr><w:b/><w:u w:val="single"/></w:rPr><w:t>Heria Suwandi</w:t></w:r><w:r><w:br/></w:r><w:r><w:t>NIP 197101272006041009</w:t></w:r></w:p></w:tc></w:tr></w:tbl><w:p><w:pPr><w:tabs><w:tab w:val="left" w:pos="2160"/></w:tabs></w:pPr></w:p><w:p><w:pPr><w:tabs><w:tab w:val="left" w:pos="2160"/></w:tabs></w:pPr></w:p><w:sectPr><w:pgSz w:w="12240" w:h="15840"/><w:pgMar w:top="1440" w:right="1800" w:bottom="1440" w:left="1800" w:header="720" w:footer="720" w:gutter="0"/><w:cols w:space="720"/><w:docGrid w:linePitch="360"/></w:sectPr></w:body></w:document>
 </file>
 
 <file path=word/numbering.xml><?xml version="1.0" encoding="utf-8"?>

</xml_diff>

<commit_message>
fix(spt): resolve docx xml parse error and ensure strict schema compliance for word open
</commit_message>
<xml_diff>
--- a/public/assets/Surat_Perintah_Tugas_walikota.docx
+++ b/public/assets/Surat_Perintah_Tugas_walikota.docx
@@ -1,6 +1,2413 @@
 
-<file path=word/document.xml><?xml version="1.0" encoding="UTF-8" standalone="yes"?>
-<w:document xmlns:wpc="http://schemas.microsoft.com/office/word/2010/wordprocessingCanvas" xmlns:cx="http://schemas.microsoft.com/office/drawing/2014/chartex" xmlns:cx1="http://schemas.microsoft.com/office/drawing/2015/9/8/chartex" xmlns:cx2="http://schemas.microsoft.com/office/drawing/2015/10/21/chartex" xmlns:cx3="http://schemas.microsoft.com/office/drawing/2016/5/9/chartex" xmlns:cx4="http://schemas.microsoft.com/office/drawing/2016/5/10/chartex" xmlns:cx5="http://schemas.microsoft.com/office/drawing/2016/5/11/chartex" xmlns:cx6="http://schemas.microsoft.com/office/drawing/2016/5/12/chartex" xmlns:cx7="http://schemas.microsoft.com/office/drawing/2016/5/13/chartex" xmlns:cx8="http://schemas.microsoft.com/office/drawing/2016/5/14/chartex" xmlns:mc="http://schemas.openxmlformats.org/markup-compatibility/2006" xmlns:aink="http://schemas.microsoft.com/office/drawing/2016/ink" xmlns:am3d="http://schemas.microsoft.com/office/drawing/2017/model3d" xmlns:o="urn:schemas-microsoft-com:office:office" xmlns:oel="http://schemas.microsoft.com/office/2019/extlst" xmlns:r="http://schemas.openxmlformats.org/officeDocument/2006/relationships" xmlns:m="http://schemas.openxmlformats.org/officeDocument/2006/math" xmlns:v="urn:schemas-microsoft-com:vml" xmlns:wp14="http://schemas.microsoft.com/office/word/2010/wordprocessingDrawing" xmlns:wp="http://schemas.openxmlformats.org/drawingml/2006/wordprocessingDrawing" xmlns:w10="urn:schemas-microsoft-com:office:word" xmlns:w="http://schemas.openxmlformats.org/wordprocessingml/2006/main" xmlns:w14="http://schemas.microsoft.com/office/word/2010/wordml" xmlns:w15="http://schemas.microsoft.com/office/word/2012/wordml" xmlns:w16cex="http://schemas.microsoft.com/office/word/2018/wordml/cex" xmlns:w16cid="http://schemas.microsoft.com/office/word/2016/wordml/cid" xmlns:w16="http://schemas.microsoft.com/office/word/2018/wordml" xmlns:w16du="http://schemas.microsoft.com/office/word/2023/wordml/word16du" xmlns:w16sdtdh="http://schemas.microsoft.com/office/word/2020/wordml/sdtdatahash" xmlns:w16sdtfl="http://schemas.microsoft.com/office/word/2024/wordml/sdtformatlock" xmlns:w16se="http://schemas.microsoft.com/office/word/2015/wordml/symex" xmlns:wpg="http://schemas.microsoft.com/office/word/2010/wordprocessingGroup" xmlns:wpi="http://schemas.microsoft.com/office/word/2010/wordprocessingInk" xmlns:wne="http://schemas.microsoft.com/office/word/2006/wordml" xmlns:wps="http://schemas.microsoft.com/office/word/2010/wordprocessingShape" mc:Ignorable="w14 w15 w16se w16cid w16 w16cex w16sdtdh w16sdtfl w16du wp14"><w:body><w:p><w:pPr><w:jc w:val="center"/><w:rPr><w:b/><w:sz w:val="24"/></w:rPr></w:pPr><w:r><w:rPr><w:b/><w:noProof/><w:sz w:val="24"/></w:rPr><w:drawing><wp:anchor distT="0" distB="0" distL="114300" distR="114300" simplePos="0" relativeHeight="251658240" behindDoc="1" locked="0" layoutInCell="1" allowOverlap="1" wp14:anchorId="72F445D8" wp14:editId="15BE4D3D"><wp:simplePos x="0" y="0"/><wp:positionH relativeFrom="margin"><wp:posOffset>2146301</wp:posOffset></wp:positionH><wp:positionV relativeFrom="paragraph"><wp:posOffset>-558800</wp:posOffset></wp:positionV><wp:extent cx="965200" cy="1276350"/><wp:effectExtent l="0" t="0" r="6350" b="0"/><wp:wrapNone/><wp:docPr id="837020129" name="Picture 1"/><wp:cNvGraphicFramePr><a:graphicFrameLocks xmlns:a="http://schemas.openxmlformats.org/drawingml/2006/main" noChangeAspect="1"/></wp:cNvGraphicFramePr><a:graphic xmlns:a="http://schemas.openxmlformats.org/drawingml/2006/main"><a:graphicData uri="http://schemas.openxmlformats.org/drawingml/2006/picture"><pic:pic xmlns:pic="http://schemas.openxmlformats.org/drawingml/2006/picture"><pic:nvPicPr><pic:cNvPr id="837020129" name="Picture 837020129"/><pic:cNvPicPr/></pic:nvPicPr><pic:blipFill><a:blip r:embed="rId6"/><a:stretch><a:fillRect/></a:stretch></pic:blipFill><pic:spPr><a:xfrm><a:off x="0" y="0"/><a:ext cx="965200" cy="1276350"/></a:xfrm><a:prstGeom prst="rect"><a:avLst/></a:prstGeom></pic:spPr></pic:pic></a:graphicData></a:graphic><wp14:sizeRelH relativeFrom="margin"><wp14:pctWidth>0</wp14:pctWidth></wp14:sizeRelH></wp:anchor></w:drawing></w:r></w:p><w:p><w:pPr><w:jc w:val="center"/><w:rPr><w:b/><w:sz w:val="24"/></w:rPr></w:pPr></w:p><w:p><w:pPr><w:jc w:val="center"/></w:pPr><w:r><w:rPr><w:b/><w:sz w:val="24"/></w:rPr><w:t>SUKU DINAS SUMBER DAYA AIR</w:t></w:r><w:r><w:rPr><w:b/><w:sz w:val="24"/></w:rPr><w:br/><w:t>PEMERINTAH KOTA ADMINISTRASI JAKARTA UTARA</w:t></w:r><w:r><w:rPr><w:b/><w:sz w:val="24"/></w:rPr><w:br/></w:r></w:p><w:p><w:pPr><w:jc w:val="center"/></w:pPr><w:r><w:rPr><w:b/></w:rPr><w:t>SURAT PERINTAH TUGAS</w:t></w:r><w:r><w:rPr><w:b/></w:rPr><w:br/><w:t>NOMOR: [NOMOR SPT]</w:t></w:r><w:r><w:rPr><w:b/></w:rPr><w:br/><w:t>TENTANG</w:t></w:r><w:r><w:rPr><w:b/></w:rPr><w:br/><w:t>PELAKSANAAN SWAKELOLA TIPE I [NAMA PEKERJAAN] TAHUN ANGGARAN 2026</w:t></w:r></w:p><w:p><w:r><w:t>Berdasarkan:</w:t></w:r></w:p><w:p><w:pPr><w:ind w:left="360" w:hanging="360"/></w:pPr><w:r><w:t>1. Peraturan Presiden Nomor 16 Tahun 2018 tentang Pengadaan Barang/Jasa Pemerintah sebagaimana telah beberapa kali diubah, terakhir dengan Peraturan Presiden Nomor 46 Tahun 2025 tentang Perubahan Kedua atas Peraturan Presiden Nomor 16 Tahun 2018 tentang Pengadaan Barang/Jasa Pemerintah;</w:t></w:r></w:p><w:p><w:pPr><w:ind w:left="360" w:hanging="360"/></w:pPr><w:r><w:t>2. Peraturan Lembaga Kebijakan Pengadaan Barang/Jasa Pemerintah Nomor 3 Tahun 2021 tentang Pedoman Swakelola;</w:t></w:r></w:p><w:p><w:pPr><w:ind w:left="360" w:hanging="360"/></w:pPr><w:r><w:t>3. Peraturan Daerah Provinsi DKI Jakarta Nomor 4 Tahun 2025 tentang Anggaran Pendapatan dan Belanja Daerah Tahun Anggaran 2026;</w:t></w:r></w:p><w:p><w:pPr><w:ind w:left="360" w:hanging="360"/></w:pPr><w:r><w:t>4. Dokumen Pelaksanaan Anggaran Satuan Kerja Perangkat Daerah (DPA-SKPD) Suku Dinas Sumber Daya Air Kota Administrasi Jakarta Utara Tahun Anggaran 2026 Nomor [NOMOR DPA] tanggal [TANGGAL DPA];</w:t></w:r></w:p><w:p><w:pPr><w:ind w:left="360" w:hanging="360"/></w:pPr><w:r><w:t>5. Keputusan Kepala Dinas Sumber Daya Air Provinsi DKI Jakarta Nomor 1445 Tahun 2026 tentang Pelimpahan Sebagian Kewenangan Pengguna Anggaran kepada Kuasa Pengguna Anggaran pada Dinas Sumber Daya Air Provinsi DKI Jakarta Tahun Anggaran 2026.</w:t></w:r></w:p><w:p><w:r><w:t>maka Kepala Suku Dinas Sumber Daya Air Kota Administrasi Jakarta Utara selaku Kuasa Pengguna Anggaran dengan ini:</w:t></w:r></w:p><w:p><w:pPr><w:jc w:val="center"/></w:pPr><w:r><w:rPr><w:b/></w:rPr><w:t>MEMERINTAHKAN:</w:t></w:r></w:p><w:p><w:pPr><w:tabs><w:tab w:val="left" w:pos="2160"/></w:tabs></w:pPr><w:r><w:t>Kepada</w:t></w:r><w:r><w:tab/><w:t>:</w:t></w:r><w:r><w:br/><w:t>Nama</w:t></w:r><w:r><w:tab/><w:t>: [NAMA PENERIMA PERINTAH]</w:t></w:r><w:r><w:br/><w:t>NIP/NRK</w:t></w:r><w:r><w:tab/><w:t>: [NIP/NRK]</w:t></w:r></w:p><w:p><w:pPr><w:tabs><w:tab w:val="left" w:pos="2520"/></w:tabs><w:spacing w:after="0" w:line="240" w:lineRule="auto"/></w:pPr><w:proofErr w:type="spellStart"/><w:r><w:lastRenderedPageBreak/><w:t>Jabatan</w:t></w:r><w:proofErr w:type="spellEnd"/><w:r><w:tab/><w:t xml:space="preserve">: [KEPALA SATUAN PELAKSANA KECAMATAN ... / KEPALA </w:t></w:r></w:p><w:p><w:pPr><w:tabs><w:tab w:val="left" w:pos="2520"/></w:tabs><w:spacing w:after="0" w:line="240" w:lineRule="auto"/></w:pPr><w:r><w:tab/><w:t xml:space="preserve">   </w:t></w:r><w:r><w:t>SEKSI PEMELIHARAAN DRAINASE]</w:t></w:r><w:r><w:br/></w:r><w:proofErr w:type="spellStart"/><w:r><w:t>Kedudukan</w:t></w:r><w:proofErr w:type="spellEnd"/><w:r><w:tab/><w:t xml:space="preserve">: </w:t></w:r><w:proofErr w:type="spellStart"/><w:r><w:t>Ketua</w:t></w:r><w:proofErr w:type="spellEnd"/><w:r><w:t>/</w:t></w:r><w:proofErr w:type="spellStart"/><w:r><w:t>Koordinator</w:t></w:r><w:proofErr w:type="spellEnd"/><w:r><w:t xml:space="preserve"> Tim Pelaksana Swakelola </w:t></w:r><w:proofErr w:type="spellStart"/><w:r><w:t>Tipe</w:t></w:r><w:proofErr w:type="spellEnd"/><w:r><w:t xml:space="preserve"> I</w:t></w:r><w:r><w:br/></w:r></w:p><w:p><w:proofErr w:type="spellStart"/><w:r><w:t>Untuk</w:t></w:r><w:proofErr w:type="spellEnd"/><w:r><w:t xml:space="preserve"> </w:t></w:r><w:proofErr w:type="spellStart"/><w:r><w:t>melaksanakan</w:t></w:r><w:proofErr w:type="spellEnd"/><w:r><w:t xml:space="preserve"> </w:t></w:r><w:proofErr w:type="spellStart"/><w:r><w:t>pekerjaan</w:t></w:r><w:proofErr w:type="spellEnd"/><w:r><w:t xml:space="preserve"> </w:t></w:r><w:proofErr w:type="spellStart"/><w:r><w:t>Swakelola</w:t></w:r><w:proofErr w:type="spellEnd"/><w:r><w:t xml:space="preserve"> </w:t></w:r><w:proofErr w:type="spellStart"/><w:r><w:t>Tipe</w:t></w:r><w:proofErr w:type="spellEnd"/><w:r><w:t xml:space="preserve"> I </w:t></w:r><w:proofErr w:type="spellStart"/><w:r><w:t>dengan</w:t></w:r><w:proofErr w:type="spellEnd"/><w:r><w:t xml:space="preserve"> data </w:t></w:r><w:proofErr w:type="spellStart"/><w:r><w:t>sebagai</w:t></w:r><w:proofErr w:type="spellEnd"/><w:r><w:t xml:space="preserve"> </w:t></w:r><w:proofErr w:type="spellStart"/><w:r><w:t>berikut</w:t></w:r><w:proofErr w:type="spellEnd"/><w:r><w:t>:</w:t></w:r></w:p><w:p><w:pPr><w:tabs><w:tab w:val="left" w:pos="2520"/></w:tabs></w:pPr><w:r><w:t>Nama Program</w:t></w:r><w:r><w:tab/><w:t>: [SESUAI DPA]</w:t></w:r><w:r><w:br/><w:t xml:space="preserve">Nama </w:t></w:r><w:proofErr w:type="spellStart"/><w:r><w:t>Kegiatan</w:t></w:r><w:proofErr w:type="spellEnd"/><w:r><w:tab/><w:t>: [SESUAI DPA]</w:t></w:r><w:r><w:br/><w:t xml:space="preserve">Nama </w:t></w:r><w:proofErr w:type="spellStart"/><w:r><w:t>Subkegiatan</w:t></w:r><w:proofErr w:type="spellEnd"/><w:r><w:tab/><w:t>: [SESUAI DPA]</w:t></w:r><w:r><w:br/></w:r><w:proofErr w:type="spellStart"/><w:r><w:t>Nomor</w:t></w:r><w:proofErr w:type="spellEnd"/><w:r><w:t xml:space="preserve">/Kode </w:t></w:r><w:proofErr w:type="spellStart"/><w:r><w:t>Kegiatan</w:t></w:r><w:proofErr w:type="spellEnd"/><w:r><w:tab/><w:t>: [SESUAI DPA]</w:t></w:r><w:r><w:br/><w:t xml:space="preserve">Kode </w:t></w:r><w:proofErr w:type="spellStart"/><w:r><w:t>Rekening</w:t></w:r><w:proofErr w:type="spellEnd"/><w:r><w:tab/><w:t>: [SESUAI DPA]</w:t></w:r><w:r><w:br/><w:t xml:space="preserve">Jenis </w:t></w:r><w:proofErr w:type="spellStart"/><w:r><w:t>Pekerjaan</w:t></w:r><w:proofErr w:type="spellEnd"/><w:r><w:tab/><w:t xml:space="preserve">: </w:t></w:r><w:proofErr w:type="spellStart"/><w:r><w:t>Perbaikan</w:t></w:r><w:proofErr w:type="spellEnd"/><w:r><w:t xml:space="preserve"> dan </w:t></w:r><w:proofErr w:type="spellStart"/><w:r><w:t>Pengurasan</w:t></w:r><w:proofErr w:type="spellEnd"/><w:r><w:t xml:space="preserve"> </w:t></w:r><w:proofErr w:type="spellStart"/><w:r><w:t>Saluran</w:t></w:r><w:proofErr w:type="spellEnd"/><w:r><w:t xml:space="preserve"> / [SESUAI PAKET]</w:t></w:r><w:r><w:br/><w:t>Lokasi</w:t></w:r><w:r><w:tab/><w:t>: [LOKASI]</w:t></w:r><w:r><w:br/></w:r><w:proofErr w:type="spellStart"/><w:r><w:t>Tahun</w:t></w:r><w:proofErr w:type="spellEnd"/><w:r><w:t xml:space="preserve"> </w:t></w:r><w:proofErr w:type="spellStart"/><w:r><w:t>Anggaran</w:t></w:r><w:proofErr w:type="spellEnd"/><w:r><w:tab/><w:t>: 2026</w:t></w:r></w:p><w:p><w:r><w:rPr><w:b/></w:rPr><w:t xml:space="preserve">I. </w:t></w:r><w:proofErr w:type="spellStart"/><w:r><w:rPr><w:b/></w:rPr><w:t>Dokumen</w:t></w:r><w:proofErr w:type="spellEnd"/><w:r><w:rPr><w:b/></w:rPr><w:t xml:space="preserve"> Teknis dan </w:t></w:r><w:proofErr w:type="spellStart"/><w:r><w:rPr><w:b/></w:rPr><w:t>Administratif</w:t></w:r><w:proofErr w:type="spellEnd"/></w:p><w:p><w:pPr><w:ind w:left="360" w:hanging="360"/></w:pPr><w:r><w:t xml:space="preserve">1. Gambar </w:t></w:r><w:proofErr w:type="spellStart"/><w:r><w:t>kerja</w:t></w:r><w:proofErr w:type="spellEnd"/><w:r><w:t xml:space="preserve"> yang </w:t></w:r><w:proofErr w:type="spellStart"/><w:r><w:t>telah</w:t></w:r><w:proofErr w:type="spellEnd"/><w:r><w:t xml:space="preserve"> </w:t></w:r><w:proofErr w:type="spellStart"/><w:r><w:t>ditetapkan</w:t></w:r><w:proofErr w:type="spellEnd"/><w:r><w:t>;</w:t></w:r></w:p><w:p><w:pPr><w:ind w:left="360" w:hanging="360"/></w:pPr><w:r><w:t>2. Berita acara/</w:t></w:r><w:proofErr w:type="spellStart"/><w:r><w:t>perhitungan</w:t></w:r><w:proofErr w:type="spellEnd"/><w:r><w:t xml:space="preserve"> volume </w:t></w:r><w:proofErr w:type="spellStart"/><w:r><w:t>pekerjaan</w:t></w:r><w:proofErr w:type="spellEnd"/><w:r><w:t>;</w:t></w:r></w:p><w:p><w:pPr><w:ind w:left="360" w:hanging="360"/></w:pPr><w:r><w:t xml:space="preserve">3. </w:t></w:r><w:proofErr w:type="spellStart"/><w:r><w:t>Rencana</w:t></w:r><w:proofErr w:type="spellEnd"/><w:r><w:t xml:space="preserve"> </w:t></w:r><w:proofErr w:type="spellStart"/><w:r><w:t>kebutuhan</w:t></w:r><w:proofErr w:type="spellEnd"/><w:r><w:t xml:space="preserve"> </w:t></w:r><w:proofErr w:type="spellStart"/><w:r><w:t>bahan</w:t></w:r><w:proofErr w:type="spellEnd"/><w:r><w:t xml:space="preserve">/material dan </w:t></w:r><w:proofErr w:type="spellStart"/><w:r><w:t>peralatan</w:t></w:r><w:proofErr w:type="spellEnd"/><w:r><w:t>;</w:t></w:r></w:p><w:p><w:pPr><w:ind w:left="360" w:hanging="360"/></w:pPr><w:r><w:t xml:space="preserve">4. RAB dan </w:t></w:r><w:proofErr w:type="spellStart"/><w:r><w:t>jadwal</w:t></w:r><w:proofErr w:type="spellEnd"/><w:r><w:t xml:space="preserve"> </w:t></w:r><w:proofErr w:type="spellStart"/><w:r><w:t>pelaksanaan</w:t></w:r><w:proofErr w:type="spellEnd"/><w:r><w:t xml:space="preserve"> yang </w:t></w:r><w:proofErr w:type="spellStart"/><w:r><w:t>telah</w:t></w:r><w:proofErr w:type="spellEnd"/><w:r><w:t xml:space="preserve"> </w:t></w:r><w:proofErr w:type="spellStart"/><w:r><w:t>ditetapkan</w:t></w:r><w:proofErr w:type="spellEnd"/><w:r><w:t xml:space="preserve"> oleh PPK;</w:t></w:r></w:p><w:p><w:r><w:rPr><w:b/></w:rPr><w:t xml:space="preserve">II. </w:t></w:r><w:proofErr w:type="spellStart"/><w:r><w:rPr><w:b/></w:rPr><w:t>Ketentuan</w:t></w:r><w:proofErr w:type="spellEnd"/><w:r><w:rPr><w:b/></w:rPr><w:t xml:space="preserve"> </w:t></w:r><w:proofErr w:type="spellStart"/><w:r><w:rPr><w:b/></w:rPr><w:t>Pelaksanaan</w:t></w:r><w:proofErr w:type="spellEnd"/></w:p><w:p><w:pPr><w:ind w:left="360" w:hanging="360"/></w:pPr><w:r><w:t xml:space="preserve">1. </w:t></w:r><w:proofErr w:type="spellStart"/><w:r><w:t>Pekerjaan</w:t></w:r><w:proofErr w:type="spellEnd"/><w:r><w:t xml:space="preserve"> </w:t></w:r><w:proofErr w:type="spellStart"/><w:r><w:t>dilaksanakan</w:t></w:r><w:proofErr w:type="spellEnd"/><w:r><w:t xml:space="preserve"> oleh Tim </w:t></w:r><w:proofErr w:type="spellStart"/><w:r><w:t>Pelaksana</w:t></w:r><w:proofErr w:type="spellEnd"/><w:r><w:t xml:space="preserve"> Swakelola </w:t></w:r><w:proofErr w:type="spellStart"/><w:r><w:t>Tipe</w:t></w:r><w:proofErr w:type="spellEnd"/><w:r><w:t xml:space="preserve"> I </w:t></w:r><w:proofErr w:type="spellStart"/><w:r><w:t>sesuai</w:t></w:r><w:proofErr w:type="spellEnd"/><w:r><w:t xml:space="preserve"> Keputusan KPA dan </w:t></w:r><w:proofErr w:type="spellStart"/><w:r><w:t>dokumen</w:t></w:r><w:proofErr w:type="spellEnd"/><w:r><w:t xml:space="preserve"> </w:t></w:r><w:proofErr w:type="spellStart"/><w:r><w:t>persiapan</w:t></w:r><w:proofErr w:type="spellEnd"/><w:r><w:t xml:space="preserve"> </w:t></w:r><w:proofErr w:type="spellStart"/><w:r><w:t>Swakelola</w:t></w:r><w:proofErr w:type="spellEnd"/><w:r><w:t>.</w:t></w:r></w:p><w:p><w:pPr><w:ind w:left="360" w:hanging="360"/></w:pPr><w:r><w:t xml:space="preserve">2. </w:t></w:r><w:proofErr w:type="spellStart"/><w:r><w:t>Pelaksanaan</w:t></w:r><w:proofErr w:type="spellEnd"/><w:r><w:t xml:space="preserve"> </w:t></w:r><w:proofErr w:type="spellStart"/><w:r><w:t>dapat</w:t></w:r><w:proofErr w:type="spellEnd"/><w:r><w:t xml:space="preserve"> </w:t></w:r><w:proofErr w:type="spellStart"/><w:r><w:t>memanfaatkan</w:t></w:r><w:proofErr w:type="spellEnd"/><w:r><w:t xml:space="preserve"> </w:t></w:r><w:proofErr w:type="spellStart"/><w:r><w:t>tenaga</w:t></w:r><w:proofErr w:type="spellEnd"/><w:r><w:t xml:space="preserve"> </w:t></w:r><w:proofErr w:type="spellStart"/><w:r><w:t>pendukung</w:t></w:r><w:proofErr w:type="spellEnd"/><w:r><w:t xml:space="preserve">/PJLP, </w:t></w:r><w:proofErr w:type="spellStart"/><w:r><w:t>peralatan</w:t></w:r><w:proofErr w:type="spellEnd"/><w:r><w:t xml:space="preserve">, </w:t></w:r><w:proofErr w:type="spellStart"/><w:r><w:t>kendaraan</w:t></w:r><w:proofErr w:type="spellEnd"/><w:r><w:t xml:space="preserve"> </w:t></w:r><w:proofErr w:type="spellStart"/><w:r><w:t>dinas</w:t></w:r><w:proofErr w:type="spellEnd"/><w:r><w:t xml:space="preserve">, </w:t></w:r><w:proofErr w:type="spellStart"/><w:r><w:t>persediaan</w:t></w:r><w:proofErr w:type="spellEnd"/><w:r><w:t xml:space="preserve">, </w:t></w:r><w:proofErr w:type="spellStart"/><w:r><w:t>serta</w:t></w:r><w:proofErr w:type="spellEnd"/><w:r><w:t xml:space="preserve"> </w:t></w:r><w:proofErr w:type="spellStart"/><w:r><w:t>sumber</w:t></w:r><w:proofErr w:type="spellEnd"/><w:r><w:t xml:space="preserve"> </w:t></w:r><w:proofErr w:type="spellStart"/><w:r><w:t>daya</w:t></w:r><w:proofErr w:type="spellEnd"/><w:r><w:t xml:space="preserve"> lain yang </w:t></w:r><w:proofErr w:type="spellStart"/><w:r><w:t>tersedia</w:t></w:r><w:proofErr w:type="spellEnd"/><w:r><w:t xml:space="preserve"> </w:t></w:r><w:proofErr w:type="spellStart"/><w:r><w:t>sesuai</w:t></w:r><w:proofErr w:type="spellEnd"/><w:r><w:t xml:space="preserve"> </w:t></w:r><w:proofErr w:type="spellStart"/><w:r><w:t>penugasan</w:t></w:r><w:proofErr w:type="spellEnd"/><w:r><w:t xml:space="preserve">, </w:t></w:r><w:proofErr w:type="spellStart"/><w:r><w:t>kontrak</w:t></w:r><w:proofErr w:type="spellEnd"/><w:r><w:t xml:space="preserve">, dan </w:t></w:r><w:proofErr w:type="spellStart"/><w:r><w:t>ketentuan</w:t></w:r><w:proofErr w:type="spellEnd"/><w:r><w:t xml:space="preserve"> yang </w:t></w:r><w:proofErr w:type="spellStart"/><w:r><w:t>berlaku</w:t></w:r><w:proofErr w:type="spellEnd"/><w:r><w:t>.</w:t></w:r></w:p><w:p><w:pPr><w:ind w:left="360" w:hanging="360"/></w:pPr><w:r><w:t xml:space="preserve">3. </w:t></w:r><w:proofErr w:type="spellStart"/><w:r><w:t>Apabila</w:t></w:r><w:proofErr w:type="spellEnd"/><w:r><w:t xml:space="preserve"> </w:t></w:r><w:proofErr w:type="spellStart"/><w:r><w:t>diperlukan</w:t></w:r><w:proofErr w:type="spellEnd"/><w:r><w:t xml:space="preserve"> </w:t></w:r><w:proofErr w:type="spellStart"/><w:r><w:t>pengadaan</w:t></w:r><w:proofErr w:type="spellEnd"/><w:r><w:t xml:space="preserve"> </w:t></w:r><w:proofErr w:type="spellStart"/><w:r><w:t>barang</w:t></w:r><w:proofErr w:type="spellEnd"/><w:r><w:t>/</w:t></w:r><w:proofErr w:type="spellStart"/><w:r><w:t>jasa</w:t></w:r><w:proofErr w:type="spellEnd"/><w:r><w:t xml:space="preserve"> </w:t></w:r><w:proofErr w:type="spellStart"/><w:r><w:t>melalui</w:t></w:r><w:proofErr w:type="spellEnd"/><w:r><w:t xml:space="preserve"> </w:t></w:r><w:proofErr w:type="spellStart"/><w:r><w:t>Penyedia</w:t></w:r><w:proofErr w:type="spellEnd"/><w:r><w:t xml:space="preserve"> </w:t></w:r><w:proofErr w:type="spellStart"/><w:r><w:t>sebagai</w:t></w:r><w:proofErr w:type="spellEnd"/><w:r><w:t xml:space="preserve"> </w:t></w:r><w:proofErr w:type="spellStart"/><w:r><w:t>bagian</w:t></w:r><w:proofErr w:type="spellEnd"/><w:r><w:t xml:space="preserve"> </w:t></w:r><w:proofErr w:type="spellStart"/><w:r><w:t>pendukung</w:t></w:r><w:proofErr w:type="spellEnd"/><w:r><w:t xml:space="preserve"> </w:t></w:r><w:proofErr w:type="spellStart"/><w:r><w:t>Swakelola</w:t></w:r><w:proofErr w:type="spellEnd"/><w:r><w:t xml:space="preserve">, proses </w:t></w:r><w:proofErr w:type="spellStart"/><w:r><w:t>pengadaannya</w:t></w:r><w:proofErr w:type="spellEnd"/><w:r><w:t xml:space="preserve"> </w:t></w:r><w:proofErr w:type="spellStart"/><w:r><w:t>dilaksanakan</w:t></w:r><w:proofErr w:type="spellEnd"/><w:r><w:t xml:space="preserve"> </w:t></w:r><w:proofErr w:type="spellStart"/><w:r><w:t>secara</w:t></w:r><w:proofErr w:type="spellEnd"/><w:r><w:t xml:space="preserve"> </w:t></w:r><w:proofErr w:type="spellStart"/><w:r><w:t>terpisah</w:t></w:r><w:proofErr w:type="spellEnd"/><w:r><w:t xml:space="preserve"> </w:t></w:r><w:proofErr w:type="spellStart"/><w:r><w:t>sesuai</w:t></w:r><w:proofErr w:type="spellEnd"/><w:r><w:t xml:space="preserve"> </w:t></w:r><w:proofErr w:type="spellStart"/><w:r><w:t>ketentuan</w:t></w:r><w:proofErr w:type="spellEnd"/><w:r><w:t xml:space="preserve"> </w:t></w:r><w:proofErr w:type="spellStart"/><w:r><w:t>Pengadaan</w:t></w:r><w:proofErr w:type="spellEnd"/><w:r><w:t xml:space="preserve"> Barang/Jasa </w:t></w:r><w:proofErr w:type="spellStart"/><w:r><w:t>Pemerintah</w:t></w:r><w:proofErr w:type="spellEnd"/><w:r><w:t>.</w:t></w:r></w:p><w:p><w:pPr><w:ind w:left="360" w:hanging="360"/></w:pPr><w:r><w:t xml:space="preserve">4. Bahan/material </w:t></w:r><w:proofErr w:type="spellStart"/><w:r><w:t>wajib</w:t></w:r><w:proofErr w:type="spellEnd"/><w:r><w:t xml:space="preserve"> </w:t></w:r><w:proofErr w:type="spellStart"/><w:r><w:t>dicatat</w:t></w:r><w:proofErr w:type="spellEnd"/><w:r><w:t xml:space="preserve"> </w:t></w:r><w:proofErr w:type="spellStart"/><w:r><w:t>penerimaan</w:t></w:r><w:proofErr w:type="spellEnd"/><w:r><w:t xml:space="preserve">, </w:t></w:r><w:proofErr w:type="spellStart"/><w:r><w:t>penggunaan</w:t></w:r><w:proofErr w:type="spellEnd"/><w:r><w:t xml:space="preserve">, </w:t></w:r><w:proofErr w:type="spellStart"/><w:r><w:t>sisa</w:t></w:r><w:proofErr w:type="spellEnd"/><w:r><w:t xml:space="preserve">, dan </w:t></w:r><w:proofErr w:type="spellStart"/><w:r><w:t>lokasinya</w:t></w:r><w:proofErr w:type="spellEnd"/><w:r><w:t xml:space="preserve"> </w:t></w:r><w:proofErr w:type="spellStart"/><w:r><w:t>serta</w:t></w:r><w:proofErr w:type="spellEnd"/><w:r><w:t xml:space="preserve"> </w:t></w:r><w:proofErr w:type="spellStart"/><w:r><w:t>didukung</w:t></w:r><w:proofErr w:type="spellEnd"/><w:r><w:t xml:space="preserve"> </w:t></w:r><w:proofErr w:type="spellStart"/><w:r><w:t>dokumen</w:t></w:r><w:proofErr w:type="spellEnd"/><w:r><w:t xml:space="preserve"> </w:t></w:r><w:proofErr w:type="spellStart"/><w:r><w:t>persediaan</w:t></w:r><w:proofErr w:type="spellEnd"/><w:r><w:t xml:space="preserve"> yang </w:t></w:r><w:proofErr w:type="spellStart"/><w:r><w:t>dapat</w:t></w:r><w:proofErr w:type="spellEnd"/><w:r><w:t xml:space="preserve"> </w:t></w:r><w:proofErr w:type="spellStart"/><w:r><w:t>ditelusuri</w:t></w:r><w:proofErr w:type="spellEnd"/><w:r><w:t>.</w:t></w:r></w:p><w:p><w:pPr><w:ind w:left="360" w:hanging="360"/></w:pPr><w:r><w:t xml:space="preserve">5. </w:t></w:r><w:proofErr w:type="spellStart"/><w:r><w:t>Pelaksanaan</w:t></w:r><w:proofErr w:type="spellEnd"/><w:r><w:t xml:space="preserve"> </w:t></w:r><w:proofErr w:type="spellStart"/><w:r><w:t>pekerjaan</w:t></w:r><w:proofErr w:type="spellEnd"/><w:r><w:t xml:space="preserve"> </w:t></w:r><w:proofErr w:type="spellStart"/><w:r><w:t>wajib</w:t></w:r><w:proofErr w:type="spellEnd"/><w:r><w:t xml:space="preserve"> </w:t></w:r><w:proofErr w:type="spellStart"/><w:r><w:t>memperhatikan</w:t></w:r><w:proofErr w:type="spellEnd"/><w:r><w:t xml:space="preserve"> </w:t></w:r><w:proofErr w:type="spellStart"/><w:r><w:t>keselamatan</w:t></w:r><w:proofErr w:type="spellEnd"/><w:r><w:t xml:space="preserve"> </w:t></w:r><w:proofErr w:type="spellStart"/><w:r><w:t>kerja</w:t></w:r><w:proofErr w:type="spellEnd"/><w:r><w:t xml:space="preserve">, </w:t></w:r><w:proofErr w:type="spellStart"/><w:r><w:t>pengamanan</w:t></w:r><w:proofErr w:type="spellEnd"/><w:r><w:t xml:space="preserve"> </w:t></w:r><w:proofErr w:type="spellStart"/><w:r><w:t>aset</w:t></w:r><w:proofErr w:type="spellEnd"/><w:r><w:t>/</w:t></w:r><w:proofErr w:type="spellStart"/><w:r><w:t>peralatan</w:t></w:r><w:proofErr w:type="spellEnd"/><w:r><w:t xml:space="preserve">, </w:t></w:r><w:proofErr w:type="spellStart"/><w:r><w:t>kebersihan</w:t></w:r><w:proofErr w:type="spellEnd"/><w:r><w:t xml:space="preserve"> </w:t></w:r><w:proofErr w:type="spellStart"/><w:r><w:t>lokasi</w:t></w:r><w:proofErr w:type="spellEnd"/><w:r><w:t xml:space="preserve">, dan </w:t></w:r><w:proofErr w:type="spellStart"/><w:r><w:t>pengendalian</w:t></w:r><w:proofErr w:type="spellEnd"/><w:r><w:t xml:space="preserve"> </w:t></w:r><w:proofErr w:type="spellStart"/><w:r><w:t>dampak</w:t></w:r><w:proofErr w:type="spellEnd"/><w:r><w:t xml:space="preserve"> </w:t></w:r><w:proofErr w:type="spellStart"/><w:r><w:t>terhadap</w:t></w:r><w:proofErr w:type="spellEnd"/><w:r><w:t xml:space="preserve"> </w:t></w:r><w:proofErr w:type="spellStart"/><w:r><w:t>masyarakat</w:t></w:r><w:proofErr w:type="spellEnd"/><w:r><w:t>/</w:t></w:r><w:proofErr w:type="spellStart"/><w:r><w:t>lingkungan</w:t></w:r><w:proofErr w:type="spellEnd"/><w:r><w:t xml:space="preserve"> </w:t></w:r><w:proofErr w:type="spellStart"/><w:r><w:t>sekitar</w:t></w:r><w:proofErr w:type="spellEnd"/><w:r><w:t>.</w:t></w:r></w:p><w:p><w:pPr><w:ind w:left="360" w:hanging="360"/></w:pPr><w:r><w:t xml:space="preserve">6. </w:t></w:r><w:proofErr w:type="spellStart"/><w:r><w:t>Setiap</w:t></w:r><w:proofErr w:type="spellEnd"/><w:r><w:t xml:space="preserve"> </w:t></w:r><w:proofErr w:type="spellStart"/><w:r><w:t>perubahan</w:t></w:r><w:proofErr w:type="spellEnd"/><w:r><w:t xml:space="preserve"> volume, </w:t></w:r><w:proofErr w:type="spellStart"/><w:r><w:t>lokasi</w:t></w:r><w:proofErr w:type="spellEnd"/><w:r><w:t xml:space="preserve">, </w:t></w:r><w:proofErr w:type="spellStart"/><w:r><w:t>metode</w:t></w:r><w:proofErr w:type="spellEnd"/><w:r><w:t xml:space="preserve">, </w:t></w:r><w:proofErr w:type="spellStart"/><w:r><w:t>atau</w:t></w:r><w:proofErr w:type="spellEnd"/><w:r><w:t xml:space="preserve"> </w:t></w:r><w:proofErr w:type="spellStart"/><w:r><w:t>kebutuhan</w:t></w:r><w:proofErr w:type="spellEnd"/><w:r><w:t xml:space="preserve"> </w:t></w:r><w:proofErr w:type="spellStart"/><w:r><w:t>sumber</w:t></w:r><w:proofErr w:type="spellEnd"/><w:r><w:t xml:space="preserve"> </w:t></w:r><w:proofErr w:type="spellStart"/><w:r><w:t>daya</w:t></w:r><w:proofErr w:type="spellEnd"/><w:r><w:t xml:space="preserve"> yang </w:t></w:r><w:proofErr w:type="spellStart"/><w:r><w:t>bersifat</w:t></w:r><w:proofErr w:type="spellEnd"/><w:r><w:t xml:space="preserve"> material </w:t></w:r><w:proofErr w:type="spellStart"/><w:r><w:t>harus</w:t></w:r><w:proofErr w:type="spellEnd"/><w:r><w:t xml:space="preserve"> </w:t></w:r><w:proofErr w:type="spellStart"/><w:r><w:t>dikoordinasikan</w:t></w:r><w:proofErr w:type="spellEnd"/><w:r><w:t xml:space="preserve"> dan </w:t></w:r><w:proofErr w:type="spellStart"/><w:r><w:t>memperoleh</w:t></w:r><w:proofErr w:type="spellEnd"/><w:r><w:t xml:space="preserve"> </w:t></w:r><w:proofErr w:type="spellStart"/><w:r><w:t>persetujuan</w:t></w:r><w:proofErr w:type="spellEnd"/><w:r><w:t xml:space="preserve"> </w:t></w:r><w:proofErr w:type="spellStart"/><w:r><w:t>pejabat</w:t></w:r><w:proofErr w:type="spellEnd"/><w:r><w:t xml:space="preserve"> yang </w:t></w:r><w:proofErr w:type="spellStart"/><w:r><w:t>berwenang</w:t></w:r><w:proofErr w:type="spellEnd"/><w:r><w:t xml:space="preserve"> </w:t></w:r><w:proofErr w:type="spellStart"/><w:r><w:t>sebelum</w:t></w:r><w:proofErr w:type="spellEnd"/><w:r><w:t xml:space="preserve"> </w:t></w:r><w:proofErr w:type="spellStart"/><w:r><w:t>dilaksanakan</w:t></w:r><w:proofErr w:type="spellEnd"/><w:r><w:t>.</w:t></w:r></w:p><w:p><w:pPr><w:tabs><w:tab w:val="left" w:pos="2160"/></w:tabs></w:pPr><w:r><w:rPr><w:b/></w:rPr><w:lastRenderedPageBreak/><w:t xml:space="preserve">III. </w:t></w:r><w:proofErr w:type="spellStart"/><w:r><w:rPr><w:b/></w:rPr><w:t>Pelaporan</w:t></w:r><w:proofErr w:type="spellEnd"/><w:r><w:rPr><w:b/></w:rPr><w:t xml:space="preserve"> dan </w:t></w:r><w:proofErr w:type="spellStart"/><w:r><w:rPr><w:b/></w:rPr><w:t>Pengawasan</w:t></w:r><w:proofErr w:type="spellEnd"/></w:p><w:p><w:pPr><w:tabs><w:tab w:val="left" w:pos="2160"/></w:tabs></w:pPr><w:r><w:t xml:space="preserve">1. Tim Pelaksana </w:t></w:r><w:proofErr w:type="spellStart"/><w:r><w:t>mencatat</w:t></w:r><w:proofErr w:type="spellEnd"/><w:r><w:t xml:space="preserve"> dan </w:t></w:r><w:proofErr w:type="spellStart"/><w:r><w:t>melaporkan</w:t></w:r><w:proofErr w:type="spellEnd"/><w:r><w:t xml:space="preserve"> </w:t></w:r><w:proofErr w:type="spellStart"/><w:r><w:t>kemajuan</w:t></w:r><w:proofErr w:type="spellEnd"/><w:r><w:t xml:space="preserve"> </w:t></w:r><w:proofErr w:type="spellStart"/><w:r><w:t>fisik</w:t></w:r><w:proofErr w:type="spellEnd"/><w:r><w:t xml:space="preserve">, </w:t></w:r><w:proofErr w:type="spellStart"/><w:r><w:t>penggunaan</w:t></w:r><w:proofErr w:type="spellEnd"/><w:r><w:t xml:space="preserve"> </w:t></w:r><w:proofErr w:type="spellStart"/><w:r><w:t>tenaga</w:t></w:r><w:proofErr w:type="spellEnd"/><w:r><w:t xml:space="preserve"> </w:t></w:r><w:proofErr w:type="spellStart"/><w:r><w:t>kerja</w:t></w:r><w:proofErr w:type="spellEnd"/><w:r><w:t xml:space="preserve">, </w:t></w:r><w:proofErr w:type="spellStart"/><w:r><w:t>bahan</w:t></w:r><w:proofErr w:type="spellEnd"/><w:r><w:t xml:space="preserve">/material, </w:t></w:r><w:proofErr w:type="spellStart"/><w:r><w:t>peralatan</w:t></w:r><w:proofErr w:type="spellEnd"/><w:r><w:t xml:space="preserve">, </w:t></w:r><w:proofErr w:type="spellStart"/><w:r><w:t>kendala</w:t></w:r><w:proofErr w:type="spellEnd"/><w:r><w:t xml:space="preserve">, </w:t></w:r><w:proofErr w:type="spellStart"/><w:r><w:t>tindakan</w:t></w:r><w:proofErr w:type="spellEnd"/><w:r><w:t xml:space="preserve"> </w:t></w:r><w:proofErr w:type="spellStart"/><w:r><w:t>korektif</w:t></w:r><w:proofErr w:type="spellEnd"/><w:r><w:t>.</w:t></w:r></w:p><w:p><w:pPr><w:tabs><w:tab w:val="left" w:pos="2160"/></w:tabs></w:pPr><w:r><w:t xml:space="preserve">2. </w:t></w:r><w:proofErr w:type="spellStart"/><w:r><w:t>Laporan</w:t></w:r><w:proofErr w:type="spellEnd"/><w:r><w:t xml:space="preserve"> </w:t></w:r><w:proofErr w:type="spellStart"/><w:r><w:t>pelaksanaan</w:t></w:r><w:proofErr w:type="spellEnd"/><w:r><w:t xml:space="preserve"> </w:t></w:r><w:proofErr w:type="spellStart"/><w:r><w:t>dilengkapi</w:t></w:r><w:proofErr w:type="spellEnd"/><w:r><w:t xml:space="preserve"> </w:t></w:r><w:proofErr w:type="spellStart"/><w:r><w:t>dokumentasi</w:t></w:r><w:proofErr w:type="spellEnd"/><w:r><w:t xml:space="preserve"> </w:t></w:r><w:proofErr w:type="spellStart"/><w:r><w:t>foto</w:t></w:r><w:proofErr w:type="spellEnd"/><w:r><w:t xml:space="preserve"> </w:t></w:r><w:proofErr w:type="spellStart"/><w:r><w:t>sebelum</w:t></w:r><w:proofErr w:type="spellEnd"/><w:r><w:t xml:space="preserve">, </w:t></w:r><w:proofErr w:type="spellStart"/><w:r><w:t>selama</w:t></w:r><w:proofErr w:type="spellEnd"/><w:r><w:t xml:space="preserve">, dan </w:t></w:r><w:proofErr w:type="spellStart"/><w:r><w:t>sesudah</w:t></w:r><w:proofErr w:type="spellEnd"/><w:r><w:t xml:space="preserve"> </w:t></w:r><w:proofErr w:type="spellStart"/><w:r><w:t>pekerjaan</w:t></w:r><w:proofErr w:type="spellEnd"/><w:r><w:t xml:space="preserve">, </w:t></w:r><w:proofErr w:type="spellStart"/><w:r><w:t>rekap</w:t></w:r><w:proofErr w:type="spellEnd"/><w:r><w:t xml:space="preserve"> </w:t></w:r><w:proofErr w:type="spellStart"/><w:r><w:t>penggunaan</w:t></w:r><w:proofErr w:type="spellEnd"/><w:r><w:t xml:space="preserve"> </w:t></w:r><w:proofErr w:type="spellStart"/><w:r><w:t>bahan</w:t></w:r><w:proofErr w:type="spellEnd"/><w:r><w:t xml:space="preserve">/material, </w:t></w:r><w:proofErr w:type="spellStart"/><w:r><w:t>serta</w:t></w:r><w:proofErr w:type="spellEnd"/><w:r><w:t xml:space="preserve"> </w:t></w:r><w:proofErr w:type="spellStart"/><w:r><w:t>dokumen</w:t></w:r><w:proofErr w:type="spellEnd"/><w:r><w:t xml:space="preserve"> </w:t></w:r><w:proofErr w:type="spellStart"/><w:r><w:t>pendukung</w:t></w:r><w:proofErr w:type="spellEnd"/><w:r><w:t xml:space="preserve"> </w:t></w:r><w:proofErr w:type="spellStart"/><w:r><w:t>lainnya</w:t></w:r><w:proofErr w:type="spellEnd"/><w:r><w:t>.</w:t></w:r></w:p><w:p><w:pPr><w:tabs><w:tab w:val="left" w:pos="2160"/></w:tabs></w:pPr><w:r><w:t xml:space="preserve">3. Tim </w:t></w:r><w:proofErr w:type="spellStart"/><w:r><w:t>Pengawas</w:t></w:r><w:proofErr w:type="spellEnd"/><w:r><w:t xml:space="preserve"> </w:t></w:r><w:proofErr w:type="spellStart"/><w:r><w:t>melakukan</w:t></w:r><w:proofErr w:type="spellEnd"/><w:r><w:t xml:space="preserve"> </w:t></w:r><w:proofErr w:type="spellStart"/><w:r><w:t>pengawasan</w:t></w:r><w:proofErr w:type="spellEnd"/><w:r><w:t xml:space="preserve"> </w:t></w:r><w:proofErr w:type="spellStart"/><w:r><w:t>administrasi</w:t></w:r><w:proofErr w:type="spellEnd"/><w:r><w:t xml:space="preserve">, </w:t></w:r><w:proofErr w:type="spellStart"/><w:r><w:t>teknis</w:t></w:r><w:proofErr w:type="spellEnd"/><w:r><w:t xml:space="preserve">, </w:t></w:r><w:proofErr w:type="spellStart"/><w:r><w:t>serta</w:t></w:r><w:proofErr w:type="spellEnd"/><w:r><w:t xml:space="preserve"> </w:t></w:r><w:proofErr w:type="spellStart"/><w:r><w:t>menyusun</w:t></w:r><w:proofErr w:type="spellEnd"/><w:r><w:t xml:space="preserve"> Berita Acara Hasil </w:t></w:r><w:proofErr w:type="spellStart"/><w:r><w:t>Pemeriksaan</w:t></w:r><w:proofErr w:type="spellEnd"/><w:r><w:t>.</w:t></w:r></w:p><w:p><w:pPr><w:tabs><w:tab w:val="left" w:pos="2160"/></w:tabs></w:pPr><w:r><w:t xml:space="preserve">4. </w:t></w:r><w:proofErr w:type="spellStart"/><w:r><w:t>Setelah</w:t></w:r><w:proofErr w:type="spellEnd"/><w:r><w:t xml:space="preserve"> </w:t></w:r><w:proofErr w:type="spellStart"/><w:r><w:t>hasil</w:t></w:r><w:proofErr w:type="spellEnd"/><w:r><w:t xml:space="preserve"> </w:t></w:r><w:proofErr w:type="spellStart"/><w:r><w:t>pekerjaan</w:t></w:r><w:proofErr w:type="spellEnd"/><w:r><w:t xml:space="preserve"> </w:t></w:r><w:proofErr w:type="spellStart"/><w:r><w:t>dinyatakan</w:t></w:r><w:proofErr w:type="spellEnd"/><w:r><w:t xml:space="preserve"> </w:t></w:r><w:proofErr w:type="spellStart"/><w:r><w:t>sesuai</w:t></w:r><w:proofErr w:type="spellEnd"/><w:r><w:t xml:space="preserve"> </w:t></w:r><w:proofErr w:type="spellStart"/><w:r><w:t>berdasarkan</w:t></w:r><w:proofErr w:type="spellEnd"/><w:r><w:t xml:space="preserve"> </w:t></w:r><w:proofErr w:type="spellStart"/><w:r><w:t>pemeriksaan</w:t></w:r><w:proofErr w:type="spellEnd"/><w:r><w:t xml:space="preserve"> Tim Pengawas, Tim Pelaksana </w:t></w:r><w:proofErr w:type="spellStart"/><w:r><w:t>menyerahkan</w:t></w:r><w:proofErr w:type="spellEnd"/><w:r><w:t xml:space="preserve"> </w:t></w:r><w:proofErr w:type="spellStart"/><w:r><w:t>hasil</w:t></w:r><w:proofErr w:type="spellEnd"/><w:r><w:t xml:space="preserve"> </w:t></w:r><w:proofErr w:type="spellStart"/><w:r><w:t>pekerjaan</w:t></w:r><w:proofErr w:type="spellEnd"/><w:r><w:t xml:space="preserve"> dan </w:t></w:r><w:proofErr w:type="spellStart"/><w:r><w:t>laporan</w:t></w:r><w:proofErr w:type="spellEnd"/><w:r><w:t xml:space="preserve"> </w:t></w:r><w:proofErr w:type="spellStart"/><w:r><w:t>pelaksanaan</w:t></w:r><w:proofErr w:type="spellEnd"/><w:r><w:t xml:space="preserve"> </w:t></w:r><w:proofErr w:type="spellStart"/><w:r><w:t>kepada</w:t></w:r><w:proofErr w:type="spellEnd"/><w:r><w:t xml:space="preserve"> PPK </w:t></w:r><w:proofErr w:type="spellStart"/><w:r><w:t>melalui</w:t></w:r><w:proofErr w:type="spellEnd"/><w:r><w:t xml:space="preserve"> Berita Acara Serah </w:t></w:r><w:proofErr w:type="spellStart"/><w:r><w:t>Terima</w:t></w:r><w:proofErr w:type="spellEnd"/><w:r><w:t xml:space="preserve"> Hasil </w:t></w:r><w:proofErr w:type="spellStart"/><w:r><w:t>Pekerjaan</w:t></w:r><w:proofErr w:type="spellEnd"/><w:r><w:t>.</w:t></w:r></w:p><w:p><w:pPr><w:tabs><w:tab w:val="left" w:pos="2160"/></w:tabs></w:pPr><w:r><w:rPr><w:b/></w:rPr><w:t xml:space="preserve">IV. </w:t></w:r><w:proofErr w:type="spellStart"/><w:r><w:rPr><w:b/></w:rPr><w:t>Jangka</w:t></w:r><w:proofErr w:type="spellEnd"/><w:r><w:rPr><w:b/></w:rPr><w:t xml:space="preserve"> Waktu</w:t></w:r></w:p><w:p><w:pPr><w:tabs><w:tab w:val="left" w:pos="2160"/></w:tabs></w:pPr><w:proofErr w:type="spellStart"/><w:r><w:t>Pekerjaan</w:t></w:r><w:proofErr w:type="spellEnd"/><w:r><w:t xml:space="preserve"> </w:t></w:r><w:proofErr w:type="spellStart"/><w:r><w:t>dilaksanakan</w:t></w:r><w:proofErr w:type="spellEnd"/><w:r><w:t xml:space="preserve"> </w:t></w:r><w:proofErr w:type="spellStart"/><w:r><w:t>sejak</w:t></w:r><w:proofErr w:type="spellEnd"/><w:r><w:t xml:space="preserve"> </w:t></w:r><w:proofErr w:type="spellStart"/><w:r><w:t>tanggal</w:t></w:r><w:proofErr w:type="spellEnd"/><w:r><w:t xml:space="preserve"> [TANGGAL MULAI] </w:t></w:r><w:proofErr w:type="spellStart"/><w:r><w:t>sampai</w:t></w:r><w:proofErr w:type="spellEnd"/><w:r><w:t xml:space="preserve"> </w:t></w:r><w:proofErr w:type="spellStart"/><w:r><w:t>dengan</w:t></w:r><w:proofErr w:type="spellEnd"/><w:r><w:t xml:space="preserve"> [TANGGAL SELESAI] dan </w:t></w:r><w:proofErr w:type="spellStart"/><w:r><w:t>tidak</w:t></w:r><w:proofErr w:type="spellEnd"/><w:r><w:t xml:space="preserve"> </w:t></w:r><w:proofErr w:type="spellStart"/><w:r><w:t>melampaui</w:t></w:r><w:proofErr w:type="spellEnd"/><w:r><w:t xml:space="preserve"> </w:t></w:r><w:proofErr w:type="spellStart"/><w:r><w:t>Tahun</w:t></w:r><w:proofErr w:type="spellEnd"/><w:r><w:t xml:space="preserve"> </w:t></w:r><w:proofErr w:type="spellStart"/><w:r><w:t>Anggaran</w:t></w:r><w:proofErr w:type="spellEnd"/><w:r><w:t xml:space="preserve"> 2026, </w:t></w:r><w:proofErr w:type="spellStart"/><w:r><w:t>sesuai</w:t></w:r><w:proofErr w:type="spellEnd"/><w:r><w:t xml:space="preserve"> </w:t></w:r><w:proofErr w:type="spellStart"/><w:r><w:t>jadwal</w:t></w:r><w:proofErr w:type="spellEnd"/><w:r><w:t xml:space="preserve"> </w:t></w:r><w:proofErr w:type="spellStart"/><w:r><w:t>pelaksanaan</w:t></w:r><w:proofErr w:type="spellEnd"/><w:r><w:t xml:space="preserve"> yang </w:t></w:r><w:proofErr w:type="spellStart"/><w:r><w:t>ditetapkan</w:t></w:r><w:proofErr w:type="spellEnd"/><w:r><w:t>.</w:t></w:r></w:p><w:p><w:pPr><w:tabs><w:tab w:val="left" w:pos="2160"/></w:tabs></w:pPr><w:r><w:t xml:space="preserve">Surat </w:t></w:r><w:proofErr w:type="spellStart"/><w:r><w:t>Perintah</w:t></w:r><w:proofErr w:type="spellEnd"/><w:r><w:t xml:space="preserve"> </w:t></w:r><w:proofErr w:type="spellStart"/><w:r><w:t>Tugas</w:t></w:r><w:proofErr w:type="spellEnd"/><w:r><w:t xml:space="preserve"> </w:t></w:r><w:proofErr w:type="spellStart"/><w:r><w:t>ini</w:t></w:r><w:proofErr w:type="spellEnd"/><w:r><w:t xml:space="preserve"> agar </w:t></w:r><w:proofErr w:type="spellStart"/><w:r><w:t>dilaksanakan</w:t></w:r><w:proofErr w:type="spellEnd"/><w:r><w:t xml:space="preserve"> </w:t></w:r><w:proofErr w:type="spellStart"/><w:r><w:t>dengan</w:t></w:r><w:proofErr w:type="spellEnd"/><w:r><w:t xml:space="preserve"> </w:t></w:r><w:proofErr w:type="spellStart"/><w:r><w:t>sebaik-baiknya</w:t></w:r><w:proofErr w:type="spellEnd"/><w:r><w:t xml:space="preserve">, </w:t></w:r><w:proofErr w:type="spellStart"/><w:r><w:t>penuh</w:t></w:r><w:proofErr w:type="spellEnd"/><w:r><w:t xml:space="preserve"> </w:t></w:r><w:proofErr w:type="spellStart"/><w:r><w:t>tanggung</w:t></w:r><w:proofErr w:type="spellEnd"/><w:r><w:t xml:space="preserve"> </w:t></w:r><w:proofErr w:type="spellStart"/><w:r><w:t>jawab</w:t></w:r><w:proofErr w:type="spellEnd"/><w:r><w:t xml:space="preserve">, </w:t></w:r><w:proofErr w:type="spellStart"/><w:r><w:t>tertib</w:t></w:r><w:proofErr w:type="spellEnd"/><w:r><w:t xml:space="preserve"> </w:t></w:r><w:proofErr w:type="spellStart"/><w:r><w:t>administrasi</w:t></w:r><w:proofErr w:type="spellEnd"/><w:r><w:t xml:space="preserve">, dan </w:t></w:r><w:proofErr w:type="spellStart"/><w:r><w:t>sesuai</w:t></w:r><w:proofErr w:type="spellEnd"/><w:r><w:t xml:space="preserve"> </w:t></w:r><w:proofErr w:type="spellStart"/><w:r><w:t>ketentuan</w:t></w:r><w:proofErr w:type="spellEnd"/><w:r><w:t xml:space="preserve"> </w:t></w:r><w:proofErr w:type="spellStart"/><w:r><w:t>peraturan</w:t></w:r><w:proofErr w:type="spellEnd"/><w:r><w:t xml:space="preserve"> </w:t></w:r><w:proofErr w:type="spellStart"/><w:r><w:t>perundang-undangan</w:t></w:r><w:proofErr w:type="spellEnd"/><w:r><w:t>.</w:t></w:r></w:p><w:tbl><w:tblPr><w:tblW w:w="0" w:type="auto"/><w:tblLayout w:type="fixed"/><w:tblLook w:val="04A0" w:firstRow="1" w:lastRow="0" w:firstColumn="1" w:lastColumn="0" w:noHBand="0" w:noVBand="1"/></w:tblPr><w:tbl><w:tblPr><w:tblW w:w="8640" w:type="dxa"/><w:tblLayout w:type="fixed"/><w:tblBorders><w:top w:val="none" w:sz="0" w:space="0" w:color="auto"/><w:left w:val="none" w:sz="0" w:space="0" w:color="auto"/><w:bottom w:val="none" w:sz="0" w:space="0" w:color="auto"/><w:right w:val="none" w:sz="0" w:space="0" w:color="auto"/><w:insideH w:val="none" w:sz="0" w:space="0" w:color="auto"/><w:insideV w:val="none" w:sz="0" w:space="0" w:color="auto"/></w:tblBorders><w:tblLook w:val="04A0" w:firstRow="0" w:lastRow="0" w:firstColumn="0" w:lastColumn="0" w:noHBand="0" w:noVBand="0"/></w:tblPr><w:tblGrid><w:gridCol w:w="4320"/><w:gridCol w:w="4320"/></w:tblGrid><w:tr><w:tc><w:tcPr><w:tcW w:w="4320" w:type="dxa"/><w:vAlign w:val="top"/></w:tcPr><w:p><w:pPr><w:jc w:val="center"/></w:pPr><w:r><w:br/><w:br/></w:r></w:p><w:p><w:pPr><w:jc w:val="center"/></w:pPr><w:r><w:t>PENERIMA PERINTAH</w:t></w:r><w:r><w:br/></w:r><w:r><w:t>Ketua/Koordinator Tim Pelaksana</w:t></w:r></w:p><w:p><w:pPr><w:jc w:val="center"/></w:pPr><w:r><w:br/><w:br/><w:br/><w:br/></w:r><w:r><w:rPr><w:b/><w:u w:val="single"/></w:rPr><w:t>[NAMA]</w:t></w:r><w:r><w:br/></w:r><w:r><w:t>NIP [NIP]</w:t></w:r></w:p></w:tc><w:tc><w:tcPr><w:tcW w:w="4320" w:type="dxa"/><w:vAlign w:val="top"/></w:tcPr><w:p><w:pPr><w:jc w:val="center"/></w:pPr><w:r><w:t>Dikeluarkan di Jakarta</w:t></w:r><w:r><w:br/></w:r><w:r><w:t xml:space="preserve">pada tanggal </w:t></w:r><w:r><w:t>[TANGGAL]</w:t></w:r></w:p><w:p><w:pPr><w:jc w:val="center"/></w:pPr><w:r><w:t>PEMBERI PERINTAH</w:t></w:r><w:r><w:br/></w:r><w:r><w:t>Kepala Suku Dinas Sumber Daya Air</w:t></w:r><w:r><w:br/></w:r><w:r><w:t>Kota Administrasi Jakarta Utara</w:t></w:r><w:r><w:br/></w:r><w:r><w:t>selaku KPA</w:t></w:r></w:p><w:p><w:pPr><w:jc w:val="center"/></w:pPr><w:r><w:br/><w:br/><w:br/><w:br/></w:r><w:r><w:rPr><w:b/><w:u w:val="single"/></w:rPr><w:t>Heria Suwandi</w:t></w:r><w:r><w:br/></w:r><w:r><w:t>NIP 197101272006041009</w:t></w:r></w:p></w:tc></w:tr></w:tbl><w:p><w:pPr><w:tabs><w:tab w:val="left" w:pos="2160"/></w:tabs></w:pPr></w:p><w:p><w:pPr><w:tabs><w:tab w:val="left" w:pos="2160"/></w:tabs></w:pPr></w:p><w:sectPr><w:pgSz w:w="12240" w:h="15840"/><w:pgMar w:top="1440" w:right="1800" w:bottom="1440" w:left="1800" w:header="720" w:footer="720" w:gutter="0"/><w:cols w:space="720"/><w:docGrid w:linePitch="360"/></w:sectPr></w:body></w:document>
+<file path=word/document.xml><?xml version="1.0" encoding="utf-8"?>
+<w:document xmlns:wpc="http://schemas.microsoft.com/office/word/2010/wordprocessingCanvas" xmlns:cx="http://schemas.microsoft.com/office/drawing/2014/chartex" xmlns:cx1="http://schemas.microsoft.com/office/drawing/2015/9/8/chartex" xmlns:cx2="http://schemas.microsoft.com/office/drawing/2015/10/21/chartex" xmlns:cx3="http://schemas.microsoft.com/office/drawing/2016/5/9/chartex" xmlns:cx4="http://schemas.microsoft.com/office/drawing/2016/5/10/chartex" xmlns:cx5="http://schemas.microsoft.com/office/drawing/2016/5/11/chartex" xmlns:cx6="http://schemas.microsoft.com/office/drawing/2016/5/12/chartex" xmlns:cx7="http://schemas.microsoft.com/office/drawing/2016/5/13/chartex" xmlns:cx8="http://schemas.microsoft.com/office/drawing/2016/5/14/chartex" xmlns:mc="http://schemas.openxmlformats.org/markup-compatibility/2006" xmlns:aink="http://schemas.microsoft.com/office/drawing/2016/ink" xmlns:am3d="http://schemas.microsoft.com/office/drawing/2017/model3d" xmlns:o="urn:schemas-microsoft-com:office:office" xmlns:oel="http://schemas.microsoft.com/office/2019/extlst" xmlns:r="http://schemas.openxmlformats.org/officeDocument/2006/relationships" xmlns:m="http://schemas.openxmlformats.org/officeDocument/2006/math" xmlns:v="urn:schemas-microsoft-com:vml" xmlns:wp14="http://schemas.microsoft.com/office/word/2010/wordprocessingDrawing" xmlns:wp="http://schemas.openxmlformats.org/drawingml/2006/wordprocessingDrawing" xmlns:w10="urn:schemas-microsoft-com:office:word" xmlns:w="http://schemas.openxmlformats.org/wordprocessingml/2006/main" xmlns:w14="http://schemas.microsoft.com/office/word/2010/wordml" xmlns:w15="http://schemas.microsoft.com/office/word/2012/wordml" xmlns:w16cex="http://schemas.microsoft.com/office/word/2018/wordml/cex" xmlns:w16cid="http://schemas.microsoft.com/office/word/2016/wordml/cid" xmlns:w16="http://schemas.microsoft.com/office/word/2018/wordml" xmlns:w16du="http://schemas.microsoft.com/office/word/2023/wordml/word16du" xmlns:w16sdtdh="http://schemas.microsoft.com/office/word/2020/wordml/sdtdatahash" xmlns:w16sdtfl="http://schemas.microsoft.com/office/word/2024/wordml/sdtformatlock" xmlns:w16se="http://schemas.microsoft.com/office/word/2015/wordml/symex" xmlns:wpg="http://schemas.microsoft.com/office/word/2010/wordprocessingGroup" xmlns:wpi="http://schemas.microsoft.com/office/word/2010/wordprocessingInk" xmlns:wne="http://schemas.microsoft.com/office/word/2006/wordml" xmlns:wps="http://schemas.microsoft.com/office/word/2010/wordprocessingShape" mc:Ignorable="w14 w15 w16se w16cid w16 w16cex w16sdtdh w16sdtfl w16du wp14">
+  <w:body>
+    <w:p>
+      <w:pPr>
+        <w:jc w:val="center"/>
+        <w:rPr>
+          <w:b/>
+          <w:sz w:val="24"/>
+        </w:rPr>
+      </w:pPr>
+      <w:r>
+        <w:rPr>
+          <w:b/>
+          <w:noProof/>
+          <w:sz w:val="24"/>
+        </w:rPr>
+        <w:drawing>
+          <wp:anchor distT="0" distB="0" distL="114300" distR="114300" simplePos="0" relativeHeight="251658240" behindDoc="1" locked="0" layoutInCell="1" allowOverlap="1" wp14:anchorId="72F445D8" wp14:editId="15BE4D3D">
+            <wp:simplePos x="0" y="0"/>
+            <wp:positionH relativeFrom="margin">
+              <wp:posOffset>2146301</wp:posOffset>
+            </wp:positionH>
+            <wp:positionV relativeFrom="paragraph">
+              <wp:posOffset>-558800</wp:posOffset>
+            </wp:positionV>
+            <wp:extent cx="965200" cy="1276350"/>
+            <wp:effectExtent l="0" t="0" r="6350" b="0"/>
+            <wp:wrapNone/>
+            <wp:docPr id="837020129" name="Picture 1"/>
+            <wp:cNvGraphicFramePr>
+              <a:graphicFrameLocks xmlns:a="http://schemas.openxmlformats.org/drawingml/2006/main" noChangeAspect="1"/>
+            </wp:cNvGraphicFramePr>
+            <a:graphic xmlns:a="http://schemas.openxmlformats.org/drawingml/2006/main">
+              <a:graphicData uri="http://schemas.openxmlformats.org/drawingml/2006/picture">
+                <pic:pic xmlns:pic="http://schemas.openxmlformats.org/drawingml/2006/picture">
+                  <pic:nvPicPr>
+                    <pic:cNvPr id="837020129" name="Picture 837020129"/>
+                    <pic:cNvPicPr/>
+                  </pic:nvPicPr>
+                  <pic:blipFill>
+                    <a:blip r:embed="rId6"/>
+                    <a:stretch>
+                      <a:fillRect/>
+                    </a:stretch>
+                  </pic:blipFill>
+                  <pic:spPr>
+                    <a:xfrm>
+                      <a:off x="0" y="0"/>
+                      <a:ext cx="965200" cy="1276350"/>
+                    </a:xfrm>
+                    <a:prstGeom prst="rect">
+                      <a:avLst/>
+                    </a:prstGeom>
+                  </pic:spPr>
+                </pic:pic>
+              </a:graphicData>
+            </a:graphic>
+            <wp14:sizeRelH relativeFrom="margin">
+              <wp14:pctWidth>0</wp14:pctWidth>
+            </wp14:sizeRelH>
+          </wp:anchor>
+        </w:drawing>
+      </w:r>
+    </w:p>
+    <w:p>
+      <w:pPr>
+        <w:jc w:val="center"/>
+        <w:rPr>
+          <w:b/>
+          <w:sz w:val="24"/>
+        </w:rPr>
+      </w:pPr>
+    </w:p>
+    <w:p>
+      <w:pPr>
+        <w:jc w:val="center"/>
+      </w:pPr>
+      <w:r>
+        <w:rPr>
+          <w:b/>
+          <w:sz w:val="24"/>
+        </w:rPr>
+        <w:t>SUKU DINAS SUMBER DAYA AIR</w:t>
+      </w:r>
+      <w:r>
+        <w:rPr>
+          <w:b/>
+          <w:sz w:val="24"/>
+        </w:rPr>
+        <w:br/>
+        <w:t>PEMERINTAH KOTA ADMINISTRASI JAKARTA UTARA</w:t>
+      </w:r>
+      <w:r>
+        <w:rPr>
+          <w:b/>
+          <w:sz w:val="24"/>
+        </w:rPr>
+        <w:br/>
+      </w:r>
+    </w:p>
+    <w:p>
+      <w:pPr>
+        <w:jc w:val="center"/>
+      </w:pPr>
+      <w:r>
+        <w:rPr>
+          <w:b/>
+        </w:rPr>
+        <w:t>SURAT PERINTAH TUGAS</w:t>
+      </w:r>
+      <w:r>
+        <w:rPr>
+          <w:b/>
+        </w:rPr>
+        <w:br/>
+        <w:t>NOMOR: [NOMOR SPT]</w:t>
+      </w:r>
+      <w:r>
+        <w:rPr>
+          <w:b/>
+        </w:rPr>
+        <w:br/>
+        <w:t>TENTANG</w:t>
+      </w:r>
+      <w:r>
+        <w:rPr>
+          <w:b/>
+        </w:rPr>
+        <w:br/>
+        <w:t>PELAKSANAAN SWAKELOLA TIPE I [NAMA PEKERJAAN] TAHUN ANGGARAN 2026</w:t>
+      </w:r>
+    </w:p>
+    <w:p>
+      <w:r>
+        <w:t>Berdasarkan:</w:t>
+      </w:r>
+    </w:p>
+    <w:p>
+      <w:pPr>
+        <w:ind w:left="360" w:hanging="360"/>
+      </w:pPr>
+      <w:r>
+        <w:t>1. Peraturan Presiden Nomor 16 Tahun 2018 tentang Pengadaan Barang/Jasa Pemerintah sebagaimana telah beberapa kali diubah, terakhir dengan Peraturan Presiden Nomor 46 Tahun 2025 tentang Perubahan Kedua atas Peraturan Presiden Nomor 16 Tahun 2018 tentang Pengadaan Barang/Jasa Pemerintah;</w:t>
+      </w:r>
+    </w:p>
+    <w:p>
+      <w:pPr>
+        <w:ind w:left="360" w:hanging="360"/>
+      </w:pPr>
+      <w:r>
+        <w:t>2. Peraturan Lembaga Kebijakan Pengadaan Barang/Jasa Pemerintah Nomor 3 Tahun 2021 tentang Pedoman Swakelola;</w:t>
+      </w:r>
+    </w:p>
+    <w:p>
+      <w:pPr>
+        <w:ind w:left="360" w:hanging="360"/>
+      </w:pPr>
+      <w:r>
+        <w:t>3. Peraturan Daerah Provinsi DKI Jakarta Nomor 4 Tahun 2025 tentang Anggaran Pendapatan dan Belanja Daerah Tahun Anggaran 2026;</w:t>
+      </w:r>
+    </w:p>
+    <w:p>
+      <w:pPr>
+        <w:ind w:left="360" w:hanging="360"/>
+      </w:pPr>
+      <w:r>
+        <w:t>4. Dokumen Pelaksanaan Anggaran Satuan Kerja Perangkat Daerah (DPA-SKPD) Suku Dinas Sumber Daya Air Kota Administrasi Jakarta Utara Tahun Anggaran 2026 Nomor [NOMOR DPA] tanggal [TANGGAL DPA];</w:t>
+      </w:r>
+    </w:p>
+    <w:p>
+      <w:pPr>
+        <w:ind w:left="360" w:hanging="360"/>
+      </w:pPr>
+      <w:r>
+        <w:t>5. Keputusan Kepala Dinas Sumber Daya Air Provinsi DKI Jakarta Nomor 1445 Tahun 2026 tentang Pelimpahan Sebagian Kewenangan Pengguna Anggaran kepada Kuasa Pengguna Anggaran pada Dinas Sumber Daya Air Provinsi DKI Jakarta Tahun Anggaran 2026.</w:t>
+      </w:r>
+    </w:p>
+    <w:p>
+      <w:r>
+        <w:t>maka Kepala Suku Dinas Sumber Daya Air Kota Administrasi Jakarta Utara selaku Kuasa Pengguna Anggaran dengan ini:</w:t>
+      </w:r>
+    </w:p>
+    <w:p>
+      <w:pPr>
+        <w:jc w:val="center"/>
+      </w:pPr>
+      <w:r>
+        <w:rPr>
+          <w:b/>
+        </w:rPr>
+        <w:t>MEMERINTAHKAN:</w:t>
+      </w:r>
+    </w:p>
+    <w:p>
+      <w:pPr>
+        <w:tabs>
+          <w:tab w:val="left" w:pos="2160"/>
+        </w:tabs>
+      </w:pPr>
+      <w:r>
+        <w:t>Kepada</w:t>
+      </w:r>
+      <w:r>
+        <w:tab/>
+        <w:t>:</w:t>
+      </w:r>
+      <w:r>
+        <w:br/>
+        <w:t>Nama</w:t>
+      </w:r>
+      <w:r>
+        <w:tab/>
+        <w:t>: [NAMA PENERIMA PERINTAH]</w:t>
+      </w:r>
+      <w:r>
+        <w:br/>
+        <w:t>NIP/NRK</w:t>
+      </w:r>
+      <w:r>
+        <w:tab/>
+        <w:t>: [NIP/NRK]</w:t>
+      </w:r>
+    </w:p>
+    <w:p>
+      <w:pPr>
+        <w:tabs>
+          <w:tab w:val="left" w:pos="2520"/>
+        </w:tabs>
+        <w:spacing w:after="0" w:line="240" w:lineRule="auto"/>
+      </w:pPr>
+      <w:proofErr w:type="spellStart"/>
+      <w:r>
+        <w:lastRenderedPageBreak/>
+        <w:t>Jabatan</w:t>
+      </w:r>
+      <w:proofErr w:type="spellEnd"/>
+      <w:r>
+        <w:tab/>
+        <w:t xml:space="preserve">: [KEPALA SATUAN PELAKSANA KECAMATAN ... / KEPALA </w:t>
+      </w:r>
+    </w:p>
+    <w:p>
+      <w:pPr>
+        <w:tabs>
+          <w:tab w:val="left" w:pos="2520"/>
+        </w:tabs>
+        <w:spacing w:after="0" w:line="240" w:lineRule="auto"/>
+      </w:pPr>
+      <w:r>
+        <w:tab/>
+        <w:t xml:space="preserve">   </w:t>
+      </w:r>
+      <w:r>
+        <w:t>SEKSI PEMELIHARAAN DRAINASE]</w:t>
+      </w:r>
+      <w:r>
+        <w:br/>
+      </w:r>
+      <w:proofErr w:type="spellStart"/>
+      <w:r>
+        <w:t>Kedudukan</w:t>
+      </w:r>
+      <w:proofErr w:type="spellEnd"/>
+      <w:r>
+        <w:tab/>
+        <w:t xml:space="preserve">: </w:t>
+      </w:r>
+      <w:proofErr w:type="spellStart"/>
+      <w:r>
+        <w:t>Ketua</w:t>
+      </w:r>
+      <w:proofErr w:type="spellEnd"/>
+      <w:r>
+        <w:t>/</w:t>
+      </w:r>
+      <w:proofErr w:type="spellStart"/>
+      <w:r>
+        <w:t>Koordinator</w:t>
+      </w:r>
+      <w:proofErr w:type="spellEnd"/>
+      <w:r>
+        <w:t xml:space="preserve"> Tim Pelaksana Swakelola </w:t>
+      </w:r>
+      <w:proofErr w:type="spellStart"/>
+      <w:r>
+        <w:t>Tipe</w:t>
+      </w:r>
+      <w:proofErr w:type="spellEnd"/>
+      <w:r>
+        <w:t xml:space="preserve"> I</w:t>
+      </w:r>
+      <w:r>
+        <w:br/>
+      </w:r>
+    </w:p>
+    <w:p>
+      <w:proofErr w:type="spellStart"/>
+      <w:r>
+        <w:t>Untuk</w:t>
+      </w:r>
+      <w:proofErr w:type="spellEnd"/>
+      <w:r>
+        <w:t xml:space="preserve"> </w:t>
+      </w:r>
+      <w:proofErr w:type="spellStart"/>
+      <w:r>
+        <w:t>melaksanakan</w:t>
+      </w:r>
+      <w:proofErr w:type="spellEnd"/>
+      <w:r>
+        <w:t xml:space="preserve"> </w:t>
+      </w:r>
+      <w:proofErr w:type="spellStart"/>
+      <w:r>
+        <w:t>pekerjaan</w:t>
+      </w:r>
+      <w:proofErr w:type="spellEnd"/>
+      <w:r>
+        <w:t xml:space="preserve"> </w:t>
+      </w:r>
+      <w:proofErr w:type="spellStart"/>
+      <w:r>
+        <w:t>Swakelola</w:t>
+      </w:r>
+      <w:proofErr w:type="spellEnd"/>
+      <w:r>
+        <w:t xml:space="preserve"> </w:t>
+      </w:r>
+      <w:proofErr w:type="spellStart"/>
+      <w:r>
+        <w:t>Tipe</w:t>
+      </w:r>
+      <w:proofErr w:type="spellEnd"/>
+      <w:r>
+        <w:t xml:space="preserve"> I </w:t>
+      </w:r>
+      <w:proofErr w:type="spellStart"/>
+      <w:r>
+        <w:t>dengan</w:t>
+      </w:r>
+      <w:proofErr w:type="spellEnd"/>
+      <w:r>
+        <w:t xml:space="preserve"> data </w:t>
+      </w:r>
+      <w:proofErr w:type="spellStart"/>
+      <w:r>
+        <w:t>sebagai</w:t>
+      </w:r>
+      <w:proofErr w:type="spellEnd"/>
+      <w:r>
+        <w:t xml:space="preserve"> </w:t>
+      </w:r>
+      <w:proofErr w:type="spellStart"/>
+      <w:r>
+        <w:t>berikut</w:t>
+      </w:r>
+      <w:proofErr w:type="spellEnd"/>
+      <w:r>
+        <w:t>:</w:t>
+      </w:r>
+    </w:p>
+    <w:p>
+      <w:pPr>
+        <w:tabs>
+          <w:tab w:val="left" w:pos="2520"/>
+        </w:tabs>
+      </w:pPr>
+      <w:r>
+        <w:t>Nama Program</w:t>
+      </w:r>
+      <w:r>
+        <w:tab/>
+        <w:t>: [SESUAI DPA]</w:t>
+      </w:r>
+      <w:r>
+        <w:br/>
+        <w:t xml:space="preserve">Nama </w:t>
+      </w:r>
+      <w:proofErr w:type="spellStart"/>
+      <w:r>
+        <w:t>Kegiatan</w:t>
+      </w:r>
+      <w:proofErr w:type="spellEnd"/>
+      <w:r>
+        <w:tab/>
+        <w:t>: [SESUAI DPA]</w:t>
+      </w:r>
+      <w:r>
+        <w:br/>
+        <w:t xml:space="preserve">Nama </w:t>
+      </w:r>
+      <w:proofErr w:type="spellStart"/>
+      <w:r>
+        <w:t>Subkegiatan</w:t>
+      </w:r>
+      <w:proofErr w:type="spellEnd"/>
+      <w:r>
+        <w:tab/>
+        <w:t>: [SESUAI DPA]</w:t>
+      </w:r>
+      <w:r>
+        <w:br/>
+      </w:r>
+      <w:proofErr w:type="spellStart"/>
+      <w:r>
+        <w:t>Nomor</w:t>
+      </w:r>
+      <w:proofErr w:type="spellEnd"/>
+      <w:r>
+        <w:t xml:space="preserve">/Kode </w:t>
+      </w:r>
+      <w:proofErr w:type="spellStart"/>
+      <w:r>
+        <w:t>Kegiatan</w:t>
+      </w:r>
+      <w:proofErr w:type="spellEnd"/>
+      <w:r>
+        <w:tab/>
+        <w:t>: [SESUAI DPA]</w:t>
+      </w:r>
+      <w:r>
+        <w:br/>
+        <w:t xml:space="preserve">Kode </w:t>
+      </w:r>
+      <w:proofErr w:type="spellStart"/>
+      <w:r>
+        <w:t>Rekening</w:t>
+      </w:r>
+      <w:proofErr w:type="spellEnd"/>
+      <w:r>
+        <w:tab/>
+        <w:t>: [SESUAI DPA]</w:t>
+      </w:r>
+      <w:r>
+        <w:br/>
+        <w:t xml:space="preserve">Jenis </w:t>
+      </w:r>
+      <w:proofErr w:type="spellStart"/>
+      <w:r>
+        <w:t>Pekerjaan</w:t>
+      </w:r>
+      <w:proofErr w:type="spellEnd"/>
+      <w:r>
+        <w:tab/>
+        <w:t xml:space="preserve">: </w:t>
+      </w:r>
+      <w:proofErr w:type="spellStart"/>
+      <w:r>
+        <w:t>Perbaikan</w:t>
+      </w:r>
+      <w:proofErr w:type="spellEnd"/>
+      <w:r>
+        <w:t xml:space="preserve"> dan </w:t>
+      </w:r>
+      <w:proofErr w:type="spellStart"/>
+      <w:r>
+        <w:t>Pengurasan</w:t>
+      </w:r>
+      <w:proofErr w:type="spellEnd"/>
+      <w:r>
+        <w:t xml:space="preserve"> </w:t>
+      </w:r>
+      <w:proofErr w:type="spellStart"/>
+      <w:r>
+        <w:t>Saluran</w:t>
+      </w:r>
+      <w:proofErr w:type="spellEnd"/>
+      <w:r>
+        <w:t xml:space="preserve"> / [SESUAI PAKET]</w:t>
+      </w:r>
+      <w:r>
+        <w:br/>
+        <w:t>Lokasi</w:t>
+      </w:r>
+      <w:r>
+        <w:tab/>
+        <w:t>: [LOKASI]</w:t>
+      </w:r>
+      <w:r>
+        <w:br/>
+      </w:r>
+      <w:proofErr w:type="spellStart"/>
+      <w:r>
+        <w:t>Tahun</w:t>
+      </w:r>
+      <w:proofErr w:type="spellEnd"/>
+      <w:r>
+        <w:t xml:space="preserve"> </w:t>
+      </w:r>
+      <w:proofErr w:type="spellStart"/>
+      <w:r>
+        <w:t>Anggaran</w:t>
+      </w:r>
+      <w:proofErr w:type="spellEnd"/>
+      <w:r>
+        <w:tab/>
+        <w:t>: 2026</w:t>
+      </w:r>
+    </w:p>
+    <w:p>
+      <w:r>
+        <w:rPr>
+          <w:b/>
+        </w:rPr>
+        <w:t xml:space="preserve">I. </w:t>
+      </w:r>
+      <w:proofErr w:type="spellStart"/>
+      <w:r>
+        <w:rPr>
+          <w:b/>
+        </w:rPr>
+        <w:t>Dokumen</w:t>
+      </w:r>
+      <w:proofErr w:type="spellEnd"/>
+      <w:r>
+        <w:rPr>
+          <w:b/>
+        </w:rPr>
+        <w:t xml:space="preserve"> Teknis dan </w:t>
+      </w:r>
+      <w:proofErr w:type="spellStart"/>
+      <w:r>
+        <w:rPr>
+          <w:b/>
+        </w:rPr>
+        <w:t>Administratif</w:t>
+      </w:r>
+      <w:proofErr w:type="spellEnd"/>
+    </w:p>
+    <w:p>
+      <w:pPr>
+        <w:ind w:left="360" w:hanging="360"/>
+      </w:pPr>
+      <w:r>
+        <w:t xml:space="preserve">1. Gambar </w:t>
+      </w:r>
+      <w:proofErr w:type="spellStart"/>
+      <w:r>
+        <w:t>kerja</w:t>
+      </w:r>
+      <w:proofErr w:type="spellEnd"/>
+      <w:r>
+        <w:t xml:space="preserve"> yang </w:t>
+      </w:r>
+      <w:proofErr w:type="spellStart"/>
+      <w:r>
+        <w:t>telah</w:t>
+      </w:r>
+      <w:proofErr w:type="spellEnd"/>
+      <w:r>
+        <w:t xml:space="preserve"> </w:t>
+      </w:r>
+      <w:proofErr w:type="spellStart"/>
+      <w:r>
+        <w:t>ditetapkan</w:t>
+      </w:r>
+      <w:proofErr w:type="spellEnd"/>
+      <w:r>
+        <w:t>;</w:t>
+      </w:r>
+    </w:p>
+    <w:p>
+      <w:pPr>
+        <w:ind w:left="360" w:hanging="360"/>
+      </w:pPr>
+      <w:r>
+        <w:t>2. Berita acara/</w:t>
+      </w:r>
+      <w:proofErr w:type="spellStart"/>
+      <w:r>
+        <w:t>perhitungan</w:t>
+      </w:r>
+      <w:proofErr w:type="spellEnd"/>
+      <w:r>
+        <w:t xml:space="preserve"> volume </w:t>
+      </w:r>
+      <w:proofErr w:type="spellStart"/>
+      <w:r>
+        <w:t>pekerjaan</w:t>
+      </w:r>
+      <w:proofErr w:type="spellEnd"/>
+      <w:r>
+        <w:t>;</w:t>
+      </w:r>
+    </w:p>
+    <w:p>
+      <w:pPr>
+        <w:ind w:left="360" w:hanging="360"/>
+      </w:pPr>
+      <w:r>
+        <w:t xml:space="preserve">3. </w:t>
+      </w:r>
+      <w:proofErr w:type="spellStart"/>
+      <w:r>
+        <w:t>Rencana</w:t>
+      </w:r>
+      <w:proofErr w:type="spellEnd"/>
+      <w:r>
+        <w:t xml:space="preserve"> </w:t>
+      </w:r>
+      <w:proofErr w:type="spellStart"/>
+      <w:r>
+        <w:t>kebutuhan</w:t>
+      </w:r>
+      <w:proofErr w:type="spellEnd"/>
+      <w:r>
+        <w:t xml:space="preserve"> </w:t>
+      </w:r>
+      <w:proofErr w:type="spellStart"/>
+      <w:r>
+        <w:t>bahan</w:t>
+      </w:r>
+      <w:proofErr w:type="spellEnd"/>
+      <w:r>
+        <w:t xml:space="preserve">/material dan </w:t>
+      </w:r>
+      <w:proofErr w:type="spellStart"/>
+      <w:r>
+        <w:t>peralatan</w:t>
+      </w:r>
+      <w:proofErr w:type="spellEnd"/>
+      <w:r>
+        <w:t>;</w:t>
+      </w:r>
+    </w:p>
+    <w:p>
+      <w:pPr>
+        <w:ind w:left="360" w:hanging="360"/>
+      </w:pPr>
+      <w:r>
+        <w:t xml:space="preserve">4. RAB dan </w:t>
+      </w:r>
+      <w:proofErr w:type="spellStart"/>
+      <w:r>
+        <w:t>jadwal</w:t>
+      </w:r>
+      <w:proofErr w:type="spellEnd"/>
+      <w:r>
+        <w:t xml:space="preserve"> </w:t>
+      </w:r>
+      <w:proofErr w:type="spellStart"/>
+      <w:r>
+        <w:t>pelaksanaan</w:t>
+      </w:r>
+      <w:proofErr w:type="spellEnd"/>
+      <w:r>
+        <w:t xml:space="preserve"> yang </w:t>
+      </w:r>
+      <w:proofErr w:type="spellStart"/>
+      <w:r>
+        <w:t>telah</w:t>
+      </w:r>
+      <w:proofErr w:type="spellEnd"/>
+      <w:r>
+        <w:t xml:space="preserve"> </w:t>
+      </w:r>
+      <w:proofErr w:type="spellStart"/>
+      <w:r>
+        <w:t>ditetapkan</w:t>
+      </w:r>
+      <w:proofErr w:type="spellEnd"/>
+      <w:r>
+        <w:t xml:space="preserve"> oleh PPK;</w:t>
+      </w:r>
+    </w:p>
+    <w:p>
+      <w:r>
+        <w:rPr>
+          <w:b/>
+        </w:rPr>
+        <w:t xml:space="preserve">II. </w:t>
+      </w:r>
+      <w:proofErr w:type="spellStart"/>
+      <w:r>
+        <w:rPr>
+          <w:b/>
+        </w:rPr>
+        <w:t>Ketentuan</w:t>
+      </w:r>
+      <w:proofErr w:type="spellEnd"/>
+      <w:r>
+        <w:rPr>
+          <w:b/>
+        </w:rPr>
+        <w:t xml:space="preserve"> </w:t>
+      </w:r>
+      <w:proofErr w:type="spellStart"/>
+      <w:r>
+        <w:rPr>
+          <w:b/>
+        </w:rPr>
+        <w:t>Pelaksanaan</w:t>
+      </w:r>
+      <w:proofErr w:type="spellEnd"/>
+    </w:p>
+    <w:p>
+      <w:pPr>
+        <w:ind w:left="360" w:hanging="360"/>
+      </w:pPr>
+      <w:r>
+        <w:t xml:space="preserve">1. </w:t>
+      </w:r>
+      <w:proofErr w:type="spellStart"/>
+      <w:r>
+        <w:t>Pekerjaan</w:t>
+      </w:r>
+      <w:proofErr w:type="spellEnd"/>
+      <w:r>
+        <w:t xml:space="preserve"> </w:t>
+      </w:r>
+      <w:proofErr w:type="spellStart"/>
+      <w:r>
+        <w:t>dilaksanakan</w:t>
+      </w:r>
+      <w:proofErr w:type="spellEnd"/>
+      <w:r>
+        <w:t xml:space="preserve"> oleh Tim </w:t>
+      </w:r>
+      <w:proofErr w:type="spellStart"/>
+      <w:r>
+        <w:t>Pelaksana</w:t>
+      </w:r>
+      <w:proofErr w:type="spellEnd"/>
+      <w:r>
+        <w:t xml:space="preserve"> Swakelola </w:t>
+      </w:r>
+      <w:proofErr w:type="spellStart"/>
+      <w:r>
+        <w:t>Tipe</w:t>
+      </w:r>
+      <w:proofErr w:type="spellEnd"/>
+      <w:r>
+        <w:t xml:space="preserve"> I </w:t>
+      </w:r>
+      <w:proofErr w:type="spellStart"/>
+      <w:r>
+        <w:t>sesuai</w:t>
+      </w:r>
+      <w:proofErr w:type="spellEnd"/>
+      <w:r>
+        <w:t xml:space="preserve"> Keputusan KPA dan </w:t>
+      </w:r>
+      <w:proofErr w:type="spellStart"/>
+      <w:r>
+        <w:t>dokumen</w:t>
+      </w:r>
+      <w:proofErr w:type="spellEnd"/>
+      <w:r>
+        <w:t xml:space="preserve"> </w:t>
+      </w:r>
+      <w:proofErr w:type="spellStart"/>
+      <w:r>
+        <w:t>persiapan</w:t>
+      </w:r>
+      <w:proofErr w:type="spellEnd"/>
+      <w:r>
+        <w:t xml:space="preserve"> </w:t>
+      </w:r>
+      <w:proofErr w:type="spellStart"/>
+      <w:r>
+        <w:t>Swakelola</w:t>
+      </w:r>
+      <w:proofErr w:type="spellEnd"/>
+      <w:r>
+        <w:t>.</w:t>
+      </w:r>
+    </w:p>
+    <w:p>
+      <w:pPr>
+        <w:ind w:left="360" w:hanging="360"/>
+      </w:pPr>
+      <w:r>
+        <w:t xml:space="preserve">2. </w:t>
+      </w:r>
+      <w:proofErr w:type="spellStart"/>
+      <w:r>
+        <w:t>Pelaksanaan</w:t>
+      </w:r>
+      <w:proofErr w:type="spellEnd"/>
+      <w:r>
+        <w:t xml:space="preserve"> </w:t>
+      </w:r>
+      <w:proofErr w:type="spellStart"/>
+      <w:r>
+        <w:t>dapat</w:t>
+      </w:r>
+      <w:proofErr w:type="spellEnd"/>
+      <w:r>
+        <w:t xml:space="preserve"> </w:t>
+      </w:r>
+      <w:proofErr w:type="spellStart"/>
+      <w:r>
+        <w:t>memanfaatkan</w:t>
+      </w:r>
+      <w:proofErr w:type="spellEnd"/>
+      <w:r>
+        <w:t xml:space="preserve"> </w:t>
+      </w:r>
+      <w:proofErr w:type="spellStart"/>
+      <w:r>
+        <w:t>tenaga</w:t>
+      </w:r>
+      <w:proofErr w:type="spellEnd"/>
+      <w:r>
+        <w:t xml:space="preserve"> </w:t>
+      </w:r>
+      <w:proofErr w:type="spellStart"/>
+      <w:r>
+        <w:t>pendukung</w:t>
+      </w:r>
+      <w:proofErr w:type="spellEnd"/>
+      <w:r>
+        <w:t xml:space="preserve">/PJLP, </w:t>
+      </w:r>
+      <w:proofErr w:type="spellStart"/>
+      <w:r>
+        <w:t>peralatan</w:t>
+      </w:r>
+      <w:proofErr w:type="spellEnd"/>
+      <w:r>
+        <w:t xml:space="preserve">, </w:t>
+      </w:r>
+      <w:proofErr w:type="spellStart"/>
+      <w:r>
+        <w:t>kendaraan</w:t>
+      </w:r>
+      <w:proofErr w:type="spellEnd"/>
+      <w:r>
+        <w:t xml:space="preserve"> </w:t>
+      </w:r>
+      <w:proofErr w:type="spellStart"/>
+      <w:r>
+        <w:t>dinas</w:t>
+      </w:r>
+      <w:proofErr w:type="spellEnd"/>
+      <w:r>
+        <w:t xml:space="preserve">, </w:t>
+      </w:r>
+      <w:proofErr w:type="spellStart"/>
+      <w:r>
+        <w:t>persediaan</w:t>
+      </w:r>
+      <w:proofErr w:type="spellEnd"/>
+      <w:r>
+        <w:t xml:space="preserve">, </w:t>
+      </w:r>
+      <w:proofErr w:type="spellStart"/>
+      <w:r>
+        <w:t>serta</w:t>
+      </w:r>
+      <w:proofErr w:type="spellEnd"/>
+      <w:r>
+        <w:t xml:space="preserve"> </w:t>
+      </w:r>
+      <w:proofErr w:type="spellStart"/>
+      <w:r>
+        <w:t>sumber</w:t>
+      </w:r>
+      <w:proofErr w:type="spellEnd"/>
+      <w:r>
+        <w:t xml:space="preserve"> </w:t>
+      </w:r>
+      <w:proofErr w:type="spellStart"/>
+      <w:r>
+        <w:t>daya</w:t>
+      </w:r>
+      <w:proofErr w:type="spellEnd"/>
+      <w:r>
+        <w:t xml:space="preserve"> lain yang </w:t>
+      </w:r>
+      <w:proofErr w:type="spellStart"/>
+      <w:r>
+        <w:t>tersedia</w:t>
+      </w:r>
+      <w:proofErr w:type="spellEnd"/>
+      <w:r>
+        <w:t xml:space="preserve"> </w:t>
+      </w:r>
+      <w:proofErr w:type="spellStart"/>
+      <w:r>
+        <w:t>sesuai</w:t>
+      </w:r>
+      <w:proofErr w:type="spellEnd"/>
+      <w:r>
+        <w:t xml:space="preserve"> </w:t>
+      </w:r>
+      <w:proofErr w:type="spellStart"/>
+      <w:r>
+        <w:t>penugasan</w:t>
+      </w:r>
+      <w:proofErr w:type="spellEnd"/>
+      <w:r>
+        <w:t xml:space="preserve">, </w:t>
+      </w:r>
+      <w:proofErr w:type="spellStart"/>
+      <w:r>
+        <w:t>kontrak</w:t>
+      </w:r>
+      <w:proofErr w:type="spellEnd"/>
+      <w:r>
+        <w:t xml:space="preserve">, dan </w:t>
+      </w:r>
+      <w:proofErr w:type="spellStart"/>
+      <w:r>
+        <w:t>ketentuan</w:t>
+      </w:r>
+      <w:proofErr w:type="spellEnd"/>
+      <w:r>
+        <w:t xml:space="preserve"> yang </w:t>
+      </w:r>
+      <w:proofErr w:type="spellStart"/>
+      <w:r>
+        <w:t>berlaku</w:t>
+      </w:r>
+      <w:proofErr w:type="spellEnd"/>
+      <w:r>
+        <w:t>.</w:t>
+      </w:r>
+    </w:p>
+    <w:p>
+      <w:pPr>
+        <w:ind w:left="360" w:hanging="360"/>
+      </w:pPr>
+      <w:r>
+        <w:t xml:space="preserve">3. </w:t>
+      </w:r>
+      <w:proofErr w:type="spellStart"/>
+      <w:r>
+        <w:t>Apabila</w:t>
+      </w:r>
+      <w:proofErr w:type="spellEnd"/>
+      <w:r>
+        <w:t xml:space="preserve"> </w:t>
+      </w:r>
+      <w:proofErr w:type="spellStart"/>
+      <w:r>
+        <w:t>diperlukan</w:t>
+      </w:r>
+      <w:proofErr w:type="spellEnd"/>
+      <w:r>
+        <w:t xml:space="preserve"> </w:t>
+      </w:r>
+      <w:proofErr w:type="spellStart"/>
+      <w:r>
+        <w:t>pengadaan</w:t>
+      </w:r>
+      <w:proofErr w:type="spellEnd"/>
+      <w:r>
+        <w:t xml:space="preserve"> </w:t>
+      </w:r>
+      <w:proofErr w:type="spellStart"/>
+      <w:r>
+        <w:t>barang</w:t>
+      </w:r>
+      <w:proofErr w:type="spellEnd"/>
+      <w:r>
+        <w:t>/</w:t>
+      </w:r>
+      <w:proofErr w:type="spellStart"/>
+      <w:r>
+        <w:t>jasa</w:t>
+      </w:r>
+      <w:proofErr w:type="spellEnd"/>
+      <w:r>
+        <w:t xml:space="preserve"> </w:t>
+      </w:r>
+      <w:proofErr w:type="spellStart"/>
+      <w:r>
+        <w:t>melalui</w:t>
+      </w:r>
+      <w:proofErr w:type="spellEnd"/>
+      <w:r>
+        <w:t xml:space="preserve"> </w:t>
+      </w:r>
+      <w:proofErr w:type="spellStart"/>
+      <w:r>
+        <w:t>Penyedia</w:t>
+      </w:r>
+      <w:proofErr w:type="spellEnd"/>
+      <w:r>
+        <w:t xml:space="preserve"> </w:t>
+      </w:r>
+      <w:proofErr w:type="spellStart"/>
+      <w:r>
+        <w:t>sebagai</w:t>
+      </w:r>
+      <w:proofErr w:type="spellEnd"/>
+      <w:r>
+        <w:t xml:space="preserve"> </w:t>
+      </w:r>
+      <w:proofErr w:type="spellStart"/>
+      <w:r>
+        <w:t>bagian</w:t>
+      </w:r>
+      <w:proofErr w:type="spellEnd"/>
+      <w:r>
+        <w:t xml:space="preserve"> </w:t>
+      </w:r>
+      <w:proofErr w:type="spellStart"/>
+      <w:r>
+        <w:t>pendukung</w:t>
+      </w:r>
+      <w:proofErr w:type="spellEnd"/>
+      <w:r>
+        <w:t xml:space="preserve"> </w:t>
+      </w:r>
+      <w:proofErr w:type="spellStart"/>
+      <w:r>
+        <w:t>Swakelola</w:t>
+      </w:r>
+      <w:proofErr w:type="spellEnd"/>
+      <w:r>
+        <w:t xml:space="preserve">, proses </w:t>
+      </w:r>
+      <w:proofErr w:type="spellStart"/>
+      <w:r>
+        <w:t>pengadaannya</w:t>
+      </w:r>
+      <w:proofErr w:type="spellEnd"/>
+      <w:r>
+        <w:t xml:space="preserve"> </w:t>
+      </w:r>
+      <w:proofErr w:type="spellStart"/>
+      <w:r>
+        <w:t>dilaksanakan</w:t>
+      </w:r>
+      <w:proofErr w:type="spellEnd"/>
+      <w:r>
+        <w:t xml:space="preserve"> </w:t>
+      </w:r>
+      <w:proofErr w:type="spellStart"/>
+      <w:r>
+        <w:t>secara</w:t>
+      </w:r>
+      <w:proofErr w:type="spellEnd"/>
+      <w:r>
+        <w:t xml:space="preserve"> </w:t>
+      </w:r>
+      <w:proofErr w:type="spellStart"/>
+      <w:r>
+        <w:t>terpisah</w:t>
+      </w:r>
+      <w:proofErr w:type="spellEnd"/>
+      <w:r>
+        <w:t xml:space="preserve"> </w:t>
+      </w:r>
+      <w:proofErr w:type="spellStart"/>
+      <w:r>
+        <w:t>sesuai</w:t>
+      </w:r>
+      <w:proofErr w:type="spellEnd"/>
+      <w:r>
+        <w:t xml:space="preserve"> </w:t>
+      </w:r>
+      <w:proofErr w:type="spellStart"/>
+      <w:r>
+        <w:t>ketentuan</w:t>
+      </w:r>
+      <w:proofErr w:type="spellEnd"/>
+      <w:r>
+        <w:t xml:space="preserve"> </w:t>
+      </w:r>
+      <w:proofErr w:type="spellStart"/>
+      <w:r>
+        <w:t>Pengadaan</w:t>
+      </w:r>
+      <w:proofErr w:type="spellEnd"/>
+      <w:r>
+        <w:t xml:space="preserve"> Barang/Jasa </w:t>
+      </w:r>
+      <w:proofErr w:type="spellStart"/>
+      <w:r>
+        <w:t>Pemerintah</w:t>
+      </w:r>
+      <w:proofErr w:type="spellEnd"/>
+      <w:r>
+        <w:t>.</w:t>
+      </w:r>
+    </w:p>
+    <w:p>
+      <w:pPr>
+        <w:ind w:left="360" w:hanging="360"/>
+      </w:pPr>
+      <w:r>
+        <w:t xml:space="preserve">4. Bahan/material </w:t>
+      </w:r>
+      <w:proofErr w:type="spellStart"/>
+      <w:r>
+        <w:t>wajib</w:t>
+      </w:r>
+      <w:proofErr w:type="spellEnd"/>
+      <w:r>
+        <w:t xml:space="preserve"> </w:t>
+      </w:r>
+      <w:proofErr w:type="spellStart"/>
+      <w:r>
+        <w:t>dicatat</w:t>
+      </w:r>
+      <w:proofErr w:type="spellEnd"/>
+      <w:r>
+        <w:t xml:space="preserve"> </w:t>
+      </w:r>
+      <w:proofErr w:type="spellStart"/>
+      <w:r>
+        <w:t>penerimaan</w:t>
+      </w:r>
+      <w:proofErr w:type="spellEnd"/>
+      <w:r>
+        <w:t xml:space="preserve">, </w:t>
+      </w:r>
+      <w:proofErr w:type="spellStart"/>
+      <w:r>
+        <w:t>penggunaan</w:t>
+      </w:r>
+      <w:proofErr w:type="spellEnd"/>
+      <w:r>
+        <w:t xml:space="preserve">, </w:t>
+      </w:r>
+      <w:proofErr w:type="spellStart"/>
+      <w:r>
+        <w:t>sisa</w:t>
+      </w:r>
+      <w:proofErr w:type="spellEnd"/>
+      <w:r>
+        <w:t xml:space="preserve">, dan </w:t>
+      </w:r>
+      <w:proofErr w:type="spellStart"/>
+      <w:r>
+        <w:t>lokasinya</w:t>
+      </w:r>
+      <w:proofErr w:type="spellEnd"/>
+      <w:r>
+        <w:t xml:space="preserve"> </w:t>
+      </w:r>
+      <w:proofErr w:type="spellStart"/>
+      <w:r>
+        <w:t>serta</w:t>
+      </w:r>
+      <w:proofErr w:type="spellEnd"/>
+      <w:r>
+        <w:t xml:space="preserve"> </w:t>
+      </w:r>
+      <w:proofErr w:type="spellStart"/>
+      <w:r>
+        <w:t>didukung</w:t>
+      </w:r>
+      <w:proofErr w:type="spellEnd"/>
+      <w:r>
+        <w:t xml:space="preserve"> </w:t>
+      </w:r>
+      <w:proofErr w:type="spellStart"/>
+      <w:r>
+        <w:t>dokumen</w:t>
+      </w:r>
+      <w:proofErr w:type="spellEnd"/>
+      <w:r>
+        <w:t xml:space="preserve"> </w:t>
+      </w:r>
+      <w:proofErr w:type="spellStart"/>
+      <w:r>
+        <w:t>persediaan</w:t>
+      </w:r>
+      <w:proofErr w:type="spellEnd"/>
+      <w:r>
+        <w:t xml:space="preserve"> yang </w:t>
+      </w:r>
+      <w:proofErr w:type="spellStart"/>
+      <w:r>
+        <w:t>dapat</w:t>
+      </w:r>
+      <w:proofErr w:type="spellEnd"/>
+      <w:r>
+        <w:t xml:space="preserve"> </w:t>
+      </w:r>
+      <w:proofErr w:type="spellStart"/>
+      <w:r>
+        <w:t>ditelusuri</w:t>
+      </w:r>
+      <w:proofErr w:type="spellEnd"/>
+      <w:r>
+        <w:t>.</w:t>
+      </w:r>
+    </w:p>
+    <w:p>
+      <w:pPr>
+        <w:ind w:left="360" w:hanging="360"/>
+      </w:pPr>
+      <w:r>
+        <w:t xml:space="preserve">5. </w:t>
+      </w:r>
+      <w:proofErr w:type="spellStart"/>
+      <w:r>
+        <w:t>Pelaksanaan</w:t>
+      </w:r>
+      <w:proofErr w:type="spellEnd"/>
+      <w:r>
+        <w:t xml:space="preserve"> </w:t>
+      </w:r>
+      <w:proofErr w:type="spellStart"/>
+      <w:r>
+        <w:t>pekerjaan</w:t>
+      </w:r>
+      <w:proofErr w:type="spellEnd"/>
+      <w:r>
+        <w:t xml:space="preserve"> </w:t>
+      </w:r>
+      <w:proofErr w:type="spellStart"/>
+      <w:r>
+        <w:t>wajib</w:t>
+      </w:r>
+      <w:proofErr w:type="spellEnd"/>
+      <w:r>
+        <w:t xml:space="preserve"> </w:t>
+      </w:r>
+      <w:proofErr w:type="spellStart"/>
+      <w:r>
+        <w:t>memperhatikan</w:t>
+      </w:r>
+      <w:proofErr w:type="spellEnd"/>
+      <w:r>
+        <w:t xml:space="preserve"> </w:t>
+      </w:r>
+      <w:proofErr w:type="spellStart"/>
+      <w:r>
+        <w:t>keselamatan</w:t>
+      </w:r>
+      <w:proofErr w:type="spellEnd"/>
+      <w:r>
+        <w:t xml:space="preserve"> </w:t>
+      </w:r>
+      <w:proofErr w:type="spellStart"/>
+      <w:r>
+        <w:t>kerja</w:t>
+      </w:r>
+      <w:proofErr w:type="spellEnd"/>
+      <w:r>
+        <w:t xml:space="preserve">, </w:t>
+      </w:r>
+      <w:proofErr w:type="spellStart"/>
+      <w:r>
+        <w:t>pengamanan</w:t>
+      </w:r>
+      <w:proofErr w:type="spellEnd"/>
+      <w:r>
+        <w:t xml:space="preserve"> </w:t>
+      </w:r>
+      <w:proofErr w:type="spellStart"/>
+      <w:r>
+        <w:t>aset</w:t>
+      </w:r>
+      <w:proofErr w:type="spellEnd"/>
+      <w:r>
+        <w:t>/</w:t>
+      </w:r>
+      <w:proofErr w:type="spellStart"/>
+      <w:r>
+        <w:t>peralatan</w:t>
+      </w:r>
+      <w:proofErr w:type="spellEnd"/>
+      <w:r>
+        <w:t xml:space="preserve">, </w:t>
+      </w:r>
+      <w:proofErr w:type="spellStart"/>
+      <w:r>
+        <w:t>kebersihan</w:t>
+      </w:r>
+      <w:proofErr w:type="spellEnd"/>
+      <w:r>
+        <w:t xml:space="preserve"> </w:t>
+      </w:r>
+      <w:proofErr w:type="spellStart"/>
+      <w:r>
+        <w:t>lokasi</w:t>
+      </w:r>
+      <w:proofErr w:type="spellEnd"/>
+      <w:r>
+        <w:t xml:space="preserve">, dan </w:t>
+      </w:r>
+      <w:proofErr w:type="spellStart"/>
+      <w:r>
+        <w:t>pengendalian</w:t>
+      </w:r>
+      <w:proofErr w:type="spellEnd"/>
+      <w:r>
+        <w:t xml:space="preserve"> </w:t>
+      </w:r>
+      <w:proofErr w:type="spellStart"/>
+      <w:r>
+        <w:t>dampak</w:t>
+      </w:r>
+      <w:proofErr w:type="spellEnd"/>
+      <w:r>
+        <w:t xml:space="preserve"> </w:t>
+      </w:r>
+      <w:proofErr w:type="spellStart"/>
+      <w:r>
+        <w:t>terhadap</w:t>
+      </w:r>
+      <w:proofErr w:type="spellEnd"/>
+      <w:r>
+        <w:t xml:space="preserve"> </w:t>
+      </w:r>
+      <w:proofErr w:type="spellStart"/>
+      <w:r>
+        <w:t>masyarakat</w:t>
+      </w:r>
+      <w:proofErr w:type="spellEnd"/>
+      <w:r>
+        <w:t>/</w:t>
+      </w:r>
+      <w:proofErr w:type="spellStart"/>
+      <w:r>
+        <w:t>lingkungan</w:t>
+      </w:r>
+      <w:proofErr w:type="spellEnd"/>
+      <w:r>
+        <w:t xml:space="preserve"> </w:t>
+      </w:r>
+      <w:proofErr w:type="spellStart"/>
+      <w:r>
+        <w:t>sekitar</w:t>
+      </w:r>
+      <w:proofErr w:type="spellEnd"/>
+      <w:r>
+        <w:t>.</w:t>
+      </w:r>
+    </w:p>
+    <w:p>
+      <w:pPr>
+        <w:ind w:left="360" w:hanging="360"/>
+      </w:pPr>
+      <w:r>
+        <w:t xml:space="preserve">6. </w:t>
+      </w:r>
+      <w:proofErr w:type="spellStart"/>
+      <w:r>
+        <w:t>Setiap</w:t>
+      </w:r>
+      <w:proofErr w:type="spellEnd"/>
+      <w:r>
+        <w:t xml:space="preserve"> </w:t>
+      </w:r>
+      <w:proofErr w:type="spellStart"/>
+      <w:r>
+        <w:t>perubahan</w:t>
+      </w:r>
+      <w:proofErr w:type="spellEnd"/>
+      <w:r>
+        <w:t xml:space="preserve"> volume, </w:t>
+      </w:r>
+      <w:proofErr w:type="spellStart"/>
+      <w:r>
+        <w:t>lokasi</w:t>
+      </w:r>
+      <w:proofErr w:type="spellEnd"/>
+      <w:r>
+        <w:t xml:space="preserve">, </w:t>
+      </w:r>
+      <w:proofErr w:type="spellStart"/>
+      <w:r>
+        <w:t>metode</w:t>
+      </w:r>
+      <w:proofErr w:type="spellEnd"/>
+      <w:r>
+        <w:t xml:space="preserve">, </w:t>
+      </w:r>
+      <w:proofErr w:type="spellStart"/>
+      <w:r>
+        <w:t>atau</w:t>
+      </w:r>
+      <w:proofErr w:type="spellEnd"/>
+      <w:r>
+        <w:t xml:space="preserve"> </w:t>
+      </w:r>
+      <w:proofErr w:type="spellStart"/>
+      <w:r>
+        <w:t>kebutuhan</w:t>
+      </w:r>
+      <w:proofErr w:type="spellEnd"/>
+      <w:r>
+        <w:t xml:space="preserve"> </w:t>
+      </w:r>
+      <w:proofErr w:type="spellStart"/>
+      <w:r>
+        <w:t>sumber</w:t>
+      </w:r>
+      <w:proofErr w:type="spellEnd"/>
+      <w:r>
+        <w:t xml:space="preserve"> </w:t>
+      </w:r>
+      <w:proofErr w:type="spellStart"/>
+      <w:r>
+        <w:t>daya</w:t>
+      </w:r>
+      <w:proofErr w:type="spellEnd"/>
+      <w:r>
+        <w:t xml:space="preserve"> yang </w:t>
+      </w:r>
+      <w:proofErr w:type="spellStart"/>
+      <w:r>
+        <w:t>bersifat</w:t>
+      </w:r>
+      <w:proofErr w:type="spellEnd"/>
+      <w:r>
+        <w:t xml:space="preserve"> material </w:t>
+      </w:r>
+      <w:proofErr w:type="spellStart"/>
+      <w:r>
+        <w:t>harus</w:t>
+      </w:r>
+      <w:proofErr w:type="spellEnd"/>
+      <w:r>
+        <w:t xml:space="preserve"> </w:t>
+      </w:r>
+      <w:proofErr w:type="spellStart"/>
+      <w:r>
+        <w:t>dikoordinasikan</w:t>
+      </w:r>
+      <w:proofErr w:type="spellEnd"/>
+      <w:r>
+        <w:t xml:space="preserve"> dan </w:t>
+      </w:r>
+      <w:proofErr w:type="spellStart"/>
+      <w:r>
+        <w:t>memperoleh</w:t>
+      </w:r>
+      <w:proofErr w:type="spellEnd"/>
+      <w:r>
+        <w:t xml:space="preserve"> </w:t>
+      </w:r>
+      <w:proofErr w:type="spellStart"/>
+      <w:r>
+        <w:t>persetujuan</w:t>
+      </w:r>
+      <w:proofErr w:type="spellEnd"/>
+      <w:r>
+        <w:t xml:space="preserve"> </w:t>
+      </w:r>
+      <w:proofErr w:type="spellStart"/>
+      <w:r>
+        <w:t>pejabat</w:t>
+      </w:r>
+      <w:proofErr w:type="spellEnd"/>
+      <w:r>
+        <w:t xml:space="preserve"> yang </w:t>
+      </w:r>
+      <w:proofErr w:type="spellStart"/>
+      <w:r>
+        <w:t>berwenang</w:t>
+      </w:r>
+      <w:proofErr w:type="spellEnd"/>
+      <w:r>
+        <w:t xml:space="preserve"> </w:t>
+      </w:r>
+      <w:proofErr w:type="spellStart"/>
+      <w:r>
+        <w:t>sebelum</w:t>
+      </w:r>
+      <w:proofErr w:type="spellEnd"/>
+      <w:r>
+        <w:t xml:space="preserve"> </w:t>
+      </w:r>
+      <w:proofErr w:type="spellStart"/>
+      <w:r>
+        <w:t>dilaksanakan</w:t>
+      </w:r>
+      <w:proofErr w:type="spellEnd"/>
+      <w:r>
+        <w:t>.</w:t>
+      </w:r>
+    </w:p>
+    <w:p>
+      <w:pPr>
+        <w:tabs>
+          <w:tab w:val="left" w:pos="2160"/>
+        </w:tabs>
+      </w:pPr>
+      <w:r>
+        <w:rPr>
+          <w:b/>
+        </w:rPr>
+        <w:lastRenderedPageBreak/>
+        <w:t xml:space="preserve">III. </w:t>
+      </w:r>
+      <w:proofErr w:type="spellStart"/>
+      <w:r>
+        <w:rPr>
+          <w:b/>
+        </w:rPr>
+        <w:t>Pelaporan</w:t>
+      </w:r>
+      <w:proofErr w:type="spellEnd"/>
+      <w:r>
+        <w:rPr>
+          <w:b/>
+        </w:rPr>
+        <w:t xml:space="preserve"> dan </w:t>
+      </w:r>
+      <w:proofErr w:type="spellStart"/>
+      <w:r>
+        <w:rPr>
+          <w:b/>
+        </w:rPr>
+        <w:t>Pengawasan</w:t>
+      </w:r>
+      <w:proofErr w:type="spellEnd"/>
+    </w:p>
+    <w:p>
+      <w:pPr>
+        <w:tabs>
+          <w:tab w:val="left" w:pos="2160"/>
+        </w:tabs>
+      </w:pPr>
+      <w:r>
+        <w:t xml:space="preserve">1. Tim Pelaksana </w:t>
+      </w:r>
+      <w:proofErr w:type="spellStart"/>
+      <w:r>
+        <w:t>mencatat</w:t>
+      </w:r>
+      <w:proofErr w:type="spellEnd"/>
+      <w:r>
+        <w:t xml:space="preserve"> dan </w:t>
+      </w:r>
+      <w:proofErr w:type="spellStart"/>
+      <w:r>
+        <w:t>melaporkan</w:t>
+      </w:r>
+      <w:proofErr w:type="spellEnd"/>
+      <w:r>
+        <w:t xml:space="preserve"> </w:t>
+      </w:r>
+      <w:proofErr w:type="spellStart"/>
+      <w:r>
+        <w:t>kemajuan</w:t>
+      </w:r>
+      <w:proofErr w:type="spellEnd"/>
+      <w:r>
+        <w:t xml:space="preserve"> </w:t>
+      </w:r>
+      <w:proofErr w:type="spellStart"/>
+      <w:r>
+        <w:t>fisik</w:t>
+      </w:r>
+      <w:proofErr w:type="spellEnd"/>
+      <w:r>
+        <w:t xml:space="preserve">, </w:t>
+      </w:r>
+      <w:proofErr w:type="spellStart"/>
+      <w:r>
+        <w:t>penggunaan</w:t>
+      </w:r>
+      <w:proofErr w:type="spellEnd"/>
+      <w:r>
+        <w:t xml:space="preserve"> </w:t>
+      </w:r>
+      <w:proofErr w:type="spellStart"/>
+      <w:r>
+        <w:t>tenaga</w:t>
+      </w:r>
+      <w:proofErr w:type="spellEnd"/>
+      <w:r>
+        <w:t xml:space="preserve"> </w:t>
+      </w:r>
+      <w:proofErr w:type="spellStart"/>
+      <w:r>
+        <w:t>kerja</w:t>
+      </w:r>
+      <w:proofErr w:type="spellEnd"/>
+      <w:r>
+        <w:t xml:space="preserve">, </w:t>
+      </w:r>
+      <w:proofErr w:type="spellStart"/>
+      <w:r>
+        <w:t>bahan</w:t>
+      </w:r>
+      <w:proofErr w:type="spellEnd"/>
+      <w:r>
+        <w:t xml:space="preserve">/material, </w:t>
+      </w:r>
+      <w:proofErr w:type="spellStart"/>
+      <w:r>
+        <w:t>peralatan</w:t>
+      </w:r>
+      <w:proofErr w:type="spellEnd"/>
+      <w:r>
+        <w:t xml:space="preserve">, </w:t>
+      </w:r>
+      <w:proofErr w:type="spellStart"/>
+      <w:r>
+        <w:t>kendala</w:t>
+      </w:r>
+      <w:proofErr w:type="spellEnd"/>
+      <w:r>
+        <w:t xml:space="preserve">, </w:t>
+      </w:r>
+      <w:proofErr w:type="spellStart"/>
+      <w:r>
+        <w:t>tindakan</w:t>
+      </w:r>
+      <w:proofErr w:type="spellEnd"/>
+      <w:r>
+        <w:t xml:space="preserve"> </w:t>
+      </w:r>
+      <w:proofErr w:type="spellStart"/>
+      <w:r>
+        <w:t>korektif</w:t>
+      </w:r>
+      <w:proofErr w:type="spellEnd"/>
+      <w:r>
+        <w:t>.</w:t>
+      </w:r>
+    </w:p>
+    <w:p>
+      <w:pPr>
+        <w:tabs>
+          <w:tab w:val="left" w:pos="2160"/>
+        </w:tabs>
+      </w:pPr>
+      <w:r>
+        <w:t xml:space="preserve">2. </w:t>
+      </w:r>
+      <w:proofErr w:type="spellStart"/>
+      <w:r>
+        <w:t>Laporan</w:t>
+      </w:r>
+      <w:proofErr w:type="spellEnd"/>
+      <w:r>
+        <w:t xml:space="preserve"> </w:t>
+      </w:r>
+      <w:proofErr w:type="spellStart"/>
+      <w:r>
+        <w:t>pelaksanaan</w:t>
+      </w:r>
+      <w:proofErr w:type="spellEnd"/>
+      <w:r>
+        <w:t xml:space="preserve"> </w:t>
+      </w:r>
+      <w:proofErr w:type="spellStart"/>
+      <w:r>
+        <w:t>dilengkapi</w:t>
+      </w:r>
+      <w:proofErr w:type="spellEnd"/>
+      <w:r>
+        <w:t xml:space="preserve"> </w:t>
+      </w:r>
+      <w:proofErr w:type="spellStart"/>
+      <w:r>
+        <w:t>dokumentasi</w:t>
+      </w:r>
+      <w:proofErr w:type="spellEnd"/>
+      <w:r>
+        <w:t xml:space="preserve"> </w:t>
+      </w:r>
+      <w:proofErr w:type="spellStart"/>
+      <w:r>
+        <w:t>foto</w:t>
+      </w:r>
+      <w:proofErr w:type="spellEnd"/>
+      <w:r>
+        <w:t xml:space="preserve"> </w:t>
+      </w:r>
+      <w:proofErr w:type="spellStart"/>
+      <w:r>
+        <w:t>sebelum</w:t>
+      </w:r>
+      <w:proofErr w:type="spellEnd"/>
+      <w:r>
+        <w:t xml:space="preserve">, </w:t>
+      </w:r>
+      <w:proofErr w:type="spellStart"/>
+      <w:r>
+        <w:t>selama</w:t>
+      </w:r>
+      <w:proofErr w:type="spellEnd"/>
+      <w:r>
+        <w:t xml:space="preserve">, dan </w:t>
+      </w:r>
+      <w:proofErr w:type="spellStart"/>
+      <w:r>
+        <w:t>sesudah</w:t>
+      </w:r>
+      <w:proofErr w:type="spellEnd"/>
+      <w:r>
+        <w:t xml:space="preserve"> </w:t>
+      </w:r>
+      <w:proofErr w:type="spellStart"/>
+      <w:r>
+        <w:t>pekerjaan</w:t>
+      </w:r>
+      <w:proofErr w:type="spellEnd"/>
+      <w:r>
+        <w:t xml:space="preserve">, </w:t>
+      </w:r>
+      <w:proofErr w:type="spellStart"/>
+      <w:r>
+        <w:t>rekap</w:t>
+      </w:r>
+      <w:proofErr w:type="spellEnd"/>
+      <w:r>
+        <w:t xml:space="preserve"> </w:t>
+      </w:r>
+      <w:proofErr w:type="spellStart"/>
+      <w:r>
+        <w:t>penggunaan</w:t>
+      </w:r>
+      <w:proofErr w:type="spellEnd"/>
+      <w:r>
+        <w:t xml:space="preserve"> </w:t>
+      </w:r>
+      <w:proofErr w:type="spellStart"/>
+      <w:r>
+        <w:t>bahan</w:t>
+      </w:r>
+      <w:proofErr w:type="spellEnd"/>
+      <w:r>
+        <w:t xml:space="preserve">/material, </w:t>
+      </w:r>
+      <w:proofErr w:type="spellStart"/>
+      <w:r>
+        <w:t>serta</w:t>
+      </w:r>
+      <w:proofErr w:type="spellEnd"/>
+      <w:r>
+        <w:t xml:space="preserve"> </w:t>
+      </w:r>
+      <w:proofErr w:type="spellStart"/>
+      <w:r>
+        <w:t>dokumen</w:t>
+      </w:r>
+      <w:proofErr w:type="spellEnd"/>
+      <w:r>
+        <w:t xml:space="preserve"> </w:t>
+      </w:r>
+      <w:proofErr w:type="spellStart"/>
+      <w:r>
+        <w:t>pendukung</w:t>
+      </w:r>
+      <w:proofErr w:type="spellEnd"/>
+      <w:r>
+        <w:t xml:space="preserve"> </w:t>
+      </w:r>
+      <w:proofErr w:type="spellStart"/>
+      <w:r>
+        <w:t>lainnya</w:t>
+      </w:r>
+      <w:proofErr w:type="spellEnd"/>
+      <w:r>
+        <w:t>.</w:t>
+      </w:r>
+    </w:p>
+    <w:p>
+      <w:pPr>
+        <w:tabs>
+          <w:tab w:val="left" w:pos="2160"/>
+        </w:tabs>
+      </w:pPr>
+      <w:r>
+        <w:t xml:space="preserve">3. Tim </w:t>
+      </w:r>
+      <w:proofErr w:type="spellStart"/>
+      <w:r>
+        <w:t>Pengawas</w:t>
+      </w:r>
+      <w:proofErr w:type="spellEnd"/>
+      <w:r>
+        <w:t xml:space="preserve"> </w:t>
+      </w:r>
+      <w:proofErr w:type="spellStart"/>
+      <w:r>
+        <w:t>melakukan</w:t>
+      </w:r>
+      <w:proofErr w:type="spellEnd"/>
+      <w:r>
+        <w:t xml:space="preserve"> </w:t>
+      </w:r>
+      <w:proofErr w:type="spellStart"/>
+      <w:r>
+        <w:t>pengawasan</w:t>
+      </w:r>
+      <w:proofErr w:type="spellEnd"/>
+      <w:r>
+        <w:t xml:space="preserve"> </w:t>
+      </w:r>
+      <w:proofErr w:type="spellStart"/>
+      <w:r>
+        <w:t>administrasi</w:t>
+      </w:r>
+      <w:proofErr w:type="spellEnd"/>
+      <w:r>
+        <w:t xml:space="preserve">, </w:t>
+      </w:r>
+      <w:proofErr w:type="spellStart"/>
+      <w:r>
+        <w:t>teknis</w:t>
+      </w:r>
+      <w:proofErr w:type="spellEnd"/>
+      <w:r>
+        <w:t xml:space="preserve">, </w:t>
+      </w:r>
+      <w:proofErr w:type="spellStart"/>
+      <w:r>
+        <w:t>serta</w:t>
+      </w:r>
+      <w:proofErr w:type="spellEnd"/>
+      <w:r>
+        <w:t xml:space="preserve"> </w:t>
+      </w:r>
+      <w:proofErr w:type="spellStart"/>
+      <w:r>
+        <w:t>menyusun</w:t>
+      </w:r>
+      <w:proofErr w:type="spellEnd"/>
+      <w:r>
+        <w:t xml:space="preserve"> Berita Acara Hasil </w:t>
+      </w:r>
+      <w:proofErr w:type="spellStart"/>
+      <w:r>
+        <w:t>Pemeriksaan</w:t>
+      </w:r>
+      <w:proofErr w:type="spellEnd"/>
+      <w:r>
+        <w:t>.</w:t>
+      </w:r>
+    </w:p>
+    <w:p>
+      <w:pPr>
+        <w:tabs>
+          <w:tab w:val="left" w:pos="2160"/>
+        </w:tabs>
+      </w:pPr>
+      <w:r>
+        <w:t xml:space="preserve">4. </w:t>
+      </w:r>
+      <w:proofErr w:type="spellStart"/>
+      <w:r>
+        <w:t>Setelah</w:t>
+      </w:r>
+      <w:proofErr w:type="spellEnd"/>
+      <w:r>
+        <w:t xml:space="preserve"> </w:t>
+      </w:r>
+      <w:proofErr w:type="spellStart"/>
+      <w:r>
+        <w:t>hasil</w:t>
+      </w:r>
+      <w:proofErr w:type="spellEnd"/>
+      <w:r>
+        <w:t xml:space="preserve"> </w:t>
+      </w:r>
+      <w:proofErr w:type="spellStart"/>
+      <w:r>
+        <w:t>pekerjaan</w:t>
+      </w:r>
+      <w:proofErr w:type="spellEnd"/>
+      <w:r>
+        <w:t xml:space="preserve"> </w:t>
+      </w:r>
+      <w:proofErr w:type="spellStart"/>
+      <w:r>
+        <w:t>dinyatakan</w:t>
+      </w:r>
+      <w:proofErr w:type="spellEnd"/>
+      <w:r>
+        <w:t xml:space="preserve"> </w:t>
+      </w:r>
+      <w:proofErr w:type="spellStart"/>
+      <w:r>
+        <w:t>sesuai</w:t>
+      </w:r>
+      <w:proofErr w:type="spellEnd"/>
+      <w:r>
+        <w:t xml:space="preserve"> </w:t>
+      </w:r>
+      <w:proofErr w:type="spellStart"/>
+      <w:r>
+        <w:t>berdasarkan</w:t>
+      </w:r>
+      <w:proofErr w:type="spellEnd"/>
+      <w:r>
+        <w:t xml:space="preserve"> </w:t>
+      </w:r>
+      <w:proofErr w:type="spellStart"/>
+      <w:r>
+        <w:t>pemeriksaan</w:t>
+      </w:r>
+      <w:proofErr w:type="spellEnd"/>
+      <w:r>
+        <w:t xml:space="preserve"> Tim Pengawas, Tim Pelaksana </w:t>
+      </w:r>
+      <w:proofErr w:type="spellStart"/>
+      <w:r>
+        <w:t>menyerahkan</w:t>
+      </w:r>
+      <w:proofErr w:type="spellEnd"/>
+      <w:r>
+        <w:t xml:space="preserve"> </w:t>
+      </w:r>
+      <w:proofErr w:type="spellStart"/>
+      <w:r>
+        <w:t>hasil</w:t>
+      </w:r>
+      <w:proofErr w:type="spellEnd"/>
+      <w:r>
+        <w:t xml:space="preserve"> </w:t>
+      </w:r>
+      <w:proofErr w:type="spellStart"/>
+      <w:r>
+        <w:t>pekerjaan</w:t>
+      </w:r>
+      <w:proofErr w:type="spellEnd"/>
+      <w:r>
+        <w:t xml:space="preserve"> dan </w:t>
+      </w:r>
+      <w:proofErr w:type="spellStart"/>
+      <w:r>
+        <w:t>laporan</w:t>
+      </w:r>
+      <w:proofErr w:type="spellEnd"/>
+      <w:r>
+        <w:t xml:space="preserve"> </w:t>
+      </w:r>
+      <w:proofErr w:type="spellStart"/>
+      <w:r>
+        <w:t>pelaksanaan</w:t>
+      </w:r>
+      <w:proofErr w:type="spellEnd"/>
+      <w:r>
+        <w:t xml:space="preserve"> </w:t>
+      </w:r>
+      <w:proofErr w:type="spellStart"/>
+      <w:r>
+        <w:t>kepada</w:t>
+      </w:r>
+      <w:proofErr w:type="spellEnd"/>
+      <w:r>
+        <w:t xml:space="preserve"> PPK </w:t>
+      </w:r>
+      <w:proofErr w:type="spellStart"/>
+      <w:r>
+        <w:t>melalui</w:t>
+      </w:r>
+      <w:proofErr w:type="spellEnd"/>
+      <w:r>
+        <w:t xml:space="preserve"> Berita Acara Serah </w:t>
+      </w:r>
+      <w:proofErr w:type="spellStart"/>
+      <w:r>
+        <w:t>Terima</w:t>
+      </w:r>
+      <w:proofErr w:type="spellEnd"/>
+      <w:r>
+        <w:t xml:space="preserve"> Hasil </w:t>
+      </w:r>
+      <w:proofErr w:type="spellStart"/>
+      <w:r>
+        <w:t>Pekerjaan</w:t>
+      </w:r>
+      <w:proofErr w:type="spellEnd"/>
+      <w:r>
+        <w:t>.</w:t>
+      </w:r>
+    </w:p>
+    <w:p>
+      <w:pPr>
+        <w:tabs>
+          <w:tab w:val="left" w:pos="2160"/>
+        </w:tabs>
+      </w:pPr>
+      <w:r>
+        <w:rPr>
+          <w:b/>
+        </w:rPr>
+        <w:t xml:space="preserve">IV. </w:t>
+      </w:r>
+      <w:proofErr w:type="spellStart"/>
+      <w:r>
+        <w:rPr>
+          <w:b/>
+        </w:rPr>
+        <w:t>Jangka</w:t>
+      </w:r>
+      <w:proofErr w:type="spellEnd"/>
+      <w:r>
+        <w:rPr>
+          <w:b/>
+        </w:rPr>
+        <w:t xml:space="preserve"> Waktu</w:t>
+      </w:r>
+    </w:p>
+    <w:p>
+      <w:pPr>
+        <w:tabs>
+          <w:tab w:val="left" w:pos="2160"/>
+        </w:tabs>
+      </w:pPr>
+      <w:proofErr w:type="spellStart"/>
+      <w:r>
+        <w:t>Pekerjaan</w:t>
+      </w:r>
+      <w:proofErr w:type="spellEnd"/>
+      <w:r>
+        <w:t xml:space="preserve"> </w:t>
+      </w:r>
+      <w:proofErr w:type="spellStart"/>
+      <w:r>
+        <w:t>dilaksanakan</w:t>
+      </w:r>
+      <w:proofErr w:type="spellEnd"/>
+      <w:r>
+        <w:t xml:space="preserve"> </w:t>
+      </w:r>
+      <w:proofErr w:type="spellStart"/>
+      <w:r>
+        <w:t>sejak</w:t>
+      </w:r>
+      <w:proofErr w:type="spellEnd"/>
+      <w:r>
+        <w:t xml:space="preserve"> </w:t>
+      </w:r>
+      <w:proofErr w:type="spellStart"/>
+      <w:r>
+        <w:t>tanggal</w:t>
+      </w:r>
+      <w:proofErr w:type="spellEnd"/>
+      <w:r>
+        <w:t xml:space="preserve"> [TANGGAL MULAI] </w:t>
+      </w:r>
+      <w:proofErr w:type="spellStart"/>
+      <w:r>
+        <w:t>sampai</w:t>
+      </w:r>
+      <w:proofErr w:type="spellEnd"/>
+      <w:r>
+        <w:t xml:space="preserve"> </w:t>
+      </w:r>
+      <w:proofErr w:type="spellStart"/>
+      <w:r>
+        <w:t>dengan</w:t>
+      </w:r>
+      <w:proofErr w:type="spellEnd"/>
+      <w:r>
+        <w:t xml:space="preserve"> [TANGGAL SELESAI] dan </w:t>
+      </w:r>
+      <w:proofErr w:type="spellStart"/>
+      <w:r>
+        <w:t>tidak</w:t>
+      </w:r>
+      <w:proofErr w:type="spellEnd"/>
+      <w:r>
+        <w:t xml:space="preserve"> </w:t>
+      </w:r>
+      <w:proofErr w:type="spellStart"/>
+      <w:r>
+        <w:t>melampaui</w:t>
+      </w:r>
+      <w:proofErr w:type="spellEnd"/>
+      <w:r>
+        <w:t xml:space="preserve"> </w:t>
+      </w:r>
+      <w:proofErr w:type="spellStart"/>
+      <w:r>
+        <w:t>Tahun</w:t>
+      </w:r>
+      <w:proofErr w:type="spellEnd"/>
+      <w:r>
+        <w:t xml:space="preserve"> </w:t>
+      </w:r>
+      <w:proofErr w:type="spellStart"/>
+      <w:r>
+        <w:t>Anggaran</w:t>
+      </w:r>
+      <w:proofErr w:type="spellEnd"/>
+      <w:r>
+        <w:t xml:space="preserve"> 2026, </w:t>
+      </w:r>
+      <w:proofErr w:type="spellStart"/>
+      <w:r>
+        <w:t>sesuai</w:t>
+      </w:r>
+      <w:proofErr w:type="spellEnd"/>
+      <w:r>
+        <w:t xml:space="preserve"> </w:t>
+      </w:r>
+      <w:proofErr w:type="spellStart"/>
+      <w:r>
+        <w:t>jadwal</w:t>
+      </w:r>
+      <w:proofErr w:type="spellEnd"/>
+      <w:r>
+        <w:t xml:space="preserve"> </w:t>
+      </w:r>
+      <w:proofErr w:type="spellStart"/>
+      <w:r>
+        <w:t>pelaksanaan</w:t>
+      </w:r>
+      <w:proofErr w:type="spellEnd"/>
+      <w:r>
+        <w:t xml:space="preserve"> yang </w:t>
+      </w:r>
+      <w:proofErr w:type="spellStart"/>
+      <w:r>
+        <w:t>ditetapkan</w:t>
+      </w:r>
+      <w:proofErr w:type="spellEnd"/>
+      <w:r>
+        <w:t>.</w:t>
+      </w:r>
+    </w:p>
+    <w:p>
+      <w:pPr>
+        <w:tabs>
+          <w:tab w:val="left" w:pos="2160"/>
+        </w:tabs>
+      </w:pPr>
+      <w:r>
+        <w:t xml:space="preserve">Surat </w:t>
+      </w:r>
+      <w:proofErr w:type="spellStart"/>
+      <w:r>
+        <w:t>Perintah</w:t>
+      </w:r>
+      <w:proofErr w:type="spellEnd"/>
+      <w:r>
+        <w:t xml:space="preserve"> </w:t>
+      </w:r>
+      <w:proofErr w:type="spellStart"/>
+      <w:r>
+        <w:t>Tugas</w:t>
+      </w:r>
+      <w:proofErr w:type="spellEnd"/>
+      <w:r>
+        <w:t xml:space="preserve"> </w:t>
+      </w:r>
+      <w:proofErr w:type="spellStart"/>
+      <w:r>
+        <w:t>ini</w:t>
+      </w:r>
+      <w:proofErr w:type="spellEnd"/>
+      <w:r>
+        <w:t xml:space="preserve"> agar </w:t>
+      </w:r>
+      <w:proofErr w:type="spellStart"/>
+      <w:r>
+        <w:t>dilaksanakan</w:t>
+      </w:r>
+      <w:proofErr w:type="spellEnd"/>
+      <w:r>
+        <w:t xml:space="preserve"> </w:t>
+      </w:r>
+      <w:proofErr w:type="spellStart"/>
+      <w:r>
+        <w:t>dengan</w:t>
+      </w:r>
+      <w:proofErr w:type="spellEnd"/>
+      <w:r>
+        <w:t xml:space="preserve"> </w:t>
+      </w:r>
+      <w:proofErr w:type="spellStart"/>
+      <w:r>
+        <w:t>sebaik-baiknya</w:t>
+      </w:r>
+      <w:proofErr w:type="spellEnd"/>
+      <w:r>
+        <w:t xml:space="preserve">, </w:t>
+      </w:r>
+      <w:proofErr w:type="spellStart"/>
+      <w:r>
+        <w:t>penuh</w:t>
+      </w:r>
+      <w:proofErr w:type="spellEnd"/>
+      <w:r>
+        <w:t xml:space="preserve"> </w:t>
+      </w:r>
+      <w:proofErr w:type="spellStart"/>
+      <w:r>
+        <w:t>tanggung</w:t>
+      </w:r>
+      <w:proofErr w:type="spellEnd"/>
+      <w:r>
+        <w:t xml:space="preserve"> </w:t>
+      </w:r>
+      <w:proofErr w:type="spellStart"/>
+      <w:r>
+        <w:t>jawab</w:t>
+      </w:r>
+      <w:proofErr w:type="spellEnd"/>
+      <w:r>
+        <w:t xml:space="preserve">, </w:t>
+      </w:r>
+      <w:proofErr w:type="spellStart"/>
+      <w:r>
+        <w:t>tertib</w:t>
+      </w:r>
+      <w:proofErr w:type="spellEnd"/>
+      <w:r>
+        <w:t xml:space="preserve"> </w:t>
+      </w:r>
+      <w:proofErr w:type="spellStart"/>
+      <w:r>
+        <w:t>administrasi</w:t>
+      </w:r>
+      <w:proofErr w:type="spellEnd"/>
+      <w:r>
+        <w:t xml:space="preserve">, dan </w:t>
+      </w:r>
+      <w:proofErr w:type="spellStart"/>
+      <w:r>
+        <w:t>sesuai</w:t>
+      </w:r>
+      <w:proofErr w:type="spellEnd"/>
+      <w:r>
+        <w:t xml:space="preserve"> </w:t>
+      </w:r>
+      <w:proofErr w:type="spellStart"/>
+      <w:r>
+        <w:t>ketentuan</w:t>
+      </w:r>
+      <w:proofErr w:type="spellEnd"/>
+      <w:r>
+        <w:t xml:space="preserve"> </w:t>
+      </w:r>
+      <w:proofErr w:type="spellStart"/>
+      <w:r>
+        <w:t>peraturan</w:t>
+      </w:r>
+      <w:proofErr w:type="spellEnd"/>
+      <w:r>
+        <w:t xml:space="preserve"> </w:t>
+      </w:r>
+      <w:proofErr w:type="spellStart"/>
+      <w:r>
+        <w:t>perundang-undangan</w:t>
+      </w:r>
+      <w:proofErr w:type="spellEnd"/>
+      <w:r>
+        <w:t>.</w:t>
+      </w:r>
+    </w:p>
+    <w:tbl>
+      <w:tblPr>
+        <w:tblW w:w="8640" w:type="dxa"/>
+        <w:tblLayout w:type="fixed"/>
+        <w:tblBorders>
+          <w:top w:val="none" w:sz="0" w:space="0" w:color="auto"/>
+          <w:left w:val="none" w:sz="0" w:space="0" w:color="auto"/>
+          <w:bottom w:val="none" w:sz="0" w:space="0" w:color="auto"/>
+          <w:right w:val="none" w:sz="0" w:space="0" w:color="auto"/>
+          <w:insideH w:val="none" w:sz="0" w:space="0" w:color="auto"/>
+          <w:insideV w:val="none" w:sz="0" w:space="0" w:color="auto"/>
+        </w:tblBorders>
+        <w:tblLook w:val="04A0" w:firstRow="0" w:lastRow="0" w:firstColumn="0" w:lastColumn="0" w:noHBand="0" w:noVBand="0"/>
+      </w:tblPr>
+      <w:tblGrid>
+        <w:gridCol w:w="4320"/>
+        <w:gridCol w:w="4320"/>
+      </w:tblGrid>
+      <w:tr>
+        <w:tc>
+          <w:tcPr>
+            <w:tcW w:w="4320" w:type="dxa"/>
+            <w:vAlign w:val="top"/>
+          </w:tcPr>
+          <w:p>
+            <w:pPr>
+              <w:jc w:val="center"/>
+            </w:pPr>
+            <w:r>
+              <w:br/>
+              <w:br/>
+            </w:r>
+          </w:p>
+          <w:p>
+            <w:pPr>
+              <w:jc w:val="center"/>
+            </w:pPr>
+            <w:r>
+              <w:t>PENERIMA PERINTAH</w:t>
+            </w:r>
+            <w:r>
+              <w:br/>
+            </w:r>
+            <w:r>
+              <w:t>Ketua/Koordinator Tim Pelaksana</w:t>
+            </w:r>
+          </w:p>
+          <w:p>
+            <w:pPr>
+              <w:jc w:val="center"/>
+            </w:pPr>
+            <w:r>
+              <w:br/>
+              <w:br/>
+              <w:br/>
+              <w:br/>
+            </w:r>
+            <w:r>
+              <w:rPr>
+                <w:b/>
+                <w:u w:val="single"/>
+              </w:rPr>
+              <w:t>[NAMA]</w:t>
+            </w:r>
+            <w:r>
+              <w:br/>
+            </w:r>
+            <w:r>
+              <w:t>NIP [NIP]</w:t>
+            </w:r>
+          </w:p>
+        </w:tc>
+        <w:tc>
+          <w:tcPr>
+            <w:tcW w:w="4320" w:type="dxa"/>
+            <w:vAlign w:val="top"/>
+          </w:tcPr>
+          <w:p>
+            <w:pPr>
+              <w:jc w:val="center"/>
+            </w:pPr>
+            <w:r>
+              <w:t>Dikeluarkan di Jakarta</w:t>
+            </w:r>
+            <w:r>
+              <w:br/>
+            </w:r>
+            <w:r>
+              <w:t xml:space="preserve">pada tanggal </w:t>
+            </w:r>
+            <w:r>
+              <w:t>[TANGGAL]</w:t>
+            </w:r>
+          </w:p>
+          <w:p>
+            <w:pPr>
+              <w:jc w:val="center"/>
+            </w:pPr>
+            <w:r>
+              <w:t>PEMBERI PERINTAH</w:t>
+            </w:r>
+            <w:r>
+              <w:br/>
+            </w:r>
+            <w:r>
+              <w:t>Kepala Suku Dinas Sumber Daya Air</w:t>
+            </w:r>
+            <w:r>
+              <w:br/>
+            </w:r>
+            <w:r>
+              <w:t>Kota Administrasi Jakarta Utara</w:t>
+            </w:r>
+            <w:r>
+              <w:br/>
+            </w:r>
+            <w:r>
+              <w:t>selaku KPA</w:t>
+            </w:r>
+          </w:p>
+          <w:p>
+            <w:pPr>
+              <w:jc w:val="center"/>
+            </w:pPr>
+            <w:r>
+              <w:br/>
+              <w:br/>
+              <w:br/>
+              <w:br/>
+            </w:r>
+            <w:r>
+              <w:rPr>
+                <w:b/>
+                <w:u w:val="single"/>
+              </w:rPr>
+              <w:t>Heria Suwandi</w:t>
+            </w:r>
+            <w:r>
+              <w:br/>
+            </w:r>
+            <w:r>
+              <w:t>NIP 197101272006041009</w:t>
+            </w:r>
+          </w:p>
+        </w:tc>
+      </w:tr>
+    </w:tbl>
+    <w:p>
+      <w:pPr>
+        <w:tabs>
+          <w:tab w:val="left" w:pos="2160"/>
+        </w:tabs>
+      </w:pPr>
+    </w:p>
+    <w:p>
+      <w:pPr>
+        <w:tabs>
+          <w:tab w:val="left" w:pos="2160"/>
+        </w:tabs>
+      </w:pPr>
+    </w:p>
+    <w:sectPr>
+      <w:pgSz w:w="12240" w:h="15840"/>
+      <w:pgMar w:top="1440" w:right="1800" w:bottom="1440" w:left="1800" w:header="720" w:footer="720" w:gutter="0"/>
+      <w:cols w:space="720"/>
+      <w:docGrid w:linePitch="360"/>
+    </w:sectPr>
+  </w:body>
+</w:document>
 </file>
 
 <file path=word/numbering.xml><?xml version="1.0" encoding="utf-8"?>

</xml_diff>